<commit_message>
Stats table work pt 1 yay
</commit_message>
<xml_diff>
--- a/Manuscript/Manuscript v.2/Manuscript Draft v.2.2 JSR.docx
+++ b/Manuscript/Manuscript v.2/Manuscript Draft v.2.2 JSR.docx
@@ -29,6 +29,7 @@
           <w:szCs w:val="28"/>
         </w:rPr>
       </w:pPr>
+      <w:commentRangeStart w:id="0"/>
       <w:r>
         <w:rPr>
           <w:rFonts w:ascii="Arial" w:hAnsi="Arial" w:cs="Arial"/>
@@ -36,6 +37,16 @@
           <w:szCs w:val="28"/>
         </w:rPr>
         <w:t>Remodeling of the Preoptic Area Drives Distinct Phases of Protandrous Sex Change</w:t>
+      </w:r>
+      <w:commentRangeEnd w:id="0"/>
+      <w:r>
+        <w:rPr>
+          <w:rStyle w:val="CommentReference"/>
+          <w:rFonts w:ascii="Arial" w:hAnsi="Arial" w:cs="Arial"/>
+          <w:sz w:val="28"/>
+          <w:szCs w:val="28"/>
+        </w:rPr>
+        <w:commentReference w:id="0"/>
       </w:r>
     </w:p>
     <w:p>
@@ -1055,7 +1066,7 @@
           <w:szCs w:val="20"/>
         </w:rPr>
       </w:pPr>
-      <w:commentRangeStart w:id="0"/>
+      <w:commentRangeStart w:id="1"/>
       <w:r>
         <w:rPr>
           <w:rFonts w:ascii="Arial" w:hAnsi="Arial" w:cs="Arial"/>
@@ -1066,7 +1077,7 @@
         </w:rPr>
         <w:t>Introduction</w:t>
       </w:r>
-      <w:commentRangeEnd w:id="0"/>
+      <w:commentRangeEnd w:id="1"/>
       <w:r>
         <w:rPr>
           <w:rStyle w:val="CommentReference"/>
@@ -1076,7 +1087,7 @@
           <w:sz w:val="20"/>
           <w:szCs w:val="20"/>
         </w:rPr>
-        <w:commentReference w:id="0"/>
+        <w:commentReference w:id="1"/>
       </w:r>
     </w:p>
     <w:p>
@@ -1285,7 +1296,7 @@
         </w:rPr>
         <w:fldChar w:fldCharType="end"/>
       </w:r>
-      <w:ins w:id="1" w:author="Rhodes, Justin S" w:date="2026-09-03T08:34:00Z" w16du:dateUtc="2026-09-03T13:34:00Z">
+      <w:ins w:id="2" w:author="Rhodes, Justin S" w:date="2026-09-03T08:34:00Z" w16du:dateUtc="2026-09-03T13:34:00Z">
         <w:r>
           <w:rPr>
             <w:rFonts w:ascii="Arial" w:hAnsi="Arial" w:cs="Arial"/>
@@ -2642,7 +2653,7 @@
     <w:p>
       <w:pPr>
         <w:rPr>
-          <w:rPrChange w:id="2" w:author="Rhodes, Justin S" w:date="2026-09-11T09:08:00Z" w16du:dateUtc="2026-09-11T14:08:00Z">
+          <w:rPrChange w:id="3" w:author="Rhodes, Justin S" w:date="2026-09-11T09:08:00Z" w16du:dateUtc="2026-09-11T14:08:00Z">
             <w:rPr>
               <w:rFonts w:ascii="Arial" w:hAnsi="Arial" w:cs="Arial"/>
               <w:sz w:val="20"/>
@@ -2650,13 +2661,13 @@
             </w:rPr>
           </w:rPrChange>
         </w:rPr>
-        <w:pPrChange w:id="3" w:author="Rhodes, Justin S" w:date="2026-09-11T09:08:00Z" w16du:dateUtc="2026-09-11T14:08:00Z">
+        <w:pPrChange w:id="4" w:author="Rhodes, Justin S" w:date="2026-09-11T09:08:00Z" w16du:dateUtc="2026-09-11T14:08:00Z">
           <w:pPr>
             <w:ind w:firstLine="720"/>
           </w:pPr>
         </w:pPrChange>
       </w:pPr>
-      <w:ins w:id="4" w:author="Rhodes, Justin S" w:date="2026-09-11T09:07:00Z" w16du:dateUtc="2026-09-11T14:07:00Z">
+      <w:ins w:id="5" w:author="Rhodes, Justin S" w:date="2026-09-11T09:07:00Z" w16du:dateUtc="2026-09-11T14:07:00Z">
         <w:r>
           <w:rPr>
             <w:rFonts w:ascii="Arial" w:hAnsi="Arial" w:cs="Arial"/>
@@ -2683,7 +2694,7 @@
           <w:t xml:space="preserve">increased their length by xx% and xx% respectively whereas their partners barely changed (xx% and xx%, respectively).  This difference was significant </w:t>
         </w:r>
       </w:ins>
-      <w:ins w:id="5" w:author="Rhodes, Justin S" w:date="2026-09-11T09:08:00Z" w16du:dateUtc="2026-09-11T14:08:00Z">
+      <w:ins w:id="6" w:author="Rhodes, Justin S" w:date="2026-09-11T09:08:00Z" w16du:dateUtc="2026-09-11T14:08:00Z">
         <w:r>
           <w:rPr>
             <w:rFonts w:ascii="Arial" w:hAnsi="Arial" w:cs="Arial"/>
@@ -2692,14 +2703,14 @@
           </w:rPr>
           <w:t xml:space="preserve">as indicated by significant </w:t>
         </w:r>
-        <w:commentRangeStart w:id="6"/>
+        <w:commentRangeStart w:id="7"/>
         <w:r>
           <w:rPr>
             <w:rFonts w:ascii="Arial" w:hAnsi="Arial" w:cs="Arial"/>
             <w:sz w:val="20"/>
             <w:szCs w:val="20"/>
             <w:highlight w:val="yellow"/>
-            <w:rPrChange w:id="7" w:author="Rhodes, Justin S" w:date="2026-09-11T09:08:00Z" w16du:dateUtc="2026-09-11T14:08:00Z">
+            <w:rPrChange w:id="8" w:author="Rhodes, Justin S" w:date="2026-09-11T09:08:00Z" w16du:dateUtc="2026-09-11T14:08:00Z">
               <w:rPr>
                 <w:rFonts w:ascii="Arial" w:hAnsi="Arial" w:cs="Arial"/>
                 <w:sz w:val="20"/>
@@ -2710,7 +2721,7 @@
           <w:t>interaction</w:t>
         </w:r>
       </w:ins>
-      <w:ins w:id="8" w:author="Rhodes, Justin S" w:date="2026-09-11T09:09:00Z" w16du:dateUtc="2026-09-11T14:09:00Z">
+      <w:ins w:id="9" w:author="Rhodes, Justin S" w:date="2026-09-11T09:09:00Z" w16du:dateUtc="2026-09-11T14:09:00Z">
         <w:r>
           <w:rPr>
             <w:rFonts w:ascii="Arial" w:hAnsi="Arial" w:cs="Arial"/>
@@ -2721,14 +2732,14 @@
           <w:t xml:space="preserve"> in the 2 wqway repeated measures ANOVA</w:t>
         </w:r>
       </w:ins>
-      <w:ins w:id="9" w:author="Rhodes, Justin S" w:date="2026-09-11T09:08:00Z" w16du:dateUtc="2026-09-11T14:08:00Z">
+      <w:ins w:id="10" w:author="Rhodes, Justin S" w:date="2026-09-11T09:08:00Z" w16du:dateUtc="2026-09-11T14:08:00Z">
         <w:r>
           <w:rPr>
             <w:rFonts w:ascii="Arial" w:hAnsi="Arial" w:cs="Arial"/>
             <w:sz w:val="20"/>
             <w:szCs w:val="20"/>
             <w:highlight w:val="yellow"/>
-            <w:rPrChange w:id="10" w:author="Rhodes, Justin S" w:date="2026-09-11T09:08:00Z" w16du:dateUtc="2026-09-11T14:08:00Z">
+            <w:rPrChange w:id="11" w:author="Rhodes, Justin S" w:date="2026-09-11T09:08:00Z" w16du:dateUtc="2026-09-11T14:08:00Z">
               <w:rPr>
                 <w:rFonts w:ascii="Arial" w:hAnsi="Arial" w:cs="Arial"/>
                 <w:sz w:val="20"/>
@@ -2739,7 +2750,7 @@
           <w:t>xx give stats</w:t>
         </w:r>
       </w:ins>
-      <w:del w:id="11" w:author="Rhodes, Justin S" w:date="2026-09-11T09:07:00Z" w16du:dateUtc="2026-09-11T14:07:00Z">
+      <w:del w:id="12" w:author="Rhodes, Justin S" w:date="2026-09-11T09:07:00Z" w16du:dateUtc="2026-09-11T14:07:00Z">
         <w:r>
           <w:rPr>
             <w:rFonts w:ascii="Arial" w:hAnsi="Arial" w:cs="Arial"/>
@@ -2773,7 +2784,7 @@
         </w:rPr>
         <w:t xml:space="preserve"> </w:t>
       </w:r>
-      <w:ins w:id="12" w:author="Rhodes, Justin S" w:date="2026-09-11T09:10:00Z" w16du:dateUtc="2026-09-11T14:10:00Z">
+      <w:ins w:id="13" w:author="Rhodes, Justin S" w:date="2026-09-11T09:10:00Z" w16du:dateUtc="2026-09-11T14:10:00Z">
         <w:r>
           <w:rPr>
             <w:rFonts w:ascii="Arial" w:hAnsi="Arial" w:cs="Arial"/>
@@ -2783,7 +2794,7 @@
           <w:t xml:space="preserve">The Late Intermediates showed the same pattern, and the </w:t>
         </w:r>
       </w:ins>
-      <w:ins w:id="13" w:author="Rhodes, Justin S" w:date="2026-09-11T09:11:00Z" w16du:dateUtc="2026-09-11T14:11:00Z">
+      <w:ins w:id="14" w:author="Rhodes, Justin S" w:date="2026-09-11T09:11:00Z" w16du:dateUtc="2026-09-11T14:11:00Z">
         <w:r>
           <w:rPr>
             <w:rFonts w:ascii="Arial" w:hAnsi="Arial" w:cs="Arial"/>
@@ -2827,7 +2838,7 @@
         </w:rPr>
         <w:t>).</w:t>
       </w:r>
-      <w:commentRangeEnd w:id="6"/>
+      <w:commentRangeEnd w:id="7"/>
       <w:r>
         <w:rPr>
           <w:rStyle w:val="CommentReference"/>
@@ -2835,9 +2846,9 @@
           <w:sz w:val="20"/>
           <w:szCs w:val="20"/>
         </w:rPr>
-        <w:commentReference w:id="6"/>
-      </w:r>
-      <w:ins w:id="14" w:author="Rhodes, Justin S" w:date="2026-09-11T09:11:00Z" w16du:dateUtc="2026-09-11T14:11:00Z">
+        <w:commentReference w:id="7"/>
+      </w:r>
+      <w:ins w:id="15" w:author="Rhodes, Justin S" w:date="2026-09-11T09:11:00Z" w16du:dateUtc="2026-09-11T14:11:00Z">
         <w:r>
           <w:rPr>
             <w:rFonts w:ascii="Arial" w:hAnsi="Arial" w:cs="Arial"/>
@@ -2847,7 +2858,7 @@
           <w:t xml:space="preserve">  Together these data </w:t>
         </w:r>
       </w:ins>
-      <w:ins w:id="15" w:author="Rhodes, Justin S" w:date="2026-09-11T09:13:00Z" w16du:dateUtc="2026-09-11T14:13:00Z">
+      <w:ins w:id="16" w:author="Rhodes, Justin S" w:date="2026-09-11T09:13:00Z" w16du:dateUtc="2026-09-11T14:13:00Z">
         <w:r>
           <w:rPr>
             <w:rFonts w:ascii="Arial" w:hAnsi="Arial" w:cs="Arial"/>
@@ -2857,7 +2868,7 @@
           <w:t>confirm</w:t>
         </w:r>
       </w:ins>
-      <w:ins w:id="16" w:author="Rhodes, Justin S" w:date="2026-09-11T09:11:00Z" w16du:dateUtc="2026-09-11T14:11:00Z">
+      <w:ins w:id="17" w:author="Rhodes, Justin S" w:date="2026-09-11T09:11:00Z" w16du:dateUtc="2026-09-11T14:11:00Z">
         <w:r>
           <w:rPr>
             <w:rFonts w:ascii="Arial" w:hAnsi="Arial" w:cs="Arial"/>
@@ -2867,7 +2878,7 @@
           <w:t xml:space="preserve"> that the Intermediate and Late Intermediate fish were in the process of </w:t>
         </w:r>
       </w:ins>
-      <w:ins w:id="17" w:author="Rhodes, Justin S" w:date="2026-09-11T09:12:00Z" w16du:dateUtc="2026-09-11T14:12:00Z">
+      <w:ins w:id="18" w:author="Rhodes, Justin S" w:date="2026-09-11T09:12:00Z" w16du:dateUtc="2026-09-11T14:12:00Z">
         <w:r>
           <w:rPr>
             <w:rFonts w:ascii="Arial" w:hAnsi="Arial" w:cs="Arial"/>
@@ -2877,7 +2888,7 @@
           <w:t>changing sex</w:t>
         </w:r>
       </w:ins>
-      <w:ins w:id="18" w:author="Rhodes, Justin S" w:date="2026-09-11T09:11:00Z" w16du:dateUtc="2026-09-11T14:11:00Z">
+      <w:ins w:id="19" w:author="Rhodes, Justin S" w:date="2026-09-11T09:11:00Z" w16du:dateUtc="2026-09-11T14:11:00Z">
         <w:r>
           <w:rPr>
             <w:rFonts w:ascii="Arial" w:hAnsi="Arial" w:cs="Arial"/>
@@ -3509,7 +3520,7 @@
         </w:rPr>
         <w:t xml:space="preserve">Fig. </w:t>
       </w:r>
-      <w:commentRangeStart w:id="19"/>
+      <w:commentRangeStart w:id="20"/>
       <w:r>
         <w:rPr>
           <w:rFonts w:ascii="Arial" w:hAnsi="Arial" w:cs="Arial"/>
@@ -3519,7 +3530,7 @@
         </w:rPr>
         <w:t>S2</w:t>
       </w:r>
-      <w:commentRangeEnd w:id="19"/>
+      <w:commentRangeEnd w:id="20"/>
       <w:r>
         <w:rPr>
           <w:rStyle w:val="CommentReference"/>
@@ -3527,7 +3538,7 @@
           <w:sz w:val="20"/>
           <w:szCs w:val="20"/>
         </w:rPr>
-        <w:commentReference w:id="19"/>
+        <w:commentReference w:id="20"/>
       </w:r>
       <w:r>
         <w:rPr>
@@ -4011,7 +4022,7 @@
         </w:rPr>
         <w:tab/>
       </w:r>
-      <w:commentRangeStart w:id="20"/>
+      <w:commentRangeStart w:id="21"/>
       <w:r>
         <w:rPr>
           <w:rFonts w:ascii="Arial" w:hAnsi="Arial" w:cs="Arial"/>
@@ -4036,7 +4047,7 @@
         </w:rPr>
         <w:t xml:space="preserve">ethods, </w:t>
       </w:r>
-      <w:commentRangeEnd w:id="20"/>
+      <w:commentRangeEnd w:id="21"/>
       <w:r>
         <w:rPr>
           <w:rStyle w:val="CommentReference"/>
@@ -4045,7 +4056,7 @@
           <w:szCs w:val="20"/>
           <w:highlight w:val="yellow"/>
         </w:rPr>
-        <w:commentReference w:id="20"/>
+        <w:commentReference w:id="21"/>
       </w:r>
       <w:r>
         <w:rPr>
@@ -4277,7 +4288,7 @@
         </w:rPr>
         <w:t xml:space="preserve">hmx3b, avp, oxt, cckb, otpa </w:t>
       </w:r>
-      <w:commentRangeStart w:id="21"/>
+      <w:commentRangeStart w:id="22"/>
       <w:r>
         <w:rPr>
           <w:rFonts w:ascii="Arial" w:hAnsi="Arial" w:cs="Arial"/>
@@ -4328,7 +4339,7 @@
         </w:rPr>
         <w:fldChar w:fldCharType="end"/>
       </w:r>
-      <w:commentRangeEnd w:id="21"/>
+      <w:commentRangeEnd w:id="22"/>
       <w:r>
         <w:rPr>
           <w:rStyle w:val="CommentReference"/>
@@ -4336,7 +4347,7 @@
           <w:sz w:val="20"/>
           <w:szCs w:val="20"/>
         </w:rPr>
-        <w:commentReference w:id="21"/>
+        <w:commentReference w:id="22"/>
       </w:r>
       <w:r>
         <w:rPr>
@@ -4678,7 +4689,7 @@
       <w:pPr>
         <w:ind w:firstLine="720"/>
         <w:rPr>
-          <w:ins w:id="22" w:author="Rhodes, Justin S" w:date="2026-09-04T13:42:00Z" w16du:dateUtc="2026-09-04T18:42:00Z"/>
+          <w:ins w:id="23" w:author="Rhodes, Justin S" w:date="2026-09-04T13:42:00Z" w16du:dateUtc="2026-09-04T18:42:00Z"/>
           <w:rFonts w:ascii="Arial" w:hAnsi="Arial" w:cs="Arial"/>
           <w:sz w:val="20"/>
           <w:szCs w:val="20"/>
@@ -4732,8 +4743,8 @@
         </w:rPr>
         <w:t xml:space="preserve"> (</w:t>
       </w:r>
-      <w:commentRangeStart w:id="23"/>
       <w:commentRangeStart w:id="24"/>
+      <w:commentRangeStart w:id="25"/>
       <w:r>
         <w:rPr>
           <w:rFonts w:ascii="Arial" w:hAnsi="Arial" w:cs="Arial"/>
@@ -4761,7 +4772,7 @@
         </w:rPr>
         <w:t xml:space="preserve"> and S</w:t>
       </w:r>
-      <w:commentRangeEnd w:id="23"/>
+      <w:commentRangeEnd w:id="24"/>
       <w:r>
         <w:rPr>
           <w:rStyle w:val="CommentReference"/>
@@ -4770,9 +4781,9 @@
           <w:szCs w:val="20"/>
           <w:highlight w:val="yellow"/>
         </w:rPr>
-        <w:commentReference w:id="23"/>
-      </w:r>
-      <w:commentRangeEnd w:id="24"/>
+        <w:commentReference w:id="24"/>
+      </w:r>
+      <w:commentRangeEnd w:id="25"/>
       <w:r>
         <w:rPr>
           <w:rStyle w:val="CommentReference"/>
@@ -4781,7 +4792,7 @@
           <w:szCs w:val="20"/>
           <w:highlight w:val="yellow"/>
         </w:rPr>
-        <w:commentReference w:id="24"/>
+        <w:commentReference w:id="25"/>
       </w:r>
       <w:r>
         <w:rPr>
@@ -4897,7 +4908,7 @@
         </w:rPr>
         <w:fldChar w:fldCharType="end"/>
       </w:r>
-      <w:ins w:id="25" w:author="Rhodes, Justin S" w:date="2026-09-04T13:42:00Z" w16du:dateUtc="2026-09-04T18:42:00Z">
+      <w:ins w:id="26" w:author="Rhodes, Justin S" w:date="2026-09-04T13:42:00Z" w16du:dateUtc="2026-09-04T18:42:00Z">
         <w:r>
           <w:rPr>
             <w:rFonts w:ascii="Arial" w:hAnsi="Arial" w:cs="Arial"/>
@@ -5643,7 +5654,7 @@
         </w:rPr>
         <w:t xml:space="preserve"> consistent with the hypothesis that the full expansion of this POA neuronal population occurs after gonadal transformation and represents one of the final neural changes accompanying sex change</w:t>
       </w:r>
-      <w:ins w:id="26" w:author="Rhodes, Justin S" w:date="2026-09-04T13:43:00Z" w16du:dateUtc="2026-09-04T18:43:00Z">
+      <w:ins w:id="27" w:author="Rhodes, Justin S" w:date="2026-09-04T13:43:00Z" w16du:dateUtc="2026-09-04T18:43:00Z">
         <w:r>
           <w:rPr>
             <w:rFonts w:ascii="Arial" w:hAnsi="Arial" w:cs="Arial"/>
@@ -5948,8 +5959,8 @@
         </w:rPr>
         <w:t>A chi-squared test revealed</w:t>
       </w:r>
-      <w:commentRangeStart w:id="27"/>
       <w:commentRangeStart w:id="28"/>
+      <w:commentRangeStart w:id="29"/>
       <w:r>
         <w:rPr>
           <w:rFonts w:ascii="Arial" w:hAnsi="Arial" w:cs="Arial"/>
@@ -5966,7 +5977,7 @@
         </w:rPr>
         <w:t>si</w:t>
       </w:r>
-      <w:commentRangeStart w:id="29"/>
+      <w:commentRangeStart w:id="30"/>
       <w:r>
         <w:rPr>
           <w:rFonts w:ascii="Arial" w:hAnsi="Arial" w:cs="Arial"/>
@@ -6050,7 +6061,7 @@
         </w:rPr>
         <w:t>.</w:t>
       </w:r>
-      <w:commentRangeEnd w:id="27"/>
+      <w:commentRangeEnd w:id="28"/>
       <w:r>
         <w:rPr>
           <w:rStyle w:val="CommentReference"/>
@@ -6058,9 +6069,9 @@
           <w:sz w:val="20"/>
           <w:szCs w:val="20"/>
         </w:rPr>
-        <w:commentReference w:id="27"/>
-      </w:r>
-      <w:commentRangeEnd w:id="28"/>
+        <w:commentReference w:id="28"/>
+      </w:r>
+      <w:commentRangeEnd w:id="29"/>
       <w:r>
         <w:rPr>
           <w:rStyle w:val="CommentReference"/>
@@ -6068,9 +6079,9 @@
           <w:sz w:val="20"/>
           <w:szCs w:val="20"/>
         </w:rPr>
-        <w:commentReference w:id="28"/>
-      </w:r>
-      <w:commentRangeEnd w:id="29"/>
+        <w:commentReference w:id="29"/>
+      </w:r>
+      <w:commentRangeEnd w:id="30"/>
       <w:r>
         <w:rPr>
           <w:rStyle w:val="CommentReference"/>
@@ -6078,7 +6089,7 @@
           <w:sz w:val="20"/>
           <w:szCs w:val="20"/>
         </w:rPr>
-        <w:commentReference w:id="29"/>
+        <w:commentReference w:id="30"/>
       </w:r>
     </w:p>
     <w:p>
@@ -6360,7 +6371,7 @@
         </w:rPr>
         <w:t>As above, a chi-squared test f</w:t>
       </w:r>
-      <w:commentRangeStart w:id="30"/>
+      <w:commentRangeStart w:id="31"/>
       <w:r>
         <w:rPr>
           <w:rFonts w:ascii="Arial" w:hAnsi="Arial" w:cs="Arial"/>
@@ -6393,7 +6404,7 @@
         </w:rPr>
         <w:t xml:space="preserve"> 1_RGC and 2_OL</w:t>
       </w:r>
-      <w:commentRangeEnd w:id="30"/>
+      <w:commentRangeEnd w:id="31"/>
       <w:r>
         <w:rPr>
           <w:rStyle w:val="CommentReference"/>
@@ -6401,7 +6412,7 @@
           <w:sz w:val="20"/>
           <w:szCs w:val="20"/>
         </w:rPr>
-        <w:commentReference w:id="30"/>
+        <w:commentReference w:id="31"/>
       </w:r>
       <w:r>
         <w:rPr>
@@ -6858,7 +6869,7 @@
         </w:rPr>
         <w:t xml:space="preserve"> exhibited a significant correlation between gene expression and the accessibility of their best local ATAC peak (Pearson's P &lt; 0.05). The prevalence of accessibility-associated DEGs did not differ significantly among cell clusters, indicating that the contribution of local chromatin accessibility to transcriptional remodeling was broadly similar across cell populations</w:t>
       </w:r>
-      <w:ins w:id="31" w:author="Rhodes, Justin S" w:date="2026-09-04T13:47:00Z" w16du:dateUtc="2026-09-04T18:47:00Z">
+      <w:ins w:id="32" w:author="Rhodes, Justin S" w:date="2026-09-04T13:47:00Z" w16du:dateUtc="2026-09-04T18:47:00Z">
         <w:r>
           <w:rPr>
             <w:rFonts w:ascii="Arial" w:hAnsi="Arial" w:cs="Arial"/>
@@ -6868,7 +6879,7 @@
           <w:t xml:space="preserve"> as indicated by a non-significant chi-square </w:t>
         </w:r>
       </w:ins>
-      <w:ins w:id="32" w:author="Rhodes, Justin S" w:date="2026-09-04T13:48:00Z" w16du:dateUtc="2026-09-04T18:48:00Z">
+      <w:ins w:id="33" w:author="Rhodes, Justin S" w:date="2026-09-04T13:48:00Z" w16du:dateUtc="2026-09-04T18:48:00Z">
         <w:r>
           <w:rPr>
             <w:rFonts w:ascii="Arial" w:hAnsi="Arial" w:cs="Arial"/>
@@ -6986,8 +6997,8 @@
         </w:rPr>
         <w:t xml:space="preserve">pendix </w:t>
       </w:r>
-      <w:commentRangeStart w:id="33"/>
       <w:commentRangeStart w:id="34"/>
+      <w:commentRangeStart w:id="35"/>
       <w:r>
         <w:rPr>
           <w:rFonts w:ascii="Arial" w:hAnsi="Arial" w:cs="Arial"/>
@@ -6997,7 +7008,7 @@
         </w:rPr>
         <w:t>S</w:t>
       </w:r>
-      <w:commentRangeEnd w:id="33"/>
+      <w:commentRangeEnd w:id="34"/>
       <w:r>
         <w:rPr>
           <w:rStyle w:val="CommentReference"/>
@@ -7006,9 +7017,9 @@
           <w:szCs w:val="20"/>
           <w:highlight w:val="yellow"/>
         </w:rPr>
-        <w:commentReference w:id="33"/>
-      </w:r>
-      <w:commentRangeEnd w:id="34"/>
+        <w:commentReference w:id="34"/>
+      </w:r>
+      <w:commentRangeEnd w:id="35"/>
       <w:r>
         <w:rPr>
           <w:rStyle w:val="CommentReference"/>
@@ -7017,7 +7028,7 @@
           <w:szCs w:val="20"/>
           <w:highlight w:val="yellow"/>
         </w:rPr>
-        <w:commentReference w:id="34"/>
+        <w:commentReference w:id="35"/>
       </w:r>
       <w:r>
         <w:rPr>
@@ -7067,7 +7078,7 @@
       <w:pPr>
         <w:ind w:firstLine="720"/>
         <w:rPr>
-          <w:ins w:id="35" w:author="Rhodes, Justin S" w:date="2026-09-03T13:56:00Z" w16du:dateUtc="2026-09-03T18:56:00Z"/>
+          <w:ins w:id="36" w:author="Rhodes, Justin S" w:date="2026-09-03T13:56:00Z" w16du:dateUtc="2026-09-03T18:56:00Z"/>
           <w:rFonts w:ascii="Arial" w:hAnsi="Arial" w:cs="Arial"/>
           <w:sz w:val="20"/>
           <w:szCs w:val="20"/>
@@ -7137,13 +7148,13 @@
     <w:p>
       <w:pPr>
         <w:rPr>
-          <w:ins w:id="36" w:author="Rhodes, Justin S" w:date="2026-09-11T09:21:00Z" w16du:dateUtc="2026-09-11T14:21:00Z"/>
-          <w:rFonts w:ascii="Arial" w:hAnsi="Arial" w:cs="Arial"/>
-          <w:sz w:val="20"/>
-          <w:szCs w:val="20"/>
-        </w:rPr>
-      </w:pPr>
-      <w:ins w:id="37" w:author="Rhodes, Justin S" w:date="2026-09-11T09:21:00Z" w16du:dateUtc="2026-09-11T14:21:00Z">
+          <w:ins w:id="37" w:author="Rhodes, Justin S" w:date="2026-09-11T09:21:00Z" w16du:dateUtc="2026-09-11T14:21:00Z"/>
+          <w:rFonts w:ascii="Arial" w:hAnsi="Arial" w:cs="Arial"/>
+          <w:sz w:val="20"/>
+          <w:szCs w:val="20"/>
+        </w:rPr>
+      </w:pPr>
+      <w:ins w:id="38" w:author="Rhodes, Justin S" w:date="2026-09-11T09:21:00Z" w16du:dateUtc="2026-09-11T14:21:00Z">
         <w:r>
           <w:rPr>
             <w:rFonts w:ascii="Arial" w:hAnsi="Arial" w:cs="Arial"/>
@@ -7157,13 +7168,13 @@
     <w:p>
       <w:pPr>
         <w:rPr>
-          <w:del w:id="38" w:author="Rhodes, Justin S" w:date="2026-09-11T09:21:00Z" w16du:dateUtc="2026-09-11T14:21:00Z"/>
-          <w:rFonts w:ascii="Arial" w:hAnsi="Arial" w:cs="Arial"/>
-          <w:sz w:val="20"/>
-          <w:szCs w:val="20"/>
-        </w:rPr>
-      </w:pPr>
-      <w:ins w:id="39" w:author="Rhodes, Justin S" w:date="2026-09-11T09:22:00Z" w16du:dateUtc="2026-09-11T14:22:00Z">
+          <w:del w:id="39" w:author="Rhodes, Justin S" w:date="2026-09-11T09:21:00Z" w16du:dateUtc="2026-09-11T14:21:00Z"/>
+          <w:rFonts w:ascii="Arial" w:hAnsi="Arial" w:cs="Arial"/>
+          <w:sz w:val="20"/>
+          <w:szCs w:val="20"/>
+        </w:rPr>
+      </w:pPr>
+      <w:ins w:id="40" w:author="Rhodes, Justin S" w:date="2026-09-11T09:22:00Z" w16du:dateUtc="2026-09-11T14:22:00Z">
         <w:r>
           <w:rPr>
             <w:rFonts w:ascii="Arial" w:hAnsi="Arial" w:cs="Arial"/>
@@ -7173,7 +7184,7 @@
           <w:tab/>
         </w:r>
       </w:ins>
-      <w:ins w:id="40" w:author="Rhodes, Justin S" w:date="2026-09-11T09:21:00Z" w16du:dateUtc="2026-09-11T14:21:00Z">
+      <w:ins w:id="41" w:author="Rhodes, Justin S" w:date="2026-09-11T09:21:00Z" w16du:dateUtc="2026-09-11T14:21:00Z">
         <w:r>
           <w:rPr>
             <w:rFonts w:ascii="Arial" w:hAnsi="Arial" w:cs="Arial"/>
@@ -7188,7 +7199,7 @@
             <w:sz w:val="20"/>
             <w:szCs w:val="20"/>
             <w:highlight w:val="yellow"/>
-            <w:rPrChange w:id="41" w:author="Rhodes, Justin S" w:date="2026-09-11T09:22:00Z" w16du:dateUtc="2026-09-11T14:22:00Z">
+            <w:rPrChange w:id="42" w:author="Rhodes, Justin S" w:date="2026-09-11T09:22:00Z" w16du:dateUtc="2026-09-11T14:22:00Z">
               <w:rPr>
                 <w:rFonts w:ascii="Arial" w:hAnsi="Arial" w:cs="Arial"/>
                 <w:sz w:val="20"/>
@@ -7212,7 +7223,7 @@
             <w:sz w:val="20"/>
             <w:szCs w:val="20"/>
             <w:highlight w:val="yellow"/>
-            <w:rPrChange w:id="42" w:author="Rhodes, Justin S" w:date="2026-09-11T09:22:00Z" w16du:dateUtc="2026-09-11T14:22:00Z">
+            <w:rPrChange w:id="43" w:author="Rhodes, Justin S" w:date="2026-09-11T09:22:00Z" w16du:dateUtc="2026-09-11T14:22:00Z">
               <w:rPr>
                 <w:rFonts w:ascii="Arial" w:hAnsi="Arial" w:cs="Arial"/>
                 <w:sz w:val="20"/>
@@ -7236,7 +7247,7 @@
             <w:sz w:val="20"/>
             <w:szCs w:val="20"/>
             <w:highlight w:val="yellow"/>
-            <w:rPrChange w:id="43" w:author="Rhodes, Justin S" w:date="2026-09-11T09:22:00Z" w16du:dateUtc="2026-09-11T14:22:00Z">
+            <w:rPrChange w:id="44" w:author="Rhodes, Justin S" w:date="2026-09-11T09:22:00Z" w16du:dateUtc="2026-09-11T14:22:00Z">
               <w:rPr>
                 <w:rFonts w:ascii="Arial" w:hAnsi="Arial" w:cs="Arial"/>
                 <w:sz w:val="20"/>
@@ -7255,7 +7266,7 @@
           <w:t xml:space="preserve">). Taken together, these results demonstrate that sex change progresses asynchronously across cell types, with some populations substantially further toward the female state than others at </w:t>
         </w:r>
       </w:ins>
-      <w:ins w:id="44" w:author="Rhodes, Justin S" w:date="2026-09-11T09:32:00Z" w16du:dateUtc="2026-09-11T14:32:00Z">
+      <w:ins w:id="45" w:author="Rhodes, Justin S" w:date="2026-09-11T09:32:00Z" w16du:dateUtc="2026-09-11T14:32:00Z">
         <w:r>
           <w:rPr>
             <w:rFonts w:ascii="Arial" w:hAnsi="Arial" w:cs="Arial"/>
@@ -7265,7 +7276,7 @@
           <w:t>the intermediate</w:t>
         </w:r>
       </w:ins>
-      <w:ins w:id="45" w:author="Rhodes, Justin S" w:date="2026-09-11T09:21:00Z" w16du:dateUtc="2026-09-11T14:21:00Z">
+      <w:ins w:id="46" w:author="Rhodes, Justin S" w:date="2026-09-11T09:21:00Z" w16du:dateUtc="2026-09-11T14:21:00Z">
         <w:r>
           <w:rPr>
             <w:rFonts w:ascii="Arial" w:hAnsi="Arial" w:cs="Arial"/>
@@ -7275,7 +7286,7 @@
           <w:t xml:space="preserve"> stage of sex change.</w:t>
         </w:r>
       </w:ins>
-      <w:del w:id="46" w:author="Rhodes, Justin S" w:date="2026-09-11T09:21:00Z" w16du:dateUtc="2026-09-11T14:21:00Z">
+      <w:del w:id="47" w:author="Rhodes, Justin S" w:date="2026-09-11T09:21:00Z" w16du:dateUtc="2026-09-11T14:21:00Z">
         <w:r>
           <w:rPr>
             <w:rFonts w:ascii="Arial" w:hAnsi="Arial" w:cs="Arial"/>
@@ -7293,8 +7304,8 @@
           <w:delText>T</w:delText>
         </w:r>
       </w:del>
-      <w:ins w:id="47" w:author="Graham, Gabriel J." w:date="2026-09-09T13:19:00Z" w16du:dateUtc="2026-09-09T17:19:00Z">
-        <w:del w:id="48" w:author="Rhodes, Justin S" w:date="2026-09-11T09:21:00Z" w16du:dateUtc="2026-09-11T14:21:00Z">
+      <w:ins w:id="48" w:author="Graham, Gabriel J." w:date="2026-09-09T13:19:00Z" w16du:dateUtc="2026-09-09T17:19:00Z">
+        <w:del w:id="49" w:author="Rhodes, Justin S" w:date="2026-09-11T09:21:00Z" w16du:dateUtc="2026-09-11T14:21:00Z">
           <w:r>
             <w:rPr>
               <w:rFonts w:ascii="Arial" w:hAnsi="Arial" w:cs="Arial"/>
@@ -7305,10 +7316,10 @@
           </w:r>
         </w:del>
       </w:ins>
-      <w:commentRangeStart w:id="49"/>
       <w:commentRangeStart w:id="50"/>
       <w:commentRangeStart w:id="51"/>
-      <w:del w:id="52" w:author="Rhodes, Justin S" w:date="2026-09-11T09:21:00Z" w16du:dateUtc="2026-09-11T14:21:00Z">
+      <w:commentRangeStart w:id="52"/>
+      <w:del w:id="53" w:author="Rhodes, Justin S" w:date="2026-09-11T09:21:00Z" w16du:dateUtc="2026-09-11T14:21:00Z">
         <w:r>
           <w:rPr>
             <w:rFonts w:ascii="Arial" w:hAnsi="Arial" w:cs="Arial"/>
@@ -7318,7 +7329,7 @@
           <w:delText xml:space="preserve">in intermediates </w:delText>
         </w:r>
       </w:del>
-      <w:del w:id="53" w:author="Rhodes, Justin S" w:date="2026-09-07T16:51:00Z" w16du:dateUtc="2026-09-07T21:51:00Z">
+      <w:del w:id="54" w:author="Rhodes, Justin S" w:date="2026-09-07T16:51:00Z" w16du:dateUtc="2026-09-07T21:51:00Z">
         <w:r>
           <w:rPr>
             <w:rFonts w:ascii="Arial" w:hAnsi="Arial" w:cs="Arial"/>
@@ -7328,7 +7339,7 @@
           <w:delText>To determine a temporal order for when sex change occurred in each cluster</w:delText>
         </w:r>
       </w:del>
-      <w:del w:id="54" w:author="Rhodes, Justin S" w:date="2026-09-07T16:52:00Z" w16du:dateUtc="2026-09-07T21:52:00Z">
+      <w:del w:id="55" w:author="Rhodes, Justin S" w:date="2026-09-07T16:52:00Z" w16du:dateUtc="2026-09-07T21:52:00Z">
         <w:r>
           <w:rPr>
             <w:rFonts w:ascii="Arial" w:hAnsi="Arial" w:cs="Arial"/>
@@ -7338,7 +7349,7 @@
           <w:delText>,</w:delText>
         </w:r>
       </w:del>
-      <w:del w:id="55" w:author="Rhodes, Justin S" w:date="2026-09-11T09:21:00Z" w16du:dateUtc="2026-09-11T14:21:00Z">
+      <w:del w:id="56" w:author="Rhodes, Justin S" w:date="2026-09-11T09:21:00Z" w16du:dateUtc="2026-09-11T14:21:00Z">
         <w:r>
           <w:rPr>
             <w:rFonts w:ascii="Arial" w:hAnsi="Arial" w:cs="Arial"/>
@@ -7356,7 +7367,7 @@
           <w:delText xml:space="preserve">To do this, </w:delText>
         </w:r>
       </w:del>
-      <w:del w:id="56" w:author="Rhodes, Justin S" w:date="2026-09-07T16:53:00Z" w16du:dateUtc="2026-09-07T21:53:00Z">
+      <w:del w:id="57" w:author="Rhodes, Justin S" w:date="2026-09-07T16:53:00Z" w16du:dateUtc="2026-09-07T21:53:00Z">
         <w:r>
           <w:rPr>
             <w:rFonts w:ascii="Arial" w:hAnsi="Arial" w:cs="Arial"/>
@@ -7366,7 +7377,7 @@
           <w:delText xml:space="preserve">we </w:delText>
         </w:r>
       </w:del>
-      <w:del w:id="57" w:author="Rhodes, Justin S" w:date="2026-09-11T09:21:00Z" w16du:dateUtc="2026-09-11T14:21:00Z">
+      <w:del w:id="58" w:author="Rhodes, Justin S" w:date="2026-09-11T09:21:00Z" w16du:dateUtc="2026-09-11T14:21:00Z">
         <w:r>
           <w:rPr>
             <w:rFonts w:ascii="Arial" w:hAnsi="Arial" w:cs="Arial"/>
@@ -7376,7 +7387,7 @@
           <w:delText>w</w:delText>
         </w:r>
       </w:del>
-      <w:del w:id="58" w:author="Rhodes, Justin S" w:date="2026-09-07T16:53:00Z" w16du:dateUtc="2026-09-07T21:53:00Z">
+      <w:del w:id="59" w:author="Rhodes, Justin S" w:date="2026-09-07T16:53:00Z" w16du:dateUtc="2026-09-07T21:53:00Z">
         <w:r>
           <w:rPr>
             <w:rFonts w:ascii="Arial" w:hAnsi="Arial" w:cs="Arial"/>
@@ -7386,7 +7397,7 @@
           <w:delText xml:space="preserve">next </w:delText>
         </w:r>
       </w:del>
-      <w:del w:id="59" w:author="Rhodes, Justin S" w:date="2026-09-11T09:21:00Z" w16du:dateUtc="2026-09-11T14:21:00Z">
+      <w:del w:id="60" w:author="Rhodes, Justin S" w:date="2026-09-11T09:21:00Z" w16du:dateUtc="2026-09-11T14:21:00Z">
         <w:r>
           <w:rPr>
             <w:rFonts w:ascii="Arial" w:hAnsi="Arial" w:cs="Arial"/>
@@ -7396,7 +7407,7 @@
           <w:delText xml:space="preserve">trained </w:delText>
         </w:r>
       </w:del>
-      <w:del w:id="60" w:author="Rhodes, Justin S" w:date="2026-09-07T16:53:00Z" w16du:dateUtc="2026-09-07T21:53:00Z">
+      <w:del w:id="61" w:author="Rhodes, Justin S" w:date="2026-09-07T16:53:00Z" w16du:dateUtc="2026-09-07T21:53:00Z">
         <w:r>
           <w:rPr>
             <w:rFonts w:ascii="Arial" w:hAnsi="Arial" w:cs="Arial"/>
@@ -7406,7 +7417,7 @@
           <w:delText>machine learning</w:delText>
         </w:r>
       </w:del>
-      <w:del w:id="61" w:author="Rhodes, Justin S" w:date="2026-09-11T09:21:00Z" w16du:dateUtc="2026-09-11T14:21:00Z">
+      <w:del w:id="62" w:author="Rhodes, Justin S" w:date="2026-09-11T09:21:00Z" w16du:dateUtc="2026-09-11T14:21:00Z">
         <w:r>
           <w:rPr>
             <w:rFonts w:ascii="Arial" w:hAnsi="Arial" w:cs="Arial"/>
@@ -7432,7 +7443,7 @@
           <w:delText xml:space="preserve"> </w:delText>
         </w:r>
       </w:del>
-      <w:del w:id="62" w:author="Rhodes, Justin S" w:date="2026-09-07T16:53:00Z" w16du:dateUtc="2026-09-07T21:53:00Z">
+      <w:del w:id="63" w:author="Rhodes, Justin S" w:date="2026-09-07T16:53:00Z" w16du:dateUtc="2026-09-07T21:53:00Z">
         <w:r>
           <w:rPr>
             <w:rFonts w:ascii="Arial" w:hAnsi="Arial" w:cs="Arial"/>
@@ -7442,7 +7453,7 @@
           <w:delText>to predict the sex of each cluster for each intermediate based on the</w:delText>
         </w:r>
       </w:del>
-      <w:del w:id="63" w:author="Rhodes, Justin S" w:date="2026-09-11T09:21:00Z" w16du:dateUtc="2026-09-11T14:21:00Z">
+      <w:del w:id="64" w:author="Rhodes, Justin S" w:date="2026-09-11T09:21:00Z" w16du:dateUtc="2026-09-11T14:21:00Z">
         <w:r>
           <w:rPr>
             <w:rFonts w:ascii="Arial" w:hAnsi="Arial" w:cs="Arial"/>
@@ -7450,16 +7461,6 @@
             <w:szCs w:val="20"/>
           </w:rPr>
           <w:delText xml:space="preserve"> expression of DEGs a</w:delText>
-        </w:r>
-        <w:commentRangeEnd w:id="49"/>
-        <w:r>
-          <w:rPr>
-            <w:rStyle w:val="CommentReference"/>
-            <w:rFonts w:ascii="Arial" w:hAnsi="Arial" w:cs="Arial"/>
-            <w:sz w:val="20"/>
-            <w:szCs w:val="20"/>
-          </w:rPr>
-          <w:commentReference w:id="49"/>
         </w:r>
         <w:commentRangeEnd w:id="50"/>
         <w:r>
@@ -7471,8 +7472,18 @@
           </w:rPr>
           <w:commentReference w:id="50"/>
         </w:r>
+        <w:commentRangeEnd w:id="51"/>
+        <w:r>
+          <w:rPr>
+            <w:rStyle w:val="CommentReference"/>
+            <w:rFonts w:ascii="Arial" w:hAnsi="Arial" w:cs="Arial"/>
+            <w:sz w:val="20"/>
+            <w:szCs w:val="20"/>
+          </w:rPr>
+          <w:commentReference w:id="51"/>
+        </w:r>
       </w:del>
-      <w:commentRangeEnd w:id="51"/>
+      <w:commentRangeEnd w:id="52"/>
       <w:r>
         <w:rPr>
           <w:rStyle w:val="CommentReference"/>
@@ -7480,9 +7491,9 @@
           <w:sz w:val="20"/>
           <w:szCs w:val="20"/>
         </w:rPr>
-        <w:commentReference w:id="51"/>
-      </w:r>
-      <w:del w:id="64" w:author="Rhodes, Justin S" w:date="2026-09-11T09:21:00Z" w16du:dateUtc="2026-09-11T14:21:00Z">
+        <w:commentReference w:id="52"/>
+      </w:r>
+      <w:del w:id="65" w:author="Rhodes, Justin S" w:date="2026-09-11T09:21:00Z" w16du:dateUtc="2026-09-11T14:21:00Z">
         <w:r>
           <w:rPr>
             <w:rFonts w:ascii="Arial" w:hAnsi="Arial" w:cs="Arial"/>
@@ -7590,8 +7601,8 @@
           <w:delText xml:space="preserve"> months in the intermediate state</w:delText>
         </w:r>
       </w:del>
-      <w:ins w:id="65" w:author="Graham, Gabriel J." w:date="2026-09-09T13:19:00Z" w16du:dateUtc="2026-09-09T17:19:00Z">
-        <w:del w:id="66" w:author="Rhodes, Justin S" w:date="2026-09-11T09:21:00Z" w16du:dateUtc="2026-09-11T14:21:00Z">
+      <w:ins w:id="66" w:author="Graham, Gabriel J." w:date="2026-09-09T13:19:00Z" w16du:dateUtc="2026-09-09T17:19:00Z">
+        <w:del w:id="67" w:author="Rhodes, Justin S" w:date="2026-09-11T09:21:00Z" w16du:dateUtc="2026-09-11T14:21:00Z">
           <w:r>
             <w:rPr>
               <w:rFonts w:ascii="Arial" w:hAnsi="Arial" w:cs="Arial"/>
@@ -7602,7 +7613,7 @@
           </w:r>
         </w:del>
       </w:ins>
-      <w:del w:id="67" w:author="Rhodes, Justin S" w:date="2026-09-11T09:21:00Z" w16du:dateUtc="2026-09-11T14:21:00Z">
+      <w:del w:id="68" w:author="Rhodes, Justin S" w:date="2026-09-11T09:21:00Z" w16du:dateUtc="2026-09-11T14:21:00Z">
         <w:r>
           <w:rPr>
             <w:rFonts w:ascii="Arial" w:hAnsi="Arial" w:cs="Arial"/>
@@ -7685,7 +7696,7 @@
       <w:pPr>
         <w:ind w:firstLine="720"/>
         <w:rPr>
-          <w:ins w:id="68" w:author="Rhodes, Justin S" w:date="2026-09-11T09:22:00Z" w16du:dateUtc="2026-09-11T14:22:00Z"/>
+          <w:ins w:id="69" w:author="Rhodes, Justin S" w:date="2026-09-11T09:22:00Z" w16du:dateUtc="2026-09-11T14:22:00Z"/>
           <w:rFonts w:ascii="Arial" w:hAnsi="Arial" w:cs="Arial"/>
           <w:sz w:val="20"/>
           <w:szCs w:val="20"/>
@@ -7721,7 +7732,7 @@
         </w:rPr>
         <w:t>Aromatase Expression Decreases</w:t>
       </w:r>
-      <w:ins w:id="69" w:author="Graham, Gabriel J." w:date="2026-09-10T19:12:00Z" w16du:dateUtc="2026-09-10T23:12:00Z">
+      <w:ins w:id="70" w:author="Graham, Gabriel J." w:date="2026-09-10T19:12:00Z" w16du:dateUtc="2026-09-10T23:12:00Z">
         <w:r>
           <w:rPr>
             <w:rFonts w:ascii="Arial" w:hAnsi="Arial" w:cs="Arial"/>
@@ -7743,7 +7754,7 @@
           <w:t xml:space="preserve">but Sex Steroid Signaling does not Change </w:t>
         </w:r>
       </w:ins>
-      <w:del w:id="70" w:author="Graham, Gabriel J." w:date="2026-09-10T19:12:00Z" w16du:dateUtc="2026-09-10T23:12:00Z">
+      <w:del w:id="71" w:author="Graham, Gabriel J." w:date="2026-09-10T19:12:00Z" w16du:dateUtc="2026-09-10T23:12:00Z">
         <w:r>
           <w:rPr>
             <w:rFonts w:ascii="Arial" w:hAnsi="Arial" w:cs="Arial"/>
@@ -7775,7 +7786,7 @@
         </w:rPr>
         <w:t xml:space="preserve"> </w:t>
       </w:r>
-      <w:del w:id="71" w:author="Graham, Gabriel J." w:date="2026-09-10T19:12:00Z" w16du:dateUtc="2026-09-10T23:12:00Z">
+      <w:del w:id="72" w:author="Graham, Gabriel J." w:date="2026-09-10T19:12:00Z" w16du:dateUtc="2026-09-10T23:12:00Z">
         <w:r>
           <w:rPr>
             <w:rFonts w:ascii="Arial" w:hAnsi="Arial" w:cs="Arial"/>
@@ -7787,7 +7798,7 @@
           <w:delText xml:space="preserve">but does </w:delText>
         </w:r>
       </w:del>
-      <w:del w:id="72" w:author="Graham, Gabriel J." w:date="2026-09-10T19:11:00Z" w16du:dateUtc="2026-09-10T23:11:00Z">
+      <w:del w:id="73" w:author="Graham, Gabriel J." w:date="2026-09-10T19:11:00Z" w16du:dateUtc="2026-09-10T23:11:00Z">
         <w:r>
           <w:rPr>
             <w:rFonts w:ascii="Arial" w:hAnsi="Arial" w:cs="Arial"/>
@@ -7799,7 +7810,7 @@
           <w:delText xml:space="preserve">not Alter Autocrine </w:delText>
         </w:r>
       </w:del>
-      <w:del w:id="73" w:author="Graham, Gabriel J." w:date="2026-09-10T19:12:00Z" w16du:dateUtc="2026-09-10T23:12:00Z">
+      <w:del w:id="74" w:author="Graham, Gabriel J." w:date="2026-09-10T19:12:00Z" w16du:dateUtc="2026-09-10T23:12:00Z">
         <w:r>
           <w:rPr>
             <w:rFonts w:ascii="Arial" w:hAnsi="Arial" w:cs="Arial"/>
@@ -7918,7 +7929,7 @@
           <w:szCs w:val="20"/>
         </w:rPr>
       </w:pPr>
-      <w:commentRangeStart w:id="74"/>
+      <w:commentRangeStart w:id="75"/>
       <w:r>
         <w:rPr>
           <w:rFonts w:ascii="Arial" w:hAnsi="Arial" w:cs="Arial"/>
@@ -8044,9 +8055,9 @@
         </w:rPr>
         <w:t xml:space="preserve"> </w:t>
       </w:r>
-      <w:commentRangeStart w:id="75"/>
       <w:commentRangeStart w:id="76"/>
-      <w:del w:id="77" w:author="Graham, Gabriel J." w:date="2026-09-10T19:03:00Z" w16du:dateUtc="2026-09-10T23:03:00Z">
+      <w:commentRangeStart w:id="77"/>
+      <w:del w:id="78" w:author="Graham, Gabriel J." w:date="2026-09-10T19:03:00Z" w16du:dateUtc="2026-09-10T23:03:00Z">
         <w:r>
           <w:rPr>
             <w:rFonts w:ascii="Arial" w:hAnsi="Arial" w:cs="Arial"/>
@@ -8073,8 +8084,8 @@
           </w:rPr>
           <w:delText xml:space="preserve"> expression had on estrogenic signaling, we next examined the expression and accessibility of genes with an estrogen response element (</w:delText>
         </w:r>
-        <w:commentRangeStart w:id="78"/>
         <w:commentRangeStart w:id="79"/>
+        <w:commentRangeStart w:id="80"/>
         <w:r>
           <w:rPr>
             <w:rFonts w:ascii="Arial" w:hAnsi="Arial" w:cs="Arial"/>
@@ -8083,7 +8094,7 @@
           </w:rPr>
           <w:delText>ERE</w:delText>
         </w:r>
-        <w:commentRangeEnd w:id="78"/>
+        <w:commentRangeEnd w:id="79"/>
         <w:r>
           <w:rPr>
             <w:rStyle w:val="CommentReference"/>
@@ -8091,10 +8102,10 @@
             <w:sz w:val="20"/>
             <w:szCs w:val="20"/>
           </w:rPr>
-          <w:commentReference w:id="78"/>
+          <w:commentReference w:id="79"/>
         </w:r>
       </w:del>
-      <w:commentRangeEnd w:id="79"/>
+      <w:commentRangeEnd w:id="80"/>
       <w:r>
         <w:rPr>
           <w:rStyle w:val="CommentReference"/>
@@ -8102,9 +8113,9 @@
           <w:sz w:val="20"/>
           <w:szCs w:val="20"/>
         </w:rPr>
-        <w:commentReference w:id="79"/>
-      </w:r>
-      <w:del w:id="80" w:author="Graham, Gabriel J." w:date="2026-09-10T19:03:00Z" w16du:dateUtc="2026-09-10T23:03:00Z">
+        <w:commentReference w:id="80"/>
+      </w:r>
+      <w:del w:id="81" w:author="Graham, Gabriel J." w:date="2026-09-10T19:03:00Z" w16du:dateUtc="2026-09-10T23:03:00Z">
         <w:r>
           <w:rPr>
             <w:rFonts w:ascii="Arial" w:hAnsi="Arial" w:cs="Arial"/>
@@ -8207,7 +8218,7 @@
           </w:rPr>
           <w:delText xml:space="preserve"> expression changes in 1_RGC, this change does not result in a change in sex steroid signaling in 1_RGC. </w:delText>
         </w:r>
-        <w:commentRangeEnd w:id="75"/>
+        <w:commentRangeEnd w:id="76"/>
         <w:r>
           <w:rPr>
             <w:rStyle w:val="CommentReference"/>
@@ -8215,10 +8226,10 @@
             <w:sz w:val="20"/>
             <w:szCs w:val="20"/>
           </w:rPr>
-          <w:commentReference w:id="75"/>
+          <w:commentReference w:id="76"/>
         </w:r>
       </w:del>
-      <w:commentRangeEnd w:id="76"/>
+      <w:commentRangeEnd w:id="77"/>
       <w:r>
         <w:rPr>
           <w:rStyle w:val="CommentReference"/>
@@ -8226,9 +8237,9 @@
           <w:sz w:val="20"/>
           <w:szCs w:val="20"/>
         </w:rPr>
-        <w:commentReference w:id="76"/>
-      </w:r>
-      <w:commentRangeStart w:id="81"/>
+        <w:commentReference w:id="77"/>
+      </w:r>
+      <w:commentRangeStart w:id="82"/>
       <w:r>
         <w:rPr>
           <w:rFonts w:ascii="Arial" w:hAnsi="Arial" w:cs="Arial"/>
@@ -8347,7 +8358,7 @@
         </w:rPr>
         <w:t>I</w:t>
       </w:r>
-      <w:commentRangeStart w:id="82"/>
+      <w:commentRangeStart w:id="83"/>
       <w:r>
         <w:rPr>
           <w:rFonts w:ascii="Arial" w:hAnsi="Arial" w:cs="Arial"/>
@@ -8609,7 +8620,7 @@
         </w:rPr>
         <w:t xml:space="preserve"> </w:t>
       </w:r>
-      <w:commentRangeEnd w:id="81"/>
+      <w:commentRangeEnd w:id="82"/>
       <w:r>
         <w:rPr>
           <w:rStyle w:val="CommentReference"/>
@@ -8617,9 +8628,9 @@
           <w:sz w:val="20"/>
           <w:szCs w:val="20"/>
         </w:rPr>
-        <w:commentReference w:id="81"/>
-      </w:r>
-      <w:commentRangeEnd w:id="74"/>
+        <w:commentReference w:id="82"/>
+      </w:r>
+      <w:commentRangeEnd w:id="75"/>
       <w:r>
         <w:rPr>
           <w:rStyle w:val="CommentReference"/>
@@ -8627,9 +8638,9 @@
           <w:sz w:val="20"/>
           <w:szCs w:val="20"/>
         </w:rPr>
-        <w:commentReference w:id="74"/>
-      </w:r>
-      <w:commentRangeEnd w:id="82"/>
+        <w:commentReference w:id="75"/>
+      </w:r>
+      <w:commentRangeEnd w:id="83"/>
       <w:r>
         <w:rPr>
           <w:rStyle w:val="CommentReference"/>
@@ -8637,7 +8648,7 @@
           <w:sz w:val="20"/>
           <w:szCs w:val="20"/>
         </w:rPr>
-        <w:commentReference w:id="82"/>
+        <w:commentReference w:id="83"/>
       </w:r>
     </w:p>
     <w:p>
@@ -8828,7 +8839,7 @@
           <w:rFonts w:ascii="Arial" w:hAnsi="Arial" w:cs="Arial"/>
           <w:sz w:val="20"/>
           <w:szCs w:val="20"/>
-          <w:rPrChange w:id="83" w:author="Graham, Gabriel J." w:date="2026-09-10T19:11:00Z" w16du:dateUtc="2026-09-10T23:11:00Z">
+          <w:rPrChange w:id="84" w:author="Graham, Gabriel J." w:date="2026-09-10T19:11:00Z" w16du:dateUtc="2026-09-10T23:11:00Z">
             <w:rPr>
               <w:rFonts w:ascii="Arial" w:hAnsi="Arial" w:cs="Arial"/>
               <w:sz w:val="20"/>
@@ -8839,13 +8850,13 @@
         </w:rPr>
         <w:t>along with</w:t>
       </w:r>
-      <w:del w:id="84" w:author="Graham, Gabriel J." w:date="2026-09-10T19:11:00Z" w16du:dateUtc="2026-09-10T23:11:00Z">
+      <w:del w:id="85" w:author="Graham, Gabriel J." w:date="2026-09-10T19:11:00Z" w16du:dateUtc="2026-09-10T23:11:00Z">
         <w:r>
           <w:rPr>
             <w:rFonts w:ascii="Arial" w:hAnsi="Arial" w:cs="Arial"/>
             <w:sz w:val="20"/>
             <w:szCs w:val="20"/>
-            <w:rPrChange w:id="85" w:author="Graham, Gabriel J." w:date="2026-09-10T19:11:00Z" w16du:dateUtc="2026-09-10T23:11:00Z">
+            <w:rPrChange w:id="86" w:author="Graham, Gabriel J." w:date="2026-09-10T19:11:00Z" w16du:dateUtc="2026-09-10T23:11:00Z">
               <w:rPr>
                 <w:rFonts w:ascii="Arial" w:hAnsi="Arial" w:cs="Arial"/>
                 <w:sz w:val="20"/>
@@ -8863,7 +8874,7 @@
             <w:iCs/>
             <w:sz w:val="20"/>
             <w:szCs w:val="20"/>
-            <w:rPrChange w:id="86" w:author="Graham, Gabriel J." w:date="2026-09-10T19:11:00Z" w16du:dateUtc="2026-09-10T23:11:00Z">
+            <w:rPrChange w:id="87" w:author="Graham, Gabriel J." w:date="2026-09-10T19:11:00Z" w16du:dateUtc="2026-09-10T23:11:00Z">
               <w:rPr>
                 <w:rFonts w:ascii="Arial" w:hAnsi="Arial" w:cs="Arial"/>
                 <w:i/>
@@ -10226,7 +10237,7 @@
         </w:rPr>
         <w:t xml:space="preserve">) </w:t>
       </w:r>
-      <w:commentRangeStart w:id="87"/>
+      <w:commentRangeStart w:id="88"/>
       <w:r>
         <w:rPr>
           <w:rFonts w:ascii="Arial" w:hAnsi="Arial" w:cs="Arial"/>
@@ -10301,7 +10312,7 @@
         </w:rPr>
         <w:fldChar w:fldCharType="end"/>
       </w:r>
-      <w:commentRangeEnd w:id="87"/>
+      <w:commentRangeEnd w:id="88"/>
       <w:r>
         <w:rPr>
           <w:rStyle w:val="CommentReference"/>
@@ -10309,7 +10320,7 @@
           <w:sz w:val="20"/>
           <w:szCs w:val="20"/>
         </w:rPr>
-        <w:commentReference w:id="87"/>
+        <w:commentReference w:id="88"/>
       </w:r>
       <w:r>
         <w:rPr>
@@ -10989,10 +11000,10 @@
           <w:szCs w:val="20"/>
         </w:rPr>
       </w:pPr>
-      <w:commentRangeStart w:id="88"/>
       <w:commentRangeStart w:id="89"/>
       <w:commentRangeStart w:id="90"/>
       <w:commentRangeStart w:id="91"/>
+      <w:commentRangeStart w:id="92"/>
       <w:r>
         <w:rPr>
           <w:rFonts w:ascii="Arial" w:hAnsi="Arial" w:cs="Arial"/>
@@ -11003,7 +11014,7 @@
         </w:rPr>
         <w:t xml:space="preserve">Gene Regulatory Changes Underlying Transcriptomic Sex Change </w:t>
       </w:r>
-      <w:commentRangeEnd w:id="88"/>
+      <w:commentRangeEnd w:id="89"/>
       <w:r>
         <w:rPr>
           <w:rStyle w:val="CommentReference"/>
@@ -11013,9 +11024,9 @@
           <w:sz w:val="20"/>
           <w:szCs w:val="20"/>
         </w:rPr>
-        <w:commentReference w:id="88"/>
-      </w:r>
-      <w:commentRangeEnd w:id="89"/>
+        <w:commentReference w:id="89"/>
+      </w:r>
+      <w:commentRangeEnd w:id="90"/>
       <w:r>
         <w:rPr>
           <w:rStyle w:val="CommentReference"/>
@@ -11025,9 +11036,9 @@
           <w:sz w:val="20"/>
           <w:szCs w:val="20"/>
         </w:rPr>
-        <w:commentReference w:id="89"/>
-      </w:r>
-      <w:commentRangeEnd w:id="90"/>
+        <w:commentReference w:id="90"/>
+      </w:r>
+      <w:commentRangeEnd w:id="91"/>
       <w:r>
         <w:rPr>
           <w:rStyle w:val="CommentReference"/>
@@ -11037,9 +11048,9 @@
           <w:sz w:val="20"/>
           <w:szCs w:val="20"/>
         </w:rPr>
-        <w:commentReference w:id="90"/>
-      </w:r>
-      <w:commentRangeEnd w:id="91"/>
+        <w:commentReference w:id="91"/>
+      </w:r>
+      <w:commentRangeEnd w:id="92"/>
       <w:r>
         <w:rPr>
           <w:rStyle w:val="CommentReference"/>
@@ -11049,7 +11060,7 @@
           <w:sz w:val="20"/>
           <w:szCs w:val="20"/>
         </w:rPr>
-        <w:commentReference w:id="91"/>
+        <w:commentReference w:id="92"/>
       </w:r>
     </w:p>
     <w:p>
@@ -11069,7 +11080,7 @@
         </w:rPr>
         <w:t>Given the transcriptional changes in 1_</w:t>
       </w:r>
-      <w:commentRangeStart w:id="92"/>
+      <w:commentRangeStart w:id="93"/>
       <w:r>
         <w:rPr>
           <w:rFonts w:ascii="Arial" w:hAnsi="Arial" w:cs="Arial"/>
@@ -11078,7 +11089,7 @@
         </w:rPr>
         <w:t xml:space="preserve">RGC </w:t>
       </w:r>
-      <w:commentRangeEnd w:id="92"/>
+      <w:commentRangeEnd w:id="93"/>
       <w:r>
         <w:rPr>
           <w:rStyle w:val="CommentReference"/>
@@ -11086,7 +11097,7 @@
           <w:sz w:val="20"/>
           <w:szCs w:val="20"/>
         </w:rPr>
-        <w:commentReference w:id="92"/>
+        <w:commentReference w:id="93"/>
       </w:r>
       <w:r>
         <w:rPr>
@@ -11774,11 +11785,11 @@
         </w:rPr>
         <w:t>is a particularly interesting component of the 1_</w:t>
       </w:r>
-      <w:commentRangeStart w:id="93"/>
       <w:commentRangeStart w:id="94"/>
       <w:commentRangeStart w:id="95"/>
       <w:commentRangeStart w:id="96"/>
       <w:commentRangeStart w:id="97"/>
+      <w:commentRangeStart w:id="98"/>
       <w:r>
         <w:rPr>
           <w:rFonts w:ascii="Arial" w:hAnsi="Arial" w:cs="Arial"/>
@@ -11787,7 +11798,7 @@
         </w:rPr>
         <w:t xml:space="preserve">RGC </w:t>
       </w:r>
-      <w:commentRangeEnd w:id="93"/>
+      <w:commentRangeEnd w:id="94"/>
       <w:r>
         <w:rPr>
           <w:rStyle w:val="CommentReference"/>
@@ -11795,9 +11806,9 @@
           <w:sz w:val="20"/>
           <w:szCs w:val="20"/>
         </w:rPr>
-        <w:commentReference w:id="93"/>
-      </w:r>
-      <w:commentRangeEnd w:id="94"/>
+        <w:commentReference w:id="94"/>
+      </w:r>
+      <w:commentRangeEnd w:id="95"/>
       <w:r>
         <w:rPr>
           <w:rStyle w:val="CommentReference"/>
@@ -11805,9 +11816,9 @@
           <w:sz w:val="20"/>
           <w:szCs w:val="20"/>
         </w:rPr>
-        <w:commentReference w:id="94"/>
-      </w:r>
-      <w:commentRangeEnd w:id="95"/>
+        <w:commentReference w:id="95"/>
+      </w:r>
+      <w:commentRangeEnd w:id="96"/>
       <w:r>
         <w:rPr>
           <w:rStyle w:val="CommentReference"/>
@@ -11815,9 +11826,9 @@
           <w:sz w:val="20"/>
           <w:szCs w:val="20"/>
         </w:rPr>
-        <w:commentReference w:id="95"/>
-      </w:r>
-      <w:commentRangeEnd w:id="96"/>
+        <w:commentReference w:id="96"/>
+      </w:r>
+      <w:commentRangeEnd w:id="97"/>
       <w:r>
         <w:rPr>
           <w:rStyle w:val="CommentReference"/>
@@ -11825,9 +11836,9 @@
           <w:sz w:val="20"/>
           <w:szCs w:val="20"/>
         </w:rPr>
-        <w:commentReference w:id="96"/>
-      </w:r>
-      <w:commentRangeEnd w:id="97"/>
+        <w:commentReference w:id="97"/>
+      </w:r>
+      <w:commentRangeEnd w:id="98"/>
       <w:r>
         <w:rPr>
           <w:rStyle w:val="CommentReference"/>
@@ -11835,7 +11846,7 @@
           <w:sz w:val="20"/>
           <w:szCs w:val="20"/>
         </w:rPr>
-        <w:commentReference w:id="97"/>
+        <w:commentReference w:id="98"/>
       </w:r>
       <w:r>
         <w:rPr>
@@ -11961,8 +11972,8 @@
         </w:rPr>
         <w:t xml:space="preserve">is transiently downregulated in intermediates, this further supports the idea that 1_RGC in intermediates increases the rate of </w:t>
       </w:r>
-      <w:commentRangeStart w:id="98"/>
       <w:commentRangeStart w:id="99"/>
+      <w:commentRangeStart w:id="100"/>
       <w:r>
         <w:rPr>
           <w:rFonts w:ascii="Arial" w:hAnsi="Arial" w:cs="Arial"/>
@@ -11971,7 +11982,7 @@
         </w:rPr>
         <w:t>neurogenesis</w:t>
       </w:r>
-      <w:commentRangeEnd w:id="98"/>
+      <w:commentRangeEnd w:id="99"/>
       <w:r>
         <w:rPr>
           <w:rStyle w:val="CommentReference"/>
@@ -11979,9 +11990,9 @@
           <w:sz w:val="20"/>
           <w:szCs w:val="20"/>
         </w:rPr>
-        <w:commentReference w:id="98"/>
-      </w:r>
-      <w:commentRangeEnd w:id="99"/>
+        <w:commentReference w:id="99"/>
+      </w:r>
+      <w:commentRangeEnd w:id="100"/>
       <w:r>
         <w:rPr>
           <w:rStyle w:val="CommentReference"/>
@@ -11989,7 +12000,7 @@
           <w:sz w:val="20"/>
           <w:szCs w:val="20"/>
         </w:rPr>
-        <w:commentReference w:id="99"/>
+        <w:commentReference w:id="100"/>
       </w:r>
       <w:r>
         <w:rPr>
@@ -12156,8 +12167,8 @@
         </w:rPr>
         <w:t xml:space="preserve"> was </w:t>
       </w:r>
-      <w:commentRangeStart w:id="100"/>
       <w:commentRangeStart w:id="101"/>
+      <w:commentRangeStart w:id="102"/>
       <w:r>
         <w:rPr>
           <w:rFonts w:ascii="Arial" w:hAnsi="Arial" w:cs="Arial"/>
@@ -12194,7 +12205,7 @@
         </w:rPr>
         <w:t>1</w:t>
       </w:r>
-      <w:commentRangeEnd w:id="100"/>
+      <w:commentRangeEnd w:id="101"/>
       <w:r>
         <w:rPr>
           <w:rStyle w:val="CommentReference"/>
@@ -12202,9 +12213,9 @@
           <w:sz w:val="20"/>
           <w:szCs w:val="20"/>
         </w:rPr>
-        <w:commentReference w:id="100"/>
-      </w:r>
-      <w:commentRangeEnd w:id="101"/>
+        <w:commentReference w:id="101"/>
+      </w:r>
+      <w:commentRangeEnd w:id="102"/>
       <w:r>
         <w:rPr>
           <w:rStyle w:val="CommentReference"/>
@@ -12212,7 +12223,7 @@
           <w:sz w:val="20"/>
           <w:szCs w:val="20"/>
         </w:rPr>
-        <w:commentReference w:id="101"/>
+        <w:commentReference w:id="102"/>
       </w:r>
       <w:r>
         <w:rPr>
@@ -12347,9 +12358,9 @@
         </w:rPr>
         <w:t>The 6_</w:t>
       </w:r>
-      <w:commentRangeStart w:id="102"/>
       <w:commentRangeStart w:id="103"/>
       <w:commentRangeStart w:id="104"/>
+      <w:commentRangeStart w:id="105"/>
       <w:r>
         <w:rPr>
           <w:rFonts w:ascii="Arial" w:hAnsi="Arial" w:cs="Arial"/>
@@ -12358,7 +12369,7 @@
         </w:rPr>
         <w:t>POA</w:t>
       </w:r>
-      <w:commentRangeEnd w:id="102"/>
+      <w:commentRangeEnd w:id="103"/>
       <w:r>
         <w:rPr>
           <w:rStyle w:val="CommentReference"/>
@@ -12366,9 +12377,9 @@
           <w:sz w:val="20"/>
           <w:szCs w:val="20"/>
         </w:rPr>
-        <w:commentReference w:id="102"/>
-      </w:r>
-      <w:commentRangeEnd w:id="103"/>
+        <w:commentReference w:id="103"/>
+      </w:r>
+      <w:commentRangeEnd w:id="104"/>
       <w:r>
         <w:rPr>
           <w:rStyle w:val="CommentReference"/>
@@ -12376,9 +12387,9 @@
           <w:sz w:val="20"/>
           <w:szCs w:val="20"/>
         </w:rPr>
-        <w:commentReference w:id="103"/>
-      </w:r>
-      <w:commentRangeEnd w:id="104"/>
+        <w:commentReference w:id="104"/>
+      </w:r>
+      <w:commentRangeEnd w:id="105"/>
       <w:r>
         <w:rPr>
           <w:rStyle w:val="CommentReference"/>
@@ -12386,7 +12397,7 @@
           <w:sz w:val="20"/>
           <w:szCs w:val="20"/>
         </w:rPr>
-        <w:commentReference w:id="104"/>
+        <w:commentReference w:id="105"/>
       </w:r>
       <w:r>
         <w:rPr>
@@ -12516,8 +12527,8 @@
         </w:rPr>
         <w:t xml:space="preserve"> Similarly, </w:t>
       </w:r>
-      <w:commentRangeStart w:id="105"/>
       <w:commentRangeStart w:id="106"/>
+      <w:commentRangeStart w:id="107"/>
       <w:r>
         <w:rPr>
           <w:rFonts w:ascii="Arial" w:hAnsi="Arial" w:cs="Arial"/>
@@ -12528,7 +12539,7 @@
         </w:rPr>
         <w:t xml:space="preserve">ar </w:t>
       </w:r>
-      <w:commentRangeEnd w:id="105"/>
+      <w:commentRangeEnd w:id="106"/>
       <w:r>
         <w:rPr>
           <w:rStyle w:val="CommentReference"/>
@@ -12536,9 +12547,9 @@
           <w:sz w:val="20"/>
           <w:szCs w:val="20"/>
         </w:rPr>
-        <w:commentReference w:id="105"/>
-      </w:r>
-      <w:commentRangeEnd w:id="106"/>
+        <w:commentReference w:id="106"/>
+      </w:r>
+      <w:commentRangeEnd w:id="107"/>
       <w:r>
         <w:rPr>
           <w:rStyle w:val="CommentReference"/>
@@ -12546,7 +12557,7 @@
           <w:sz w:val="20"/>
           <w:szCs w:val="20"/>
         </w:rPr>
-        <w:commentReference w:id="106"/>
+        <w:commentReference w:id="107"/>
       </w:r>
       <w:r>
         <w:rPr>
@@ -12582,8 +12593,8 @@
         </w:rPr>
         <w:t xml:space="preserve"> </w:t>
       </w:r>
-      <w:commentRangeStart w:id="107"/>
       <w:commentRangeStart w:id="108"/>
+      <w:commentRangeStart w:id="109"/>
       <w:r>
         <w:rPr>
           <w:rFonts w:ascii="Arial" w:hAnsi="Arial" w:cs="Arial"/>
@@ -12602,7 +12613,7 @@
         </w:rPr>
         <w:t xml:space="preserve"> </w:t>
       </w:r>
-      <w:commentRangeEnd w:id="107"/>
+      <w:commentRangeEnd w:id="108"/>
       <w:r>
         <w:rPr>
           <w:rStyle w:val="CommentReference"/>
@@ -12610,9 +12621,9 @@
           <w:sz w:val="20"/>
           <w:szCs w:val="20"/>
         </w:rPr>
-        <w:commentReference w:id="107"/>
-      </w:r>
-      <w:commentRangeEnd w:id="108"/>
+        <w:commentReference w:id="108"/>
+      </w:r>
+      <w:commentRangeEnd w:id="109"/>
       <w:r>
         <w:rPr>
           <w:rStyle w:val="CommentReference"/>
@@ -12620,7 +12631,7 @@
           <w:sz w:val="20"/>
           <w:szCs w:val="20"/>
         </w:rPr>
-        <w:commentReference w:id="108"/>
+        <w:commentReference w:id="109"/>
       </w:r>
       <w:r>
         <w:rPr>
@@ -12689,7 +12700,7 @@
       <w:pPr>
         <w:ind w:firstLine="720"/>
         <w:rPr>
-          <w:ins w:id="109" w:author="Graham, Gabriel J." w:date="2026-09-10T19:09:00Z" w16du:dateUtc="2026-09-10T23:09:00Z"/>
+          <w:ins w:id="110" w:author="Graham, Gabriel J." w:date="2026-09-10T19:09:00Z" w16du:dateUtc="2026-09-10T23:09:00Z"/>
           <w:rFonts w:ascii="Arial" w:hAnsi="Arial" w:cs="Arial"/>
           <w:sz w:val="20"/>
           <w:szCs w:val="20"/>
@@ -12787,8 +12798,8 @@
         </w:rPr>
         <w:t xml:space="preserve">. </w:t>
       </w:r>
-      <w:commentRangeStart w:id="110"/>
       <w:commentRangeStart w:id="111"/>
+      <w:commentRangeStart w:id="112"/>
       <w:r>
         <w:rPr>
           <w:rFonts w:ascii="Arial" w:hAnsi="Arial" w:cs="Arial"/>
@@ -12847,7 +12858,7 @@
         </w:rPr>
         <w:t xml:space="preserve"> represent coordinated components of the transcriptional remodeling associated with sex change.</w:t>
       </w:r>
-      <w:commentRangeEnd w:id="110"/>
+      <w:commentRangeEnd w:id="111"/>
       <w:r>
         <w:rPr>
           <w:rStyle w:val="CommentReference"/>
@@ -12855,9 +12866,9 @@
           <w:sz w:val="20"/>
           <w:szCs w:val="20"/>
         </w:rPr>
-        <w:commentReference w:id="110"/>
-      </w:r>
-      <w:commentRangeEnd w:id="111"/>
+        <w:commentReference w:id="111"/>
+      </w:r>
+      <w:commentRangeEnd w:id="112"/>
       <w:r>
         <w:rPr>
           <w:rStyle w:val="CommentReference"/>
@@ -12865,20 +12876,20 @@
           <w:sz w:val="20"/>
           <w:szCs w:val="20"/>
         </w:rPr>
-        <w:commentReference w:id="111"/>
-      </w:r>
-    </w:p>
-    <w:p>
-      <w:pPr>
-        <w:rPr>
-          <w:ins w:id="112" w:author="Graham, Gabriel J." w:date="2026-09-10T19:10:00Z" w16du:dateUtc="2026-09-10T23:10:00Z"/>
+        <w:commentReference w:id="112"/>
+      </w:r>
+    </w:p>
+    <w:p>
+      <w:pPr>
+        <w:rPr>
+          <w:ins w:id="113" w:author="Graham, Gabriel J." w:date="2026-09-10T19:10:00Z" w16du:dateUtc="2026-09-10T23:10:00Z"/>
           <w:rFonts w:ascii="Arial" w:hAnsi="Arial" w:cs="Arial"/>
           <w:sz w:val="20"/>
           <w:szCs w:val="20"/>
           <w:u w:val="single"/>
         </w:rPr>
       </w:pPr>
-      <w:ins w:id="113" w:author="Graham, Gabriel J." w:date="2026-09-10T19:09:00Z" w16du:dateUtc="2026-09-10T23:09:00Z">
+      <w:ins w:id="114" w:author="Graham, Gabriel J." w:date="2026-09-10T19:09:00Z" w16du:dateUtc="2026-09-10T23:09:00Z">
         <w:r>
           <w:rPr>
             <w:rFonts w:ascii="Arial" w:hAnsi="Arial" w:cs="Arial"/>
@@ -12889,7 +12900,7 @@
           <w:t>S</w:t>
         </w:r>
       </w:ins>
-      <w:ins w:id="114" w:author="Graham, Gabriel J." w:date="2026-09-10T19:10:00Z" w16du:dateUtc="2026-09-10T23:10:00Z">
+      <w:ins w:id="115" w:author="Graham, Gabriel J." w:date="2026-09-10T19:10:00Z" w16du:dateUtc="2026-09-10T23:10:00Z">
         <w:r>
           <w:rPr>
             <w:rFonts w:ascii="Arial" w:hAnsi="Arial" w:cs="Arial"/>
@@ -12900,7 +12911,7 @@
           <w:t xml:space="preserve">ex </w:t>
         </w:r>
       </w:ins>
-      <w:ins w:id="115" w:author="Graham, Gabriel J." w:date="2026-09-10T19:12:00Z" w16du:dateUtc="2026-09-10T23:12:00Z">
+      <w:ins w:id="116" w:author="Graham, Gabriel J." w:date="2026-09-10T19:12:00Z" w16du:dateUtc="2026-09-10T23:12:00Z">
         <w:r>
           <w:rPr>
             <w:rFonts w:ascii="Arial" w:hAnsi="Arial" w:cs="Arial"/>
@@ -12911,7 +12922,7 @@
           <w:t>s</w:t>
         </w:r>
       </w:ins>
-      <w:ins w:id="116" w:author="Graham, Gabriel J." w:date="2026-09-10T19:10:00Z" w16du:dateUtc="2026-09-10T23:10:00Z">
+      <w:ins w:id="117" w:author="Graham, Gabriel J." w:date="2026-09-10T19:10:00Z" w16du:dateUtc="2026-09-10T23:10:00Z">
         <w:r>
           <w:rPr>
             <w:rFonts w:ascii="Arial" w:hAnsi="Arial" w:cs="Arial"/>
@@ -12922,7 +12933,7 @@
           <w:t xml:space="preserve">teroid </w:t>
         </w:r>
       </w:ins>
-      <w:ins w:id="117" w:author="Graham, Gabriel J." w:date="2026-09-10T19:12:00Z" w16du:dateUtc="2026-09-10T23:12:00Z">
+      <w:ins w:id="118" w:author="Graham, Gabriel J." w:date="2026-09-10T19:12:00Z" w16du:dateUtc="2026-09-10T23:12:00Z">
         <w:r>
           <w:rPr>
             <w:rFonts w:ascii="Arial" w:hAnsi="Arial" w:cs="Arial"/>
@@ -12933,7 +12944,7 @@
           <w:t>r</w:t>
         </w:r>
       </w:ins>
-      <w:ins w:id="118" w:author="Graham, Gabriel J." w:date="2026-09-10T19:10:00Z" w16du:dateUtc="2026-09-10T23:10:00Z">
+      <w:ins w:id="119" w:author="Graham, Gabriel J." w:date="2026-09-10T19:10:00Z" w16du:dateUtc="2026-09-10T23:10:00Z">
         <w:r>
           <w:rPr>
             <w:rFonts w:ascii="Arial" w:hAnsi="Arial" w:cs="Arial"/>
@@ -12944,7 +12955,7 @@
           <w:t xml:space="preserve">eceptor </w:t>
         </w:r>
       </w:ins>
-      <w:ins w:id="119" w:author="Graham, Gabriel J." w:date="2026-09-10T19:12:00Z" w16du:dateUtc="2026-09-10T23:12:00Z">
+      <w:ins w:id="120" w:author="Graham, Gabriel J." w:date="2026-09-10T19:12:00Z" w16du:dateUtc="2026-09-10T23:12:00Z">
         <w:r>
           <w:rPr>
             <w:rFonts w:ascii="Arial" w:hAnsi="Arial" w:cs="Arial"/>
@@ -12955,7 +12966,7 @@
           <w:t>a</w:t>
         </w:r>
       </w:ins>
-      <w:ins w:id="120" w:author="Graham, Gabriel J." w:date="2026-09-10T19:10:00Z" w16du:dateUtc="2026-09-10T23:10:00Z">
+      <w:ins w:id="121" w:author="Graham, Gabriel J." w:date="2026-09-10T19:10:00Z" w16du:dateUtc="2026-09-10T23:10:00Z">
         <w:r>
           <w:rPr>
             <w:rFonts w:ascii="Arial" w:hAnsi="Arial" w:cs="Arial"/>
@@ -12966,7 +12977,7 @@
           <w:t xml:space="preserve">ctivity </w:t>
         </w:r>
       </w:ins>
-      <w:ins w:id="121" w:author="Graham, Gabriel J." w:date="2026-09-10T19:12:00Z" w16du:dateUtc="2026-09-10T23:12:00Z">
+      <w:ins w:id="122" w:author="Graham, Gabriel J." w:date="2026-09-10T19:12:00Z" w16du:dateUtc="2026-09-10T23:12:00Z">
         <w:r>
           <w:rPr>
             <w:rFonts w:ascii="Arial" w:hAnsi="Arial" w:cs="Arial"/>
@@ -12977,7 +12988,7 @@
           <w:t>c</w:t>
         </w:r>
       </w:ins>
-      <w:ins w:id="122" w:author="Graham, Gabriel J." w:date="2026-09-10T19:10:00Z" w16du:dateUtc="2026-09-10T23:10:00Z">
+      <w:ins w:id="123" w:author="Graham, Gabriel J." w:date="2026-09-10T19:10:00Z" w16du:dateUtc="2026-09-10T23:10:00Z">
         <w:r>
           <w:rPr>
             <w:rFonts w:ascii="Arial" w:hAnsi="Arial" w:cs="Arial"/>
@@ -12988,7 +12999,7 @@
           <w:t xml:space="preserve">hanges in </w:t>
         </w:r>
       </w:ins>
-      <w:ins w:id="123" w:author="Graham, Gabriel J." w:date="2026-09-10T19:12:00Z" w16du:dateUtc="2026-09-10T23:12:00Z">
+      <w:ins w:id="124" w:author="Graham, Gabriel J." w:date="2026-09-10T19:12:00Z" w16du:dateUtc="2026-09-10T23:12:00Z">
         <w:r>
           <w:rPr>
             <w:rFonts w:ascii="Arial" w:hAnsi="Arial" w:cs="Arial"/>
@@ -12999,7 +13010,7 @@
           <w:t>d</w:t>
         </w:r>
       </w:ins>
-      <w:ins w:id="124" w:author="Graham, Gabriel J." w:date="2026-09-10T19:10:00Z" w16du:dateUtc="2026-09-10T23:10:00Z">
+      <w:ins w:id="125" w:author="Graham, Gabriel J." w:date="2026-09-10T19:10:00Z" w16du:dateUtc="2026-09-10T23:10:00Z">
         <w:r>
           <w:rPr>
             <w:rFonts w:ascii="Arial" w:hAnsi="Arial" w:cs="Arial"/>
@@ -13010,7 +13021,7 @@
           <w:t xml:space="preserve">istinct </w:t>
         </w:r>
       </w:ins>
-      <w:ins w:id="125" w:author="Graham, Gabriel J." w:date="2026-09-10T19:12:00Z" w16du:dateUtc="2026-09-10T23:12:00Z">
+      <w:ins w:id="126" w:author="Graham, Gabriel J." w:date="2026-09-10T19:12:00Z" w16du:dateUtc="2026-09-10T23:12:00Z">
         <w:r>
           <w:rPr>
             <w:rFonts w:ascii="Arial" w:hAnsi="Arial" w:cs="Arial"/>
@@ -13021,7 +13032,7 @@
           <w:t>p</w:t>
         </w:r>
       </w:ins>
-      <w:ins w:id="126" w:author="Graham, Gabriel J." w:date="2026-09-10T19:10:00Z" w16du:dateUtc="2026-09-10T23:10:00Z">
+      <w:ins w:id="127" w:author="Graham, Gabriel J." w:date="2026-09-10T19:10:00Z" w16du:dateUtc="2026-09-10T23:10:00Z">
         <w:r>
           <w:rPr>
             <w:rFonts w:ascii="Arial" w:hAnsi="Arial" w:cs="Arial"/>
@@ -13040,13 +13051,13 @@
           <w:sz w:val="20"/>
           <w:szCs w:val="20"/>
         </w:rPr>
-        <w:pPrChange w:id="127" w:author="Graham, Gabriel J." w:date="2026-09-10T19:10:00Z" w16du:dateUtc="2026-09-10T23:10:00Z">
+        <w:pPrChange w:id="128" w:author="Graham, Gabriel J." w:date="2026-09-10T19:10:00Z" w16du:dateUtc="2026-09-10T23:10:00Z">
           <w:pPr>
             <w:ind w:firstLine="720"/>
           </w:pPr>
         </w:pPrChange>
       </w:pPr>
-      <w:ins w:id="128" w:author="Graham, Gabriel J." w:date="2026-09-10T19:10:00Z" w16du:dateUtc="2026-09-10T23:10:00Z">
+      <w:ins w:id="129" w:author="Graham, Gabriel J." w:date="2026-09-10T19:10:00Z" w16du:dateUtc="2026-09-10T23:10:00Z">
         <w:r>
           <w:rPr>
             <w:rFonts w:ascii="Arial" w:hAnsi="Arial" w:cs="Arial"/>
@@ -13057,7 +13068,7 @@
           <w:t xml:space="preserve">Given </w:t>
         </w:r>
       </w:ins>
-      <w:ins w:id="129" w:author="Graham, Gabriel J." w:date="2026-09-10T19:13:00Z" w16du:dateUtc="2026-09-10T23:13:00Z">
+      <w:ins w:id="130" w:author="Graham, Gabriel J." w:date="2026-09-10T19:13:00Z" w16du:dateUtc="2026-09-10T23:13:00Z">
         <w:r>
           <w:rPr>
             <w:rFonts w:ascii="Arial" w:hAnsi="Arial" w:cs="Arial"/>
@@ -13085,7 +13096,7 @@
           <w:t xml:space="preserve">the sex steroid hormone receptors on neuroplasticity in 6_POA_Mixed, we next asked how </w:t>
         </w:r>
       </w:ins>
-      <w:ins w:id="130" w:author="Graham, Gabriel J." w:date="2026-09-10T19:14:00Z" w16du:dateUtc="2026-09-10T23:14:00Z">
+      <w:ins w:id="131" w:author="Graham, Gabriel J." w:date="2026-09-10T19:14:00Z" w16du:dateUtc="2026-09-10T23:14:00Z">
         <w:r>
           <w:rPr>
             <w:rFonts w:ascii="Arial" w:hAnsi="Arial" w:cs="Arial"/>
@@ -13095,7 +13106,7 @@
           <w:t xml:space="preserve">steroid hormone receptor activity changed in 6_POA_Mixed. </w:t>
         </w:r>
       </w:ins>
-      <w:ins w:id="131" w:author="Graham, Gabriel J." w:date="2026-09-10T19:25:00Z" w16du:dateUtc="2026-09-10T23:25:00Z">
+      <w:ins w:id="132" w:author="Graham, Gabriel J." w:date="2026-09-10T19:25:00Z" w16du:dateUtc="2026-09-10T23:25:00Z">
         <w:r>
           <w:rPr>
             <w:rFonts w:ascii="Arial" w:hAnsi="Arial" w:cs="Arial"/>
@@ -13105,7 +13116,7 @@
           <w:t>To do this</w:t>
         </w:r>
       </w:ins>
-      <w:ins w:id="132" w:author="Graham, Gabriel J." w:date="2026-09-10T19:15:00Z" w16du:dateUtc="2026-09-10T23:15:00Z">
+      <w:ins w:id="133" w:author="Graham, Gabriel J." w:date="2026-09-10T19:15:00Z" w16du:dateUtc="2026-09-10T23:15:00Z">
         <w:r>
           <w:rPr>
             <w:rFonts w:ascii="Arial" w:hAnsi="Arial" w:cs="Arial"/>
@@ -13123,7 +13134,7 @@
         </w:rPr>
         <w:t>SR2B</w:t>
       </w:r>
-      <w:ins w:id="133" w:author="Graham, Gabriel J." w:date="2026-09-10T19:15:00Z" w16du:dateUtc="2026-09-10T23:15:00Z">
+      <w:ins w:id="134" w:author="Graham, Gabriel J." w:date="2026-09-10T19:15:00Z" w16du:dateUtc="2026-09-10T23:15:00Z">
         <w:r>
           <w:rPr>
             <w:rFonts w:ascii="Arial" w:hAnsi="Arial" w:cs="Arial"/>
@@ -13141,7 +13152,7 @@
         </w:rPr>
         <w:t>or</w:t>
       </w:r>
-      <w:ins w:id="134" w:author="Graham, Gabriel J." w:date="2026-09-10T19:15:00Z" w16du:dateUtc="2026-09-10T23:15:00Z">
+      <w:ins w:id="135" w:author="Graham, Gabriel J." w:date="2026-09-10T19:15:00Z" w16du:dateUtc="2026-09-10T23:15:00Z">
         <w:r>
           <w:rPr>
             <w:rFonts w:ascii="Arial" w:hAnsi="Arial" w:cs="Arial"/>
@@ -13159,7 +13170,7 @@
         </w:rPr>
         <w:t>GR binding motifs</w:t>
       </w:r>
-      <w:ins w:id="135" w:author="Graham, Gabriel J." w:date="2026-09-10T19:15:00Z" w16du:dateUtc="2026-09-10T23:15:00Z">
+      <w:ins w:id="136" w:author="Graham, Gabriel J." w:date="2026-09-10T19:15:00Z" w16du:dateUtc="2026-09-10T23:15:00Z">
         <w:r>
           <w:rPr>
             <w:rFonts w:ascii="Arial" w:hAnsi="Arial" w:cs="Arial"/>
@@ -13169,7 +13180,7 @@
           <w:t>. Unlike in 1_RGC, which showed no change in steroidogenic signaling</w:t>
         </w:r>
       </w:ins>
-      <w:ins w:id="136" w:author="Graham, Gabriel J." w:date="2026-09-10T19:16:00Z" w16du:dateUtc="2026-09-10T23:16:00Z">
+      <w:ins w:id="137" w:author="Graham, Gabriel J." w:date="2026-09-10T19:16:00Z" w16du:dateUtc="2026-09-10T23:16:00Z">
         <w:r>
           <w:rPr>
             <w:rFonts w:ascii="Arial" w:hAnsi="Arial" w:cs="Arial"/>
@@ -13184,7 +13195,7 @@
             <w:sz w:val="20"/>
             <w:szCs w:val="20"/>
             <w:highlight w:val="yellow"/>
-            <w:rPrChange w:id="137" w:author="Graham, Gabriel J." w:date="2026-09-10T19:16:00Z" w16du:dateUtc="2026-09-10T23:16:00Z">
+            <w:rPrChange w:id="138" w:author="Graham, Gabriel J." w:date="2026-09-10T19:16:00Z" w16du:dateUtc="2026-09-10T23:16:00Z">
               <w:rPr>
                 <w:rFonts w:ascii="Arial" w:hAnsi="Arial" w:cs="Arial"/>
                 <w:sz w:val="20"/>
@@ -13204,14 +13215,14 @@
         </w:rPr>
         <w:t>.</w:t>
       </w:r>
-      <w:ins w:id="138" w:author="Graham, Gabriel J." w:date="2026-09-10T19:16:00Z" w16du:dateUtc="2026-09-10T23:16:00Z">
+      <w:ins w:id="139" w:author="Graham, Gabriel J." w:date="2026-09-10T19:16:00Z" w16du:dateUtc="2026-09-10T23:16:00Z">
         <w:r>
           <w:rPr>
             <w:rFonts w:ascii="Arial" w:hAnsi="Arial" w:cs="Arial"/>
             <w:sz w:val="20"/>
             <w:szCs w:val="20"/>
             <w:highlight w:val="yellow"/>
-            <w:rPrChange w:id="139" w:author="Graham, Gabriel J." w:date="2026-09-10T19:16:00Z" w16du:dateUtc="2026-09-10T23:16:00Z">
+            <w:rPrChange w:id="140" w:author="Graham, Gabriel J." w:date="2026-09-10T19:16:00Z" w16du:dateUtc="2026-09-10T23:16:00Z">
               <w:rPr>
                 <w:rFonts w:ascii="Arial" w:hAnsi="Arial" w:cs="Arial"/>
                 <w:sz w:val="20"/>
@@ -13231,7 +13242,7 @@
         </w:rPr>
         <w:t>6 D-F</w:t>
       </w:r>
-      <w:ins w:id="140" w:author="Graham, Gabriel J." w:date="2026-09-10T19:16:00Z" w16du:dateUtc="2026-09-10T23:16:00Z">
+      <w:ins w:id="141" w:author="Graham, Gabriel J." w:date="2026-09-10T19:16:00Z" w16du:dateUtc="2026-09-10T23:16:00Z">
         <w:r>
           <w:rPr>
             <w:rFonts w:ascii="Arial" w:hAnsi="Arial" w:cs="Arial"/>
@@ -13241,7 +13252,7 @@
           <w:t xml:space="preserve">). </w:t>
         </w:r>
       </w:ins>
-      <w:ins w:id="141" w:author="Graham, Gabriel J." w:date="2026-09-10T19:17:00Z" w16du:dateUtc="2026-09-10T23:17:00Z">
+      <w:ins w:id="142" w:author="Graham, Gabriel J." w:date="2026-09-10T19:17:00Z" w16du:dateUtc="2026-09-10T23:17:00Z">
         <w:r>
           <w:rPr>
             <w:rFonts w:ascii="Arial" w:hAnsi="Arial" w:cs="Arial"/>
@@ -13251,7 +13262,7 @@
           <w:t>Interestingly</w:t>
         </w:r>
       </w:ins>
-      <w:ins w:id="142" w:author="Graham, Gabriel J." w:date="2026-09-10T19:23:00Z" w16du:dateUtc="2026-09-10T23:23:00Z">
+      <w:ins w:id="143" w:author="Graham, Gabriel J." w:date="2026-09-10T19:23:00Z" w16du:dateUtc="2026-09-10T23:23:00Z">
         <w:r>
           <w:rPr>
             <w:rFonts w:ascii="Arial" w:hAnsi="Arial" w:cs="Arial"/>
@@ -13279,7 +13290,7 @@
           <w:t xml:space="preserve"> expression in 1_RGC</w:t>
         </w:r>
       </w:ins>
-      <w:ins w:id="143" w:author="Graham, Gabriel J." w:date="2026-09-10T19:17:00Z" w16du:dateUtc="2026-09-10T23:17:00Z">
+      <w:ins w:id="144" w:author="Graham, Gabriel J." w:date="2026-09-10T19:17:00Z" w16du:dateUtc="2026-09-10T23:17:00Z">
         <w:r>
           <w:rPr>
             <w:rFonts w:ascii="Arial" w:hAnsi="Arial" w:cs="Arial"/>
@@ -13289,7 +13300,7 @@
           <w:t>,</w:t>
         </w:r>
       </w:ins>
-      <w:ins w:id="144" w:author="Graham, Gabriel J." w:date="2026-09-10T19:23:00Z" w16du:dateUtc="2026-09-10T23:23:00Z">
+      <w:ins w:id="145" w:author="Graham, Gabriel J." w:date="2026-09-10T19:23:00Z" w16du:dateUtc="2026-09-10T23:23:00Z">
         <w:r>
           <w:rPr>
             <w:rFonts w:ascii="Arial" w:hAnsi="Arial" w:cs="Arial"/>
@@ -13299,7 +13310,7 @@
           <w:t xml:space="preserve"> we found a significant increase in transcription</w:t>
         </w:r>
       </w:ins>
-      <w:ins w:id="145" w:author="Graham, Gabriel J." w:date="2026-09-10T19:25:00Z" w16du:dateUtc="2026-09-10T23:25:00Z">
+      <w:ins w:id="146" w:author="Graham, Gabriel J." w:date="2026-09-10T19:25:00Z" w16du:dateUtc="2026-09-10T23:25:00Z">
         <w:r>
           <w:rPr>
             <w:rFonts w:ascii="Arial" w:hAnsi="Arial" w:cs="Arial"/>
@@ -13317,7 +13328,7 @@
         </w:rPr>
         <w:t>ESR2B</w:t>
       </w:r>
-      <w:ins w:id="146" w:author="Graham, Gabriel J." w:date="2026-09-10T19:25:00Z" w16du:dateUtc="2026-09-10T23:25:00Z">
+      <w:ins w:id="147" w:author="Graham, Gabriel J." w:date="2026-09-10T19:25:00Z" w16du:dateUtc="2026-09-10T23:25:00Z">
         <w:r>
           <w:rPr>
             <w:rFonts w:ascii="Arial" w:hAnsi="Arial" w:cs="Arial"/>
@@ -13327,7 +13338,7 @@
           <w:t>+ and AR+ genes</w:t>
         </w:r>
       </w:ins>
-      <w:ins w:id="147" w:author="Graham, Gabriel J." w:date="2026-09-10T19:23:00Z" w16du:dateUtc="2026-09-10T23:23:00Z">
+      <w:ins w:id="148" w:author="Graham, Gabriel J." w:date="2026-09-10T19:23:00Z" w16du:dateUtc="2026-09-10T23:23:00Z">
         <w:r>
           <w:rPr>
             <w:rFonts w:ascii="Arial" w:hAnsi="Arial" w:cs="Arial"/>
@@ -13337,7 +13348,7 @@
           <w:t xml:space="preserve"> </w:t>
         </w:r>
       </w:ins>
-      <w:ins w:id="148" w:author="Graham, Gabriel J." w:date="2026-09-10T19:26:00Z" w16du:dateUtc="2026-09-10T23:26:00Z">
+      <w:ins w:id="149" w:author="Graham, Gabriel J." w:date="2026-09-10T19:26:00Z" w16du:dateUtc="2026-09-10T23:26:00Z">
         <w:r>
           <w:rPr>
             <w:rFonts w:ascii="Arial" w:hAnsi="Arial" w:cs="Arial"/>
@@ -13347,7 +13358,7 @@
           <w:t>during</w:t>
         </w:r>
       </w:ins>
-      <w:ins w:id="149" w:author="Graham, Gabriel J." w:date="2026-09-10T19:23:00Z" w16du:dateUtc="2026-09-10T23:23:00Z">
+      <w:ins w:id="150" w:author="Graham, Gabriel J." w:date="2026-09-10T19:23:00Z" w16du:dateUtc="2026-09-10T23:23:00Z">
         <w:r>
           <w:rPr>
             <w:rFonts w:ascii="Arial" w:hAnsi="Arial" w:cs="Arial"/>
@@ -13357,7 +13368,7 @@
           <w:t xml:space="preserve"> the intermediate</w:t>
         </w:r>
       </w:ins>
-      <w:ins w:id="150" w:author="Graham, Gabriel J." w:date="2026-09-10T19:25:00Z" w16du:dateUtc="2026-09-10T23:25:00Z">
+      <w:ins w:id="151" w:author="Graham, Gabriel J." w:date="2026-09-10T19:25:00Z" w16du:dateUtc="2026-09-10T23:25:00Z">
         <w:r>
           <w:rPr>
             <w:rFonts w:ascii="Arial" w:hAnsi="Arial" w:cs="Arial"/>
@@ -13367,7 +13378,7 @@
           <w:t>-female transi</w:t>
         </w:r>
       </w:ins>
-      <w:ins w:id="151" w:author="Graham, Gabriel J." w:date="2026-09-10T19:26:00Z" w16du:dateUtc="2026-09-10T23:26:00Z">
+      <w:ins w:id="152" w:author="Graham, Gabriel J." w:date="2026-09-10T19:26:00Z" w16du:dateUtc="2026-09-10T23:26:00Z">
         <w:r>
           <w:rPr>
             <w:rFonts w:ascii="Arial" w:hAnsi="Arial" w:cs="Arial"/>
@@ -13377,7 +13388,7 @@
           <w:t>tion</w:t>
         </w:r>
       </w:ins>
-      <w:ins w:id="152" w:author="Graham, Gabriel J." w:date="2026-09-10T19:18:00Z" w16du:dateUtc="2026-09-10T23:18:00Z">
+      <w:ins w:id="153" w:author="Graham, Gabriel J." w:date="2026-09-10T19:18:00Z" w16du:dateUtc="2026-09-10T23:18:00Z">
         <w:r>
           <w:rPr>
             <w:rFonts w:ascii="Arial" w:hAnsi="Arial" w:cs="Arial"/>
@@ -13387,7 +13398,7 @@
           <w:t>.</w:t>
         </w:r>
       </w:ins>
-      <w:ins w:id="153" w:author="Graham, Gabriel J." w:date="2026-09-10T19:23:00Z" w16du:dateUtc="2026-09-10T23:23:00Z">
+      <w:ins w:id="154" w:author="Graham, Gabriel J." w:date="2026-09-10T19:23:00Z" w16du:dateUtc="2026-09-10T23:23:00Z">
         <w:r>
           <w:rPr>
             <w:rFonts w:ascii="Arial" w:hAnsi="Arial" w:cs="Arial"/>
@@ -13397,7 +13408,7 @@
           <w:t xml:space="preserve"> Thi</w:t>
         </w:r>
       </w:ins>
-      <w:ins w:id="154" w:author="Graham, Gabriel J." w:date="2026-09-10T19:24:00Z" w16du:dateUtc="2026-09-10T23:24:00Z">
+      <w:ins w:id="155" w:author="Graham, Gabriel J." w:date="2026-09-10T19:24:00Z" w16du:dateUtc="2026-09-10T23:24:00Z">
         <w:r>
           <w:rPr>
             <w:rFonts w:ascii="Arial" w:hAnsi="Arial" w:cs="Arial"/>
@@ -13407,7 +13418,7 @@
           <w:t>s suggests</w:t>
         </w:r>
       </w:ins>
-      <w:ins w:id="155" w:author="Graham, Gabriel J." w:date="2026-09-10T19:26:00Z" w16du:dateUtc="2026-09-10T23:26:00Z">
+      <w:ins w:id="156" w:author="Graham, Gabriel J." w:date="2026-09-10T19:26:00Z" w16du:dateUtc="2026-09-10T23:26:00Z">
         <w:r>
           <w:rPr>
             <w:rFonts w:ascii="Arial" w:hAnsi="Arial" w:cs="Arial"/>
@@ -13435,7 +13446,7 @@
           <w:t xml:space="preserve"> does not reflect the full estrogenic state of the POA during sex change.</w:t>
         </w:r>
       </w:ins>
-      <w:ins w:id="156" w:author="Graham, Gabriel J." w:date="2026-09-10T19:18:00Z" w16du:dateUtc="2026-09-10T23:18:00Z">
+      <w:ins w:id="157" w:author="Graham, Gabriel J." w:date="2026-09-10T19:18:00Z" w16du:dateUtc="2026-09-10T23:18:00Z">
         <w:r>
           <w:rPr>
             <w:rFonts w:ascii="Arial" w:hAnsi="Arial" w:cs="Arial"/>
@@ -13453,7 +13464,7 @@
         </w:rPr>
         <w:t>G</w:t>
       </w:r>
-      <w:ins w:id="157" w:author="Graham, Gabriel J." w:date="2026-09-10T19:18:00Z" w16du:dateUtc="2026-09-10T23:18:00Z">
+      <w:ins w:id="158" w:author="Graham, Gabriel J." w:date="2026-09-10T19:18:00Z" w16du:dateUtc="2026-09-10T23:18:00Z">
         <w:r>
           <w:rPr>
             <w:rFonts w:ascii="Arial" w:hAnsi="Arial" w:cs="Arial"/>
@@ -13471,7 +13482,7 @@
         </w:rPr>
         <w:t>+</w:t>
       </w:r>
-      <w:ins w:id="158" w:author="Graham, Gabriel J." w:date="2026-09-10T19:18:00Z" w16du:dateUtc="2026-09-10T23:18:00Z">
+      <w:ins w:id="159" w:author="Graham, Gabriel J." w:date="2026-09-10T19:18:00Z" w16du:dateUtc="2026-09-10T23:18:00Z">
         <w:r>
           <w:rPr>
             <w:rFonts w:ascii="Arial" w:hAnsi="Arial" w:cs="Arial"/>
@@ -13481,7 +13492,7 @@
           <w:t xml:space="preserve"> genes there was a significant downregulation during the male-intermediate transition</w:t>
         </w:r>
       </w:ins>
-      <w:ins w:id="159" w:author="Graham, Gabriel J." w:date="2026-09-10T19:20:00Z" w16du:dateUtc="2026-09-10T23:20:00Z">
+      <w:ins w:id="160" w:author="Graham, Gabriel J." w:date="2026-09-10T19:20:00Z" w16du:dateUtc="2026-09-10T23:20:00Z">
         <w:r>
           <w:rPr>
             <w:rFonts w:ascii="Arial" w:hAnsi="Arial" w:cs="Arial"/>
@@ -13491,7 +13502,7 @@
           <w:t xml:space="preserve"> before a return to baseline levels in females.</w:t>
         </w:r>
       </w:ins>
-      <w:ins w:id="160" w:author="Graham, Gabriel J." w:date="2026-09-10T19:21:00Z" w16du:dateUtc="2026-09-10T23:21:00Z">
+      <w:ins w:id="161" w:author="Graham, Gabriel J." w:date="2026-09-10T19:21:00Z" w16du:dateUtc="2026-09-10T23:21:00Z">
         <w:r>
           <w:rPr>
             <w:rFonts w:ascii="Arial" w:hAnsi="Arial" w:cs="Arial"/>
@@ -13510,14 +13521,14 @@
         </w:rPr>
         <w:t>Xx Justin</w:t>
       </w:r>
-      <w:ins w:id="161" w:author="Graham, Gabriel J." w:date="2026-09-10T19:21:00Z" w16du:dateUtc="2026-09-10T23:21:00Z">
+      <w:ins w:id="162" w:author="Graham, Gabriel J." w:date="2026-09-10T19:21:00Z" w16du:dateUtc="2026-09-10T23:21:00Z">
         <w:r>
           <w:rPr>
             <w:rFonts w:ascii="Arial" w:hAnsi="Arial" w:cs="Arial"/>
             <w:sz w:val="20"/>
             <w:szCs w:val="20"/>
             <w:highlight w:val="yellow"/>
-            <w:rPrChange w:id="162" w:author="Graham, Gabriel J." w:date="2026-09-10T19:21:00Z" w16du:dateUtc="2026-09-10T23:21:00Z">
+            <w:rPrChange w:id="163" w:author="Graham, Gabriel J." w:date="2026-09-10T19:21:00Z" w16du:dateUtc="2026-09-10T23:21:00Z">
               <w:rPr>
                 <w:rFonts w:ascii="Arial" w:hAnsi="Arial" w:cs="Arial"/>
                 <w:sz w:val="20"/>
@@ -13533,7 +13544,7 @@
             <w:sz w:val="20"/>
             <w:szCs w:val="20"/>
             <w:highlight w:val="yellow"/>
-            <w:rPrChange w:id="163" w:author="Graham, Gabriel J." w:date="2026-09-10T19:24:00Z" w16du:dateUtc="2026-09-10T23:24:00Z">
+            <w:rPrChange w:id="164" w:author="Graham, Gabriel J." w:date="2026-09-10T19:24:00Z" w16du:dateUtc="2026-09-10T23:24:00Z">
               <w:rPr>
                 <w:rFonts w:ascii="Arial" w:hAnsi="Arial" w:cs="Arial"/>
                 <w:sz w:val="20"/>
@@ -13544,14 +13555,14 @@
           <w:t>here</w:t>
         </w:r>
       </w:ins>
-      <w:ins w:id="164" w:author="Graham, Gabriel J." w:date="2026-09-10T19:24:00Z" w16du:dateUtc="2026-09-10T23:24:00Z">
+      <w:ins w:id="165" w:author="Graham, Gabriel J." w:date="2026-09-10T19:24:00Z" w16du:dateUtc="2026-09-10T23:24:00Z">
         <w:r>
           <w:rPr>
             <w:rFonts w:ascii="Arial" w:hAnsi="Arial" w:cs="Arial"/>
             <w:sz w:val="20"/>
             <w:szCs w:val="20"/>
             <w:highlight w:val="yellow"/>
-            <w:rPrChange w:id="165" w:author="Graham, Gabriel J." w:date="2026-09-10T19:24:00Z" w16du:dateUtc="2026-09-10T23:24:00Z">
+            <w:rPrChange w:id="166" w:author="Graham, Gabriel J." w:date="2026-09-10T19:24:00Z" w16du:dateUtc="2026-09-10T23:24:00Z">
               <w:rPr>
                 <w:rFonts w:ascii="Arial" w:hAnsi="Arial" w:cs="Arial"/>
                 <w:sz w:val="20"/>
@@ -13576,7 +13587,7 @@
     <w:p>
       <w:pPr>
         <w:rPr>
-          <w:del w:id="166" w:author="Graham, Gabriel J." w:date="2026-09-10T19:12:00Z" w16du:dateUtc="2026-09-10T23:12:00Z"/>
+          <w:del w:id="167" w:author="Graham, Gabriel J." w:date="2026-09-10T19:12:00Z" w16du:dateUtc="2026-09-10T23:12:00Z"/>
           <w:rFonts w:ascii="Arial" w:hAnsi="Arial" w:cs="Arial"/>
           <w:b/>
           <w:bCs/>
@@ -13584,9 +13595,9 @@
           <w:szCs w:val="20"/>
         </w:rPr>
       </w:pPr>
-      <w:commentRangeStart w:id="167"/>
       <w:commentRangeStart w:id="168"/>
       <w:commentRangeStart w:id="169"/>
+      <w:commentRangeStart w:id="170"/>
       <w:r>
         <w:rPr>
           <w:rFonts w:ascii="Arial" w:hAnsi="Arial" w:cs="Arial"/>
@@ -13597,7 +13608,7 @@
         </w:rPr>
         <w:t>Discussion</w:t>
       </w:r>
-      <w:commentRangeEnd w:id="169"/>
+      <w:commentRangeEnd w:id="170"/>
       <w:r>
         <w:rPr>
           <w:rStyle w:val="CommentReference"/>
@@ -13607,9 +13618,9 @@
           <w:sz w:val="20"/>
           <w:szCs w:val="20"/>
         </w:rPr>
-        <w:commentReference w:id="169"/>
-      </w:r>
-      <w:commentRangeEnd w:id="167"/>
+        <w:commentReference w:id="170"/>
+      </w:r>
+      <w:commentRangeEnd w:id="168"/>
       <w:r>
         <w:rPr>
           <w:rStyle w:val="CommentReference"/>
@@ -13619,9 +13630,9 @@
           <w:sz w:val="20"/>
           <w:szCs w:val="20"/>
         </w:rPr>
-        <w:commentReference w:id="167"/>
-      </w:r>
-      <w:commentRangeEnd w:id="168"/>
+        <w:commentReference w:id="168"/>
+      </w:r>
+      <w:commentRangeEnd w:id="169"/>
       <w:r>
         <w:rPr>
           <w:rStyle w:val="CommentReference"/>
@@ -13631,7 +13642,7 @@
           <w:sz w:val="20"/>
           <w:szCs w:val="20"/>
         </w:rPr>
-        <w:commentReference w:id="168"/>
+        <w:commentReference w:id="169"/>
       </w:r>
     </w:p>
     <w:p>
@@ -13662,7 +13673,7 @@
         </w:rPr>
         <w:t xml:space="preserve">Here, we combine single-nucleus multiomics with spatial transcriptomics, behavior, sex steroid hormone measures, and gonadal </w:t>
       </w:r>
-      <w:del w:id="170" w:author="Rhodes, Justin S" w:date="2026-09-03T07:44:00Z" w16du:dateUtc="2026-09-03T12:44:00Z">
+      <w:del w:id="171" w:author="Rhodes, Justin S" w:date="2026-09-03T07:44:00Z" w16du:dateUtc="2026-09-03T12:44:00Z">
         <w:r>
           <w:rPr>
             <w:rFonts w:ascii="Arial" w:hAnsi="Arial" w:cs="Arial"/>
@@ -13672,7 +13683,7 @@
           <w:delText xml:space="preserve">physiology </w:delText>
         </w:r>
       </w:del>
-      <w:ins w:id="171" w:author="Rhodes, Justin S" w:date="2026-09-03T07:44:00Z" w16du:dateUtc="2026-09-03T12:44:00Z">
+      <w:ins w:id="172" w:author="Rhodes, Justin S" w:date="2026-09-03T07:44:00Z" w16du:dateUtc="2026-09-03T12:44:00Z">
         <w:r>
           <w:rPr>
             <w:rFonts w:ascii="Arial" w:hAnsi="Arial" w:cs="Arial"/>
@@ -13690,7 +13701,7 @@
         </w:rPr>
         <w:t xml:space="preserve">to document the neural substrates of protandrous sex change at the highest resolution to date. We show that sex change in the brain is an asynchronous process with some cell types changing sex early in the process prior to gonadal transformation, while others change sex later only after the gonads have changed. Our analyses identify RGCs and </w:t>
       </w:r>
-      <w:del w:id="172" w:author="Rhodes, Justin S" w:date="2026-09-03T07:44:00Z" w16du:dateUtc="2026-09-03T12:44:00Z">
+      <w:del w:id="173" w:author="Rhodes, Justin S" w:date="2026-09-03T07:44:00Z" w16du:dateUtc="2026-09-03T12:44:00Z">
         <w:r>
           <w:rPr>
             <w:rFonts w:ascii="Arial" w:hAnsi="Arial" w:cs="Arial"/>
@@ -13716,7 +13727,7 @@
         </w:rPr>
         <w:t>neurons</w:t>
       </w:r>
-      <w:ins w:id="173" w:author="Rhodes, Justin S" w:date="2026-09-03T07:44:00Z" w16du:dateUtc="2026-09-03T12:44:00Z">
+      <w:ins w:id="174" w:author="Rhodes, Justin S" w:date="2026-09-03T07:44:00Z" w16du:dateUtc="2026-09-03T12:44:00Z">
         <w:r>
           <w:rPr>
             <w:rFonts w:ascii="Arial" w:hAnsi="Arial" w:cs="Arial"/>
@@ -13750,7 +13761,7 @@
         </w:rPr>
         <w:t xml:space="preserve"> show </w:t>
       </w:r>
-      <w:del w:id="174" w:author="Rhodes, Justin S" w:date="2026-09-03T07:45:00Z" w16du:dateUtc="2026-09-03T12:45:00Z">
+      <w:del w:id="175" w:author="Rhodes, Justin S" w:date="2026-09-03T07:45:00Z" w16du:dateUtc="2026-09-03T12:45:00Z">
         <w:r>
           <w:rPr>
             <w:rFonts w:ascii="Arial" w:hAnsi="Arial" w:cs="Arial"/>
@@ -13760,7 +13771,7 @@
           <w:delText>that they are highly</w:delText>
         </w:r>
       </w:del>
-      <w:ins w:id="175" w:author="Rhodes, Justin S" w:date="2026-09-03T07:45:00Z" w16du:dateUtc="2026-09-03T12:45:00Z">
+      <w:ins w:id="176" w:author="Rhodes, Justin S" w:date="2026-09-03T07:45:00Z" w16du:dateUtc="2026-09-03T12:45:00Z">
         <w:r>
           <w:rPr>
             <w:rFonts w:ascii="Arial" w:hAnsi="Arial" w:cs="Arial"/>
@@ -13778,7 +13789,7 @@
         </w:rPr>
         <w:t xml:space="preserve"> coordinated during </w:t>
       </w:r>
-      <w:del w:id="176" w:author="Rhodes, Justin S" w:date="2026-09-03T07:45:00Z" w16du:dateUtc="2026-09-03T12:45:00Z">
+      <w:del w:id="177" w:author="Rhodes, Justin S" w:date="2026-09-03T07:45:00Z" w16du:dateUtc="2026-09-03T12:45:00Z">
         <w:r>
           <w:rPr>
             <w:rFonts w:ascii="Arial" w:hAnsi="Arial" w:cs="Arial"/>
@@ -13788,7 +13799,7 @@
           <w:delText xml:space="preserve">this </w:delText>
         </w:r>
       </w:del>
-      <w:ins w:id="177" w:author="Rhodes, Justin S" w:date="2026-09-03T07:45:00Z" w16du:dateUtc="2026-09-03T12:45:00Z">
+      <w:ins w:id="178" w:author="Rhodes, Justin S" w:date="2026-09-03T07:45:00Z" w16du:dateUtc="2026-09-03T12:45:00Z">
         <w:r>
           <w:rPr>
             <w:rFonts w:ascii="Arial" w:hAnsi="Arial" w:cs="Arial"/>
@@ -13806,7 +13817,7 @@
         </w:rPr>
         <w:t xml:space="preserve">process. This work provides a novel mechanistic framework </w:t>
       </w:r>
-      <w:del w:id="178" w:author="Rhodes, Justin S" w:date="2026-09-03T07:45:00Z" w16du:dateUtc="2026-09-03T12:45:00Z">
+      <w:del w:id="179" w:author="Rhodes, Justin S" w:date="2026-09-03T07:45:00Z" w16du:dateUtc="2026-09-03T12:45:00Z">
         <w:r>
           <w:rPr>
             <w:rFonts w:ascii="Arial" w:hAnsi="Arial" w:cs="Arial"/>
@@ -13816,7 +13827,7 @@
           <w:delText xml:space="preserve">by </w:delText>
         </w:r>
       </w:del>
-      <w:ins w:id="179" w:author="Rhodes, Justin S" w:date="2026-09-03T07:45:00Z" w16du:dateUtc="2026-09-03T12:45:00Z">
+      <w:ins w:id="180" w:author="Rhodes, Justin S" w:date="2026-09-03T07:45:00Z" w16du:dateUtc="2026-09-03T12:45:00Z">
         <w:r>
           <w:rPr>
             <w:rFonts w:ascii="Arial" w:hAnsi="Arial" w:cs="Arial"/>
@@ -13852,8 +13863,8 @@
         </w:rPr>
         <w:t xml:space="preserve">Among all cell populations, RGCs underwent the most extensive molecular remodeling during sex change exhibiting the second-highest number of DEGs and the highest number of DARs. Rather than maintaining a male-like state until late in sex change or adopting a female-like state early in sex change, our data indicate that RGCs enter a distinct transitional molecular state in intermediates and are some of the last cells to complete feminization. </w:t>
       </w:r>
-      <w:commentRangeStart w:id="180"/>
       <w:commentRangeStart w:id="181"/>
+      <w:commentRangeStart w:id="182"/>
       <w:r>
         <w:rPr>
           <w:rFonts w:ascii="Arial" w:hAnsi="Arial" w:cs="Arial"/>
@@ -13990,7 +14001,7 @@
         </w:rPr>
         <w:t>. Among these possibilities, the regional specificity revealed by our cell-type-resolved analysis appears the most likely explanation.</w:t>
       </w:r>
-      <w:commentRangeEnd w:id="180"/>
+      <w:commentRangeEnd w:id="181"/>
       <w:r>
         <w:rPr>
           <w:rStyle w:val="CommentReference"/>
@@ -13998,9 +14009,9 @@
           <w:sz w:val="20"/>
           <w:szCs w:val="20"/>
         </w:rPr>
-        <w:commentReference w:id="180"/>
-      </w:r>
-      <w:commentRangeEnd w:id="181"/>
+        <w:commentReference w:id="181"/>
+      </w:r>
+      <w:commentRangeEnd w:id="182"/>
       <w:r>
         <w:rPr>
           <w:rStyle w:val="CommentReference"/>
@@ -14008,7 +14019,7 @@
           <w:sz w:val="20"/>
           <w:szCs w:val="20"/>
         </w:rPr>
-        <w:commentReference w:id="181"/>
+        <w:commentReference w:id="182"/>
       </w:r>
     </w:p>
     <w:p>
@@ -14257,7 +14268,7 @@
         </w:rPr>
         <w:t xml:space="preserve">. </w:t>
       </w:r>
-      <w:ins w:id="182" w:author="Rhodes, Justin S" w:date="2026-09-11T10:29:00Z" w16du:dateUtc="2026-09-11T15:29:00Z">
+      <w:ins w:id="183" w:author="Rhodes, Justin S" w:date="2026-09-11T10:29:00Z" w16du:dateUtc="2026-09-11T15:29:00Z">
         <w:r>
           <w:rPr>
             <w:rFonts w:ascii="Arial" w:hAnsi="Arial" w:cs="Arial"/>
@@ -14273,7 +14284,7 @@
             <w:iCs/>
             <w:sz w:val="20"/>
             <w:szCs w:val="20"/>
-            <w:rPrChange w:id="183" w:author="Rhodes, Justin S" w:date="2026-09-11T10:29:00Z" w16du:dateUtc="2026-09-11T15:29:00Z">
+            <w:rPrChange w:id="184" w:author="Rhodes, Justin S" w:date="2026-09-11T10:29:00Z" w16du:dateUtc="2026-09-11T15:29:00Z">
               <w:rPr>
                 <w:rFonts w:ascii="Arial" w:hAnsi="Arial" w:cs="Arial"/>
                 <w:sz w:val="20"/>
@@ -14292,7 +14303,7 @@
           <w:t xml:space="preserve"> in intermediates was not accompanied by a corresponding reduction in estrogenic signaling in either 1_RGC or 6_POA_Mixed. Instead, ESR2B-associated target gene expression and chromatin accessibility remained relatively stable through the intermediate stage</w:t>
         </w:r>
       </w:ins>
-      <w:ins w:id="184" w:author="Rhodes, Justin S" w:date="2026-09-11T10:30:00Z" w16du:dateUtc="2026-09-11T15:30:00Z">
+      <w:ins w:id="185" w:author="Rhodes, Justin S" w:date="2026-09-11T10:30:00Z" w16du:dateUtc="2026-09-11T15:30:00Z">
         <w:r>
           <w:rPr>
             <w:rFonts w:ascii="Arial" w:hAnsi="Arial" w:cs="Arial"/>
@@ -14302,7 +14313,7 @@
           <w:t>.  It subsequently significantly</w:t>
         </w:r>
       </w:ins>
-      <w:ins w:id="185" w:author="Rhodes, Justin S" w:date="2026-09-11T10:29:00Z" w16du:dateUtc="2026-09-11T15:29:00Z">
+      <w:ins w:id="186" w:author="Rhodes, Justin S" w:date="2026-09-11T10:29:00Z" w16du:dateUtc="2026-09-11T15:29:00Z">
         <w:r>
           <w:rPr>
             <w:rFonts w:ascii="Arial" w:hAnsi="Arial" w:cs="Arial"/>
@@ -14312,7 +14323,7 @@
           <w:t xml:space="preserve"> increased in females, coincident with the large increase in circulating E2</w:t>
         </w:r>
       </w:ins>
-      <w:ins w:id="186" w:author="Rhodes, Justin S" w:date="2026-09-11T10:32:00Z" w16du:dateUtc="2026-09-11T15:32:00Z">
+      <w:ins w:id="187" w:author="Rhodes, Justin S" w:date="2026-09-11T10:32:00Z" w16du:dateUtc="2026-09-11T15:32:00Z">
         <w:r>
           <w:rPr>
             <w:rFonts w:ascii="Arial" w:hAnsi="Arial" w:cs="Arial"/>
@@ -14322,7 +14333,7 @@
           <w:t xml:space="preserve"> previously observed in females</w:t>
         </w:r>
       </w:ins>
-      <w:ins w:id="187" w:author="Rhodes, Justin S" w:date="2026-09-11T10:29:00Z" w16du:dateUtc="2026-09-11T15:29:00Z">
+      <w:ins w:id="188" w:author="Rhodes, Justin S" w:date="2026-09-11T10:29:00Z" w16du:dateUtc="2026-09-11T15:29:00Z">
         <w:r>
           <w:rPr>
             <w:rFonts w:ascii="Arial" w:hAnsi="Arial" w:cs="Arial"/>
@@ -14332,9 +14343,9 @@
           <w:t>. Thus, the transient reduction in brain aromatase appears to be uncoupled from downstream estrogen-responsive transcription, suggesting that estrogen signaling in the brain is reorganized across sex change rather than simply tracking local aromatase expression.</w:t>
         </w:r>
       </w:ins>
-      <w:commentRangeStart w:id="188"/>
-      <w:ins w:id="189" w:author="Graham, Gabriel J." w:date="2026-09-10T19:30:00Z" w16du:dateUtc="2026-09-10T23:30:00Z">
-        <w:del w:id="190" w:author="Rhodes, Justin S" w:date="2026-09-11T10:29:00Z" w16du:dateUtc="2026-09-11T15:29:00Z">
+      <w:commentRangeStart w:id="189"/>
+      <w:ins w:id="190" w:author="Graham, Gabriel J." w:date="2026-09-10T19:30:00Z" w16du:dateUtc="2026-09-10T23:30:00Z">
+        <w:del w:id="191" w:author="Rhodes, Justin S" w:date="2026-09-11T10:29:00Z" w16du:dateUtc="2026-09-11T15:29:00Z">
           <w:r>
             <w:rPr>
               <w:rFonts w:ascii="Arial" w:hAnsi="Arial" w:cs="Arial"/>
@@ -14366,8 +14377,8 @@
           </w:r>
         </w:del>
       </w:ins>
-      <w:ins w:id="191" w:author="Graham, Gabriel J." w:date="2026-09-10T19:31:00Z" w16du:dateUtc="2026-09-10T23:31:00Z">
-        <w:del w:id="192" w:author="Rhodes, Justin S" w:date="2026-09-11T10:29:00Z" w16du:dateUtc="2026-09-11T15:29:00Z">
+      <w:ins w:id="192" w:author="Graham, Gabriel J." w:date="2026-09-10T19:31:00Z" w16du:dateUtc="2026-09-10T23:31:00Z">
+        <w:del w:id="193" w:author="Rhodes, Justin S" w:date="2026-09-11T10:29:00Z" w16du:dateUtc="2026-09-11T15:29:00Z">
           <w:r>
             <w:rPr>
               <w:rFonts w:ascii="Arial" w:hAnsi="Arial" w:cs="Arial"/>
@@ -14379,8 +14390,8 @@
           </w:r>
         </w:del>
       </w:ins>
-      <w:ins w:id="193" w:author="Graham, Gabriel J." w:date="2026-09-10T19:32:00Z" w16du:dateUtc="2026-09-10T23:32:00Z">
-        <w:del w:id="194" w:author="Rhodes, Justin S" w:date="2026-09-11T10:29:00Z" w16du:dateUtc="2026-09-11T15:29:00Z">
+      <w:ins w:id="194" w:author="Graham, Gabriel J." w:date="2026-09-10T19:32:00Z" w16du:dateUtc="2026-09-10T23:32:00Z">
+        <w:del w:id="195" w:author="Rhodes, Justin S" w:date="2026-09-11T10:29:00Z" w16du:dateUtc="2026-09-11T15:29:00Z">
           <w:r>
             <w:rPr>
               <w:rFonts w:ascii="Arial" w:hAnsi="Arial" w:cs="Arial"/>
@@ -14420,7 +14431,7 @@
           <w:t xml:space="preserve"> </w:t>
         </w:r>
       </w:ins>
-      <w:commentRangeEnd w:id="188"/>
+      <w:commentRangeEnd w:id="189"/>
       <w:r>
         <w:rPr>
           <w:rStyle w:val="CommentReference"/>
@@ -14428,26 +14439,26 @@
           <w:sz w:val="20"/>
           <w:szCs w:val="20"/>
         </w:rPr>
-        <w:commentReference w:id="188"/>
+        <w:commentReference w:id="189"/>
       </w:r>
     </w:p>
     <w:p>
       <w:pPr>
         <w:ind w:firstLine="720"/>
         <w:rPr>
-          <w:del w:id="195" w:author="Graham, Gabriel J." w:date="2026-09-10T19:29:00Z" w16du:dateUtc="2026-09-10T23:29:00Z"/>
-          <w:rFonts w:ascii="Arial" w:hAnsi="Arial" w:cs="Arial"/>
-          <w:sz w:val="20"/>
-          <w:szCs w:val="20"/>
-        </w:rPr>
-      </w:pPr>
-      <w:del w:id="196" w:author="Graham, Gabriel J." w:date="2026-09-10T19:29:00Z" w16du:dateUtc="2026-09-10T23:29:00Z">
+          <w:del w:id="196" w:author="Graham, Gabriel J." w:date="2026-09-10T19:29:00Z" w16du:dateUtc="2026-09-10T23:29:00Z"/>
+          <w:rFonts w:ascii="Arial" w:hAnsi="Arial" w:cs="Arial"/>
+          <w:sz w:val="20"/>
+          <w:szCs w:val="20"/>
+        </w:rPr>
+      </w:pPr>
+      <w:del w:id="197" w:author="Graham, Gabriel J." w:date="2026-09-10T19:29:00Z" w16du:dateUtc="2026-09-10T23:29:00Z">
         <w:r>
           <w:rPr>
             <w:rFonts w:ascii="Arial" w:hAnsi="Arial" w:cs="Arial"/>
             <w:sz w:val="20"/>
             <w:szCs w:val="20"/>
-            <w:rPrChange w:id="197" w:author="Graham, Gabriel J." w:date="2026-09-10T19:29:00Z" w16du:dateUtc="2026-09-10T23:29:00Z">
+            <w:rPrChange w:id="198" w:author="Graham, Gabriel J." w:date="2026-09-10T19:29:00Z" w16du:dateUtc="2026-09-10T23:29:00Z">
               <w:rPr>
                 <w:rFonts w:ascii="Arial" w:hAnsi="Arial" w:cs="Arial"/>
                 <w:sz w:val="20"/>
@@ -14458,15 +14469,15 @@
           </w:rPr>
           <w:delText xml:space="preserve">Our GRN analysis provides further evidence that the transitional RGC state is connected with neuroplasticity in the POA. Specifically, the downregulation of brain aromatase production implies a </w:delText>
         </w:r>
-        <w:commentRangeStart w:id="198"/>
         <w:commentRangeStart w:id="199"/>
         <w:commentRangeStart w:id="200"/>
+        <w:commentRangeStart w:id="201"/>
         <w:r>
           <w:rPr>
             <w:rFonts w:ascii="Arial" w:hAnsi="Arial" w:cs="Arial"/>
             <w:sz w:val="20"/>
             <w:szCs w:val="20"/>
-            <w:rPrChange w:id="201" w:author="Graham, Gabriel J." w:date="2026-09-10T19:29:00Z" w16du:dateUtc="2026-09-10T23:29:00Z">
+            <w:rPrChange w:id="202" w:author="Graham, Gabriel J." w:date="2026-09-10T19:29:00Z" w16du:dateUtc="2026-09-10T23:29:00Z">
               <w:rPr>
                 <w:rFonts w:ascii="Arial" w:hAnsi="Arial" w:cs="Arial"/>
                 <w:sz w:val="20"/>
@@ -14476,25 +14487,6 @@
             </w:rPrChange>
           </w:rPr>
           <w:delText>decrease in estrogenic signaling in the brains of intermediates. I</w:delText>
-        </w:r>
-        <w:commentRangeEnd w:id="198"/>
-        <w:r>
-          <w:rPr>
-            <w:rStyle w:val="CommentReference"/>
-            <w:rFonts w:ascii="Arial" w:hAnsi="Arial" w:cs="Arial"/>
-            <w:sz w:val="20"/>
-            <w:szCs w:val="20"/>
-            <w:rPrChange w:id="202" w:author="Graham, Gabriel J." w:date="2026-09-10T19:29:00Z" w16du:dateUtc="2026-09-10T23:29:00Z">
-              <w:rPr>
-                <w:rStyle w:val="CommentReference"/>
-                <w:rFonts w:ascii="Arial" w:hAnsi="Arial" w:cs="Arial"/>
-                <w:sz w:val="20"/>
-                <w:szCs w:val="20"/>
-                <w:highlight w:val="blue"/>
-              </w:rPr>
-            </w:rPrChange>
-          </w:rPr>
-          <w:commentReference w:id="198"/>
         </w:r>
         <w:commentRangeEnd w:id="199"/>
         <w:r>
@@ -14534,12 +14526,31 @@
           </w:rPr>
           <w:commentReference w:id="200"/>
         </w:r>
+        <w:commentRangeEnd w:id="201"/>
+        <w:r>
+          <w:rPr>
+            <w:rStyle w:val="CommentReference"/>
+            <w:rFonts w:ascii="Arial" w:hAnsi="Arial" w:cs="Arial"/>
+            <w:sz w:val="20"/>
+            <w:szCs w:val="20"/>
+            <w:rPrChange w:id="205" w:author="Graham, Gabriel J." w:date="2026-09-10T19:29:00Z" w16du:dateUtc="2026-09-10T23:29:00Z">
+              <w:rPr>
+                <w:rStyle w:val="CommentReference"/>
+                <w:rFonts w:ascii="Arial" w:hAnsi="Arial" w:cs="Arial"/>
+                <w:sz w:val="20"/>
+                <w:szCs w:val="20"/>
+                <w:highlight w:val="blue"/>
+              </w:rPr>
+            </w:rPrChange>
+          </w:rPr>
+          <w:commentReference w:id="201"/>
+        </w:r>
         <w:r>
           <w:rPr>
             <w:rFonts w:ascii="Arial" w:hAnsi="Arial" w:cs="Arial"/>
             <w:sz w:val="20"/>
             <w:szCs w:val="20"/>
-            <w:rPrChange w:id="205" w:author="Graham, Gabriel J." w:date="2026-09-10T19:29:00Z" w16du:dateUtc="2026-09-10T23:29:00Z">
+            <w:rPrChange w:id="206" w:author="Graham, Gabriel J." w:date="2026-09-10T19:29:00Z" w16du:dateUtc="2026-09-10T23:29:00Z">
               <w:rPr>
                 <w:rFonts w:ascii="Arial" w:hAnsi="Arial" w:cs="Arial"/>
                 <w:sz w:val="20"/>
@@ -14550,8 +14561,8 @@
           </w:rPr>
           <w:delText xml:space="preserve">n 6_POA_Mixed, our GRN analysis identified several genes related to neuroplasticity as being under the positive regulation of the estrogen receptor </w:delText>
         </w:r>
-        <w:commentRangeStart w:id="206"/>
         <w:commentRangeStart w:id="207"/>
+        <w:commentRangeStart w:id="208"/>
         <w:r>
           <w:rPr>
             <w:rFonts w:ascii="Arial" w:hAnsi="Arial" w:cs="Arial"/>
@@ -14559,7 +14570,7 @@
             <w:iCs/>
             <w:sz w:val="20"/>
             <w:szCs w:val="20"/>
-            <w:rPrChange w:id="208" w:author="Graham, Gabriel J." w:date="2026-09-10T19:29:00Z" w16du:dateUtc="2026-09-10T23:29:00Z">
+            <w:rPrChange w:id="209" w:author="Graham, Gabriel J." w:date="2026-09-10T19:29:00Z" w16du:dateUtc="2026-09-10T23:29:00Z">
               <w:rPr>
                 <w:rFonts w:ascii="Arial" w:hAnsi="Arial" w:cs="Arial"/>
                 <w:i/>
@@ -14571,25 +14582,6 @@
             </w:rPrChange>
           </w:rPr>
           <w:delText>esr2b</w:delText>
-        </w:r>
-        <w:commentRangeEnd w:id="206"/>
-        <w:r>
-          <w:rPr>
-            <w:rStyle w:val="CommentReference"/>
-            <w:rFonts w:ascii="Arial" w:hAnsi="Arial" w:cs="Arial"/>
-            <w:sz w:val="20"/>
-            <w:szCs w:val="20"/>
-            <w:rPrChange w:id="209" w:author="Graham, Gabriel J." w:date="2026-09-10T19:29:00Z" w16du:dateUtc="2026-09-10T23:29:00Z">
-              <w:rPr>
-                <w:rStyle w:val="CommentReference"/>
-                <w:rFonts w:ascii="Arial" w:hAnsi="Arial" w:cs="Arial"/>
-                <w:sz w:val="20"/>
-                <w:szCs w:val="20"/>
-                <w:highlight w:val="blue"/>
-              </w:rPr>
-            </w:rPrChange>
-          </w:rPr>
-          <w:commentReference w:id="206"/>
         </w:r>
         <w:commentRangeEnd w:id="207"/>
         <w:r>
@@ -14610,12 +14602,31 @@
           </w:rPr>
           <w:commentReference w:id="207"/>
         </w:r>
+        <w:commentRangeEnd w:id="208"/>
+        <w:r>
+          <w:rPr>
+            <w:rStyle w:val="CommentReference"/>
+            <w:rFonts w:ascii="Arial" w:hAnsi="Arial" w:cs="Arial"/>
+            <w:sz w:val="20"/>
+            <w:szCs w:val="20"/>
+            <w:rPrChange w:id="211" w:author="Graham, Gabriel J." w:date="2026-09-10T19:29:00Z" w16du:dateUtc="2026-09-10T23:29:00Z">
+              <w:rPr>
+                <w:rStyle w:val="CommentReference"/>
+                <w:rFonts w:ascii="Arial" w:hAnsi="Arial" w:cs="Arial"/>
+                <w:sz w:val="20"/>
+                <w:szCs w:val="20"/>
+                <w:highlight w:val="blue"/>
+              </w:rPr>
+            </w:rPrChange>
+          </w:rPr>
+          <w:commentReference w:id="208"/>
+        </w:r>
         <w:r>
           <w:rPr>
             <w:rFonts w:ascii="Arial" w:hAnsi="Arial" w:cs="Arial"/>
             <w:sz w:val="20"/>
             <w:szCs w:val="20"/>
-            <w:rPrChange w:id="211" w:author="Graham, Gabriel J." w:date="2026-09-10T19:29:00Z" w16du:dateUtc="2026-09-10T23:29:00Z">
+            <w:rPrChange w:id="212" w:author="Graham, Gabriel J." w:date="2026-09-10T19:29:00Z" w16du:dateUtc="2026-09-10T23:29:00Z">
               <w:rPr>
                 <w:rFonts w:ascii="Arial" w:hAnsi="Arial" w:cs="Arial"/>
                 <w:sz w:val="20"/>
@@ -14626,14 +14637,14 @@
           </w:rPr>
           <w:delText xml:space="preserve">. </w:delText>
         </w:r>
-        <w:commentRangeStart w:id="212"/>
         <w:commentRangeStart w:id="213"/>
+        <w:commentRangeStart w:id="214"/>
         <w:r>
           <w:rPr>
             <w:rFonts w:ascii="Arial" w:hAnsi="Arial" w:cs="Arial"/>
             <w:sz w:val="20"/>
             <w:szCs w:val="20"/>
-            <w:rPrChange w:id="214" w:author="Graham, Gabriel J." w:date="2026-09-10T19:29:00Z" w16du:dateUtc="2026-09-10T23:29:00Z">
+            <w:rPrChange w:id="215" w:author="Graham, Gabriel J." w:date="2026-09-10T19:29:00Z" w16du:dateUtc="2026-09-10T23:29:00Z">
               <w:rPr>
                 <w:rFonts w:ascii="Arial" w:hAnsi="Arial" w:cs="Arial"/>
                 <w:sz w:val="20"/>
@@ -14651,7 +14662,7 @@
             <w:iCs/>
             <w:sz w:val="20"/>
             <w:szCs w:val="20"/>
-            <w:rPrChange w:id="215" w:author="Graham, Gabriel J." w:date="2026-09-10T19:29:00Z" w16du:dateUtc="2026-09-10T23:29:00Z">
+            <w:rPrChange w:id="216" w:author="Graham, Gabriel J." w:date="2026-09-10T19:29:00Z" w16du:dateUtc="2026-09-10T23:29:00Z">
               <w:rPr>
                 <w:rFonts w:ascii="Arial" w:hAnsi="Arial" w:cs="Arial"/>
                 <w:i/>
@@ -14669,7 +14680,7 @@
             <w:rFonts w:ascii="Arial" w:hAnsi="Arial" w:cs="Arial"/>
             <w:sz w:val="20"/>
             <w:szCs w:val="20"/>
-            <w:rPrChange w:id="216" w:author="Graham, Gabriel J." w:date="2026-09-10T19:29:00Z" w16du:dateUtc="2026-09-10T23:29:00Z">
+            <w:rPrChange w:id="217" w:author="Graham, Gabriel J." w:date="2026-09-10T19:29:00Z" w16du:dateUtc="2026-09-10T23:29:00Z">
               <w:rPr>
                 <w:rFonts w:ascii="Arial" w:hAnsi="Arial" w:cs="Arial"/>
                 <w:sz w:val="20"/>
@@ -14687,7 +14698,7 @@
             <w:iCs/>
             <w:sz w:val="20"/>
             <w:szCs w:val="20"/>
-            <w:rPrChange w:id="217" w:author="Graham, Gabriel J." w:date="2026-09-10T19:29:00Z" w16du:dateUtc="2026-09-10T23:29:00Z">
+            <w:rPrChange w:id="218" w:author="Graham, Gabriel J." w:date="2026-09-10T19:29:00Z" w16du:dateUtc="2026-09-10T23:29:00Z">
               <w:rPr>
                 <w:rFonts w:ascii="Arial" w:hAnsi="Arial" w:cs="Arial"/>
                 <w:i/>
@@ -14705,7 +14716,7 @@
             <w:rFonts w:ascii="Arial" w:hAnsi="Arial" w:cs="Arial"/>
             <w:sz w:val="20"/>
             <w:szCs w:val="20"/>
-            <w:rPrChange w:id="218" w:author="Graham, Gabriel J." w:date="2026-09-10T19:29:00Z" w16du:dateUtc="2026-09-10T23:29:00Z">
+            <w:rPrChange w:id="219" w:author="Graham, Gabriel J." w:date="2026-09-10T19:29:00Z" w16du:dateUtc="2026-09-10T23:29:00Z">
               <w:rPr>
                 <w:rFonts w:ascii="Arial" w:hAnsi="Arial" w:cs="Arial"/>
                 <w:sz w:val="20"/>
@@ -14723,7 +14734,7 @@
             <w:iCs/>
             <w:sz w:val="20"/>
             <w:szCs w:val="20"/>
-            <w:rPrChange w:id="219" w:author="Graham, Gabriel J." w:date="2026-09-10T19:29:00Z" w16du:dateUtc="2026-09-10T23:29:00Z">
+            <w:rPrChange w:id="220" w:author="Graham, Gabriel J." w:date="2026-09-10T19:29:00Z" w16du:dateUtc="2026-09-10T23:29:00Z">
               <w:rPr>
                 <w:rFonts w:ascii="Arial" w:hAnsi="Arial" w:cs="Arial"/>
                 <w:i/>
@@ -14741,7 +14752,7 @@
             <w:rFonts w:ascii="Arial" w:hAnsi="Arial" w:cs="Arial"/>
             <w:sz w:val="20"/>
             <w:szCs w:val="20"/>
-            <w:rPrChange w:id="220" w:author="Graham, Gabriel J." w:date="2026-09-10T19:29:00Z" w16du:dateUtc="2026-09-10T23:29:00Z">
+            <w:rPrChange w:id="221" w:author="Graham, Gabriel J." w:date="2026-09-10T19:29:00Z" w16du:dateUtc="2026-09-10T23:29:00Z">
               <w:rPr>
                 <w:rFonts w:ascii="Arial" w:hAnsi="Arial" w:cs="Arial"/>
                 <w:sz w:val="20"/>
@@ -14759,7 +14770,7 @@
             <w:iCs/>
             <w:sz w:val="20"/>
             <w:szCs w:val="20"/>
-            <w:rPrChange w:id="221" w:author="Graham, Gabriel J." w:date="2026-09-10T19:29:00Z" w16du:dateUtc="2026-09-10T23:29:00Z">
+            <w:rPrChange w:id="222" w:author="Graham, Gabriel J." w:date="2026-09-10T19:29:00Z" w16du:dateUtc="2026-09-10T23:29:00Z">
               <w:rPr>
                 <w:rFonts w:ascii="Arial" w:hAnsi="Arial" w:cs="Arial"/>
                 <w:i/>
@@ -14777,7 +14788,7 @@
             <w:rFonts w:ascii="Arial" w:hAnsi="Arial" w:cs="Arial"/>
             <w:sz w:val="20"/>
             <w:szCs w:val="20"/>
-            <w:rPrChange w:id="222" w:author="Graham, Gabriel J." w:date="2026-09-10T19:29:00Z" w16du:dateUtc="2026-09-10T23:29:00Z">
+            <w:rPrChange w:id="223" w:author="Graham, Gabriel J." w:date="2026-09-10T19:29:00Z" w16du:dateUtc="2026-09-10T23:29:00Z">
               <w:rPr>
                 <w:rFonts w:ascii="Arial" w:hAnsi="Arial" w:cs="Arial"/>
                 <w:sz w:val="20"/>
@@ -14789,14 +14800,14 @@
           <w:delText xml:space="preserve">. </w:delText>
         </w:r>
       </w:del>
-      <w:ins w:id="223" w:author="Rhodes, Justin S" w:date="2026-09-08T10:11:00Z" w16du:dateUtc="2026-09-08T15:11:00Z">
-        <w:del w:id="224" w:author="Graham, Gabriel J." w:date="2026-09-10T19:29:00Z" w16du:dateUtc="2026-09-10T23:29:00Z">
+      <w:ins w:id="224" w:author="Rhodes, Justin S" w:date="2026-09-08T10:11:00Z" w16du:dateUtc="2026-09-08T15:11:00Z">
+        <w:del w:id="225" w:author="Graham, Gabriel J." w:date="2026-09-10T19:29:00Z" w16du:dateUtc="2026-09-10T23:29:00Z">
           <w:r>
             <w:rPr>
               <w:rFonts w:ascii="Arial" w:hAnsi="Arial" w:cs="Arial"/>
               <w:sz w:val="20"/>
               <w:szCs w:val="20"/>
-              <w:rPrChange w:id="225" w:author="Graham, Gabriel J." w:date="2026-09-10T19:29:00Z" w16du:dateUtc="2026-09-10T23:29:00Z">
+              <w:rPrChange w:id="226" w:author="Graham, Gabriel J." w:date="2026-09-10T19:29:00Z" w16du:dateUtc="2026-09-10T23:29:00Z">
                 <w:rPr>
                   <w:rFonts w:ascii="Arial" w:hAnsi="Arial" w:cs="Arial"/>
                   <w:sz w:val="20"/>
@@ -14818,7 +14829,7 @@
           </w:r>
         </w:del>
       </w:ins>
-      <w:del w:id="226" w:author="Graham, Gabriel J." w:date="2026-09-10T19:29:00Z" w16du:dateUtc="2026-09-10T23:29:00Z">
+      <w:del w:id="227" w:author="Graham, Gabriel J." w:date="2026-09-10T19:29:00Z" w16du:dateUtc="2026-09-10T23:29:00Z">
         <w:r>
           <w:rPr>
             <w:rFonts w:ascii="Arial" w:hAnsi="Arial" w:cs="Arial"/>
@@ -14829,20 +14840,8 @@
           <w:delText>A reduction in these genes until final feminization indicates the POA adopts more plastic state allowing new synaptic connections to form during sex change.</w:delText>
         </w:r>
       </w:del>
-      <w:commentRangeEnd w:id="212"/>
-      <w:del w:id="227" w:author="Rhodes, Justin S" w:date="2026-09-08T10:11:00Z" w16du:dateUtc="2026-09-08T15:11:00Z">
-        <w:r>
-          <w:rPr>
-            <w:rStyle w:val="CommentReference"/>
-            <w:rFonts w:ascii="Arial" w:hAnsi="Arial" w:cs="Arial"/>
-            <w:sz w:val="20"/>
-            <w:szCs w:val="20"/>
-          </w:rPr>
-          <w:commentReference w:id="212"/>
-        </w:r>
-      </w:del>
       <w:commentRangeEnd w:id="213"/>
-      <w:del w:id="228" w:author="Graham, Gabriel J." w:date="2026-09-10T19:29:00Z" w16du:dateUtc="2026-09-10T23:29:00Z">
+      <w:del w:id="228" w:author="Rhodes, Justin S" w:date="2026-09-08T10:11:00Z" w16du:dateUtc="2026-09-08T15:11:00Z">
         <w:r>
           <w:rPr>
             <w:rStyle w:val="CommentReference"/>
@@ -14853,6 +14852,18 @@
           <w:commentReference w:id="213"/>
         </w:r>
       </w:del>
+      <w:commentRangeEnd w:id="214"/>
+      <w:del w:id="229" w:author="Graham, Gabriel J." w:date="2026-09-10T19:29:00Z" w16du:dateUtc="2026-09-10T23:29:00Z">
+        <w:r>
+          <w:rPr>
+            <w:rStyle w:val="CommentReference"/>
+            <w:rFonts w:ascii="Arial" w:hAnsi="Arial" w:cs="Arial"/>
+            <w:sz w:val="20"/>
+            <w:szCs w:val="20"/>
+          </w:rPr>
+          <w:commentReference w:id="214"/>
+        </w:r>
+      </w:del>
     </w:p>
     <w:p>
       <w:pPr>
@@ -14879,7 +14890,7 @@
         </w:rPr>
         <w:t xml:space="preserve">vidence for an RGC – POA axis mediating sex change </w:t>
       </w:r>
-      <w:del w:id="229" w:author="Rhodes, Justin S" w:date="2026-09-08T10:28:00Z" w16du:dateUtc="2026-09-08T15:28:00Z">
+      <w:del w:id="230" w:author="Rhodes, Justin S" w:date="2026-09-08T10:28:00Z" w16du:dateUtc="2026-09-08T15:28:00Z">
         <w:r>
           <w:rPr>
             <w:rFonts w:ascii="Arial" w:hAnsi="Arial" w:cs="Arial"/>
@@ -14889,7 +14900,7 @@
           <w:delText xml:space="preserve">are </w:delText>
         </w:r>
       </w:del>
-      <w:ins w:id="230" w:author="Rhodes, Justin S" w:date="2026-09-08T10:28:00Z" w16du:dateUtc="2026-09-08T15:28:00Z">
+      <w:ins w:id="231" w:author="Rhodes, Justin S" w:date="2026-09-08T10:28:00Z" w16du:dateUtc="2026-09-08T15:28:00Z">
         <w:r>
           <w:rPr>
             <w:rFonts w:ascii="Arial" w:hAnsi="Arial" w:cs="Arial"/>
@@ -15081,7 +15092,7 @@
         </w:rPr>
         <w:t xml:space="preserve"> cells increase</w:t>
       </w:r>
-      <w:ins w:id="231" w:author="Rhodes, Justin S" w:date="2026-09-08T10:29:00Z" w16du:dateUtc="2026-09-08T15:29:00Z">
+      <w:ins w:id="232" w:author="Rhodes, Justin S" w:date="2026-09-08T10:29:00Z" w16du:dateUtc="2026-09-08T15:29:00Z">
         <w:r>
           <w:rPr>
             <w:rFonts w:ascii="Arial" w:hAnsi="Arial" w:cs="Arial"/>
@@ -15117,8 +15128,8 @@
         </w:rPr>
         <w:t xml:space="preserve"> cells are relatively more immature than in females. </w:t>
       </w:r>
-      <w:commentRangeStart w:id="232"/>
-      <w:ins w:id="233" w:author="Rhodes, Justin S" w:date="2026-09-08T10:27:00Z" w16du:dateUtc="2026-09-08T15:27:00Z">
+      <w:commentRangeStart w:id="233"/>
+      <w:ins w:id="234" w:author="Rhodes, Justin S" w:date="2026-09-08T10:27:00Z" w16du:dateUtc="2026-09-08T15:27:00Z">
         <w:r>
           <w:rPr>
             <w:rFonts w:ascii="Arial" w:hAnsi="Arial" w:cs="Arial"/>
@@ -15134,7 +15145,7 @@
             <w:iCs/>
             <w:sz w:val="20"/>
             <w:szCs w:val="20"/>
-            <w:rPrChange w:id="234" w:author="Rhodes, Justin S" w:date="2026-09-08T10:29:00Z" w16du:dateUtc="2026-09-08T15:29:00Z">
+            <w:rPrChange w:id="235" w:author="Rhodes, Justin S" w:date="2026-09-08T10:29:00Z" w16du:dateUtc="2026-09-08T15:29:00Z">
               <w:rPr/>
             </w:rPrChange>
           </w:rPr>
@@ -15149,7 +15160,7 @@
           <w:t>+ neurons in the POA may contribute to neuroendocrine regulation of ovarian development, potentially through modulation of pituitary FSH release</w:t>
         </w:r>
       </w:ins>
-      <w:commentRangeEnd w:id="232"/>
+      <w:commentRangeEnd w:id="233"/>
       <w:r>
         <w:rPr>
           <w:rStyle w:val="CommentReference"/>
@@ -15157,9 +15168,9 @@
           <w:sz w:val="20"/>
           <w:szCs w:val="20"/>
         </w:rPr>
-        <w:commentReference w:id="232"/>
-      </w:r>
-      <w:ins w:id="235" w:author="Rhodes, Justin S" w:date="2026-09-08T10:27:00Z" w16du:dateUtc="2026-09-08T15:27:00Z">
+        <w:commentReference w:id="233"/>
+      </w:r>
+      <w:ins w:id="236" w:author="Rhodes, Justin S" w:date="2026-09-08T10:27:00Z" w16du:dateUtc="2026-09-08T15:27:00Z">
         <w:r>
           <w:rPr>
             <w:rFonts w:ascii="Arial" w:hAnsi="Arial" w:cs="Arial"/>
@@ -15169,7 +15180,7 @@
           <w:t>.</w:t>
         </w:r>
       </w:ins>
-      <w:del w:id="236" w:author="Rhodes, Justin S" w:date="2026-09-08T10:27:00Z" w16du:dateUtc="2026-09-08T15:27:00Z">
+      <w:del w:id="237" w:author="Rhodes, Justin S" w:date="2026-09-08T10:27:00Z" w16du:dateUtc="2026-09-08T15:27:00Z">
         <w:r>
           <w:rPr>
             <w:rFonts w:ascii="Arial" w:hAnsi="Arial" w:cs="Arial"/>
@@ -15207,7 +15218,7 @@
           <w:szCs w:val="20"/>
         </w:rPr>
       </w:pPr>
-      <w:ins w:id="237" w:author="Rhodes, Justin S" w:date="2026-09-08T10:23:00Z" w16du:dateUtc="2026-09-08T15:23:00Z">
+      <w:ins w:id="238" w:author="Rhodes, Justin S" w:date="2026-09-08T10:23:00Z" w16du:dateUtc="2026-09-08T15:23:00Z">
         <w:r>
           <w:rPr>
             <w:rFonts w:ascii="Arial" w:hAnsi="Arial" w:cs="Arial"/>
@@ -15216,7 +15227,7 @@
           </w:rPr>
           <w:t>While we argue that</w:t>
         </w:r>
-        <w:commentRangeStart w:id="238"/>
+        <w:commentRangeStart w:id="239"/>
         <w:r>
           <w:rPr>
             <w:rFonts w:ascii="Arial" w:hAnsi="Arial" w:cs="Arial"/>
@@ -15226,7 +15237,7 @@
           <w:t xml:space="preserve"> changes in FSH signaling are </w:t>
         </w:r>
       </w:ins>
-      <w:commentRangeEnd w:id="238"/>
+      <w:commentRangeEnd w:id="239"/>
       <w:r>
         <w:rPr>
           <w:rStyle w:val="CommentReference"/>
@@ -15234,9 +15245,9 @@
           <w:sz w:val="20"/>
           <w:szCs w:val="20"/>
         </w:rPr>
-        <w:commentReference w:id="238"/>
-      </w:r>
-      <w:ins w:id="239" w:author="Rhodes, Justin S" w:date="2026-09-08T10:23:00Z" w16du:dateUtc="2026-09-08T15:23:00Z">
+        <w:commentReference w:id="239"/>
+      </w:r>
+      <w:ins w:id="240" w:author="Rhodes, Justin S" w:date="2026-09-08T10:23:00Z" w16du:dateUtc="2026-09-08T15:23:00Z">
         <w:r>
           <w:rPr>
             <w:rFonts w:ascii="Arial" w:hAnsi="Arial" w:cs="Arial"/>
@@ -15263,7 +15274,7 @@
           </w:rPr>
           <w:t>+ ne</w:t>
         </w:r>
-        <w:commentRangeStart w:id="240"/>
+        <w:commentRangeStart w:id="241"/>
         <w:r>
           <w:rPr>
             <w:rFonts w:ascii="Arial" w:hAnsi="Arial" w:cs="Arial"/>
@@ -15273,7 +15284,7 @@
           <w:t>urons in the POA, our data also suggest coordinated changes in pathways that regulate LH release</w:t>
         </w:r>
       </w:ins>
-      <w:commentRangeEnd w:id="240"/>
+      <w:commentRangeEnd w:id="241"/>
       <w:r>
         <w:rPr>
           <w:rStyle w:val="CommentReference"/>
@@ -15281,9 +15292,9 @@
           <w:sz w:val="20"/>
           <w:szCs w:val="20"/>
         </w:rPr>
-        <w:commentReference w:id="240"/>
-      </w:r>
-      <w:del w:id="241" w:author="Rhodes, Justin S" w:date="2026-09-08T10:23:00Z" w16du:dateUtc="2026-09-08T15:23:00Z">
+        <w:commentReference w:id="241"/>
+      </w:r>
+      <w:del w:id="242" w:author="Rhodes, Justin S" w:date="2026-09-08T10:23:00Z" w16du:dateUtc="2026-09-08T15:23:00Z">
         <w:r>
           <w:rPr>
             <w:rFonts w:ascii="Arial" w:hAnsi="Arial" w:cs="Arial"/>
@@ -15852,7 +15863,7 @@
         </w:rPr>
         <w:t xml:space="preserve">in 6_POA_Mixed. </w:t>
       </w:r>
-      <w:ins w:id="242" w:author="Rhodes, Justin S" w:date="2026-09-03T08:16:00Z" w16du:dateUtc="2026-09-03T13:16:00Z">
+      <w:ins w:id="243" w:author="Rhodes, Justin S" w:date="2026-09-03T08:16:00Z" w16du:dateUtc="2026-09-03T13:16:00Z">
         <w:r>
           <w:rPr>
             <w:rFonts w:ascii="Arial" w:hAnsi="Arial" w:cs="Arial"/>
@@ -15862,7 +15873,7 @@
           <w:t>To the extent that</w:t>
         </w:r>
       </w:ins>
-      <w:ins w:id="243" w:author="Rhodes, Justin S" w:date="2026-09-03T08:15:00Z" w16du:dateUtc="2026-09-03T13:15:00Z">
+      <w:ins w:id="244" w:author="Rhodes, Justin S" w:date="2026-09-03T08:15:00Z" w16du:dateUtc="2026-09-03T13:15:00Z">
         <w:r>
           <w:rPr>
             <w:rFonts w:ascii="Arial" w:hAnsi="Arial" w:cs="Arial"/>
@@ -15872,7 +15883,7 @@
           <w:t xml:space="preserve"> the changes in gene expression reflect </w:t>
         </w:r>
       </w:ins>
-      <w:ins w:id="244" w:author="Rhodes, Justin S" w:date="2026-09-03T08:16:00Z" w16du:dateUtc="2026-09-03T13:16:00Z">
+      <w:ins w:id="245" w:author="Rhodes, Justin S" w:date="2026-09-03T08:16:00Z" w16du:dateUtc="2026-09-03T13:16:00Z">
         <w:r>
           <w:rPr>
             <w:rFonts w:ascii="Arial" w:hAnsi="Arial" w:cs="Arial"/>
@@ -15882,7 +15893,7 @@
           <w:t>protein expression and parallel changes in</w:t>
         </w:r>
       </w:ins>
-      <w:ins w:id="245" w:author="Rhodes, Justin S" w:date="2026-09-03T08:15:00Z" w16du:dateUtc="2026-09-03T13:15:00Z">
+      <w:ins w:id="246" w:author="Rhodes, Justin S" w:date="2026-09-03T08:15:00Z" w16du:dateUtc="2026-09-03T13:15:00Z">
         <w:r>
           <w:rPr>
             <w:rFonts w:ascii="Arial" w:hAnsi="Arial" w:cs="Arial"/>
@@ -15892,7 +15903,7 @@
           <w:t xml:space="preserve"> signaling</w:t>
         </w:r>
       </w:ins>
-      <w:ins w:id="246" w:author="Rhodes, Justin S" w:date="2026-09-03T08:16:00Z" w16du:dateUtc="2026-09-03T13:16:00Z">
+      <w:ins w:id="247" w:author="Rhodes, Justin S" w:date="2026-09-03T08:16:00Z" w16du:dateUtc="2026-09-03T13:16:00Z">
         <w:r>
           <w:rPr>
             <w:rFonts w:ascii="Arial" w:hAnsi="Arial" w:cs="Arial"/>
@@ -15902,7 +15913,7 @@
           <w:t xml:space="preserve"> levels, t</w:t>
         </w:r>
       </w:ins>
-      <w:del w:id="247" w:author="Rhodes, Justin S" w:date="2026-09-03T08:16:00Z" w16du:dateUtc="2026-09-03T13:16:00Z">
+      <w:del w:id="248" w:author="Rhodes, Justin S" w:date="2026-09-03T08:16:00Z" w16du:dateUtc="2026-09-03T13:16:00Z">
         <w:r>
           <w:rPr>
             <w:rFonts w:ascii="Arial" w:hAnsi="Arial" w:cs="Arial"/>
@@ -15920,7 +15931,7 @@
         </w:rPr>
         <w:t xml:space="preserve">hese findings </w:t>
       </w:r>
-      <w:del w:id="248" w:author="Rhodes, Justin S" w:date="2026-09-03T08:17:00Z" w16du:dateUtc="2026-09-03T13:17:00Z">
+      <w:del w:id="249" w:author="Rhodes, Justin S" w:date="2026-09-03T08:17:00Z" w16du:dateUtc="2026-09-03T13:17:00Z">
         <w:r>
           <w:rPr>
             <w:rFonts w:ascii="Arial" w:hAnsi="Arial" w:cs="Arial"/>
@@ -15930,7 +15941,7 @@
           <w:delText>are consistent with a decrease in</w:delText>
         </w:r>
       </w:del>
-      <w:ins w:id="249" w:author="Rhodes, Justin S" w:date="2026-09-03T08:17:00Z" w16du:dateUtc="2026-09-03T13:17:00Z">
+      <w:ins w:id="250" w:author="Rhodes, Justin S" w:date="2026-09-03T08:17:00Z" w16du:dateUtc="2026-09-03T13:17:00Z">
         <w:r>
           <w:rPr>
             <w:rFonts w:ascii="Arial" w:hAnsi="Arial" w:cs="Arial"/>
@@ -15948,7 +15959,7 @@
         </w:rPr>
         <w:t xml:space="preserve"> LH </w:t>
       </w:r>
-      <w:ins w:id="250" w:author="Rhodes, Justin S" w:date="2026-09-03T08:17:00Z" w16du:dateUtc="2026-09-03T13:17:00Z">
+      <w:ins w:id="251" w:author="Rhodes, Justin S" w:date="2026-09-03T08:17:00Z" w16du:dateUtc="2026-09-03T13:17:00Z">
         <w:r>
           <w:rPr>
             <w:rFonts w:ascii="Arial" w:hAnsi="Arial" w:cs="Arial"/>
@@ -15958,9 +15969,9 @@
           <w:t xml:space="preserve">singling is reduced </w:t>
         </w:r>
       </w:ins>
-      <w:commentRangeStart w:id="251"/>
       <w:commentRangeStart w:id="252"/>
-      <w:del w:id="253" w:author="Rhodes, Justin S" w:date="2026-09-03T08:17:00Z" w16du:dateUtc="2026-09-03T13:17:00Z">
+      <w:commentRangeStart w:id="253"/>
+      <w:del w:id="254" w:author="Rhodes, Justin S" w:date="2026-09-03T08:17:00Z" w16du:dateUtc="2026-09-03T13:17:00Z">
         <w:r>
           <w:rPr>
             <w:rFonts w:ascii="Arial" w:hAnsi="Arial" w:cs="Arial"/>
@@ -15986,7 +15997,7 @@
         </w:rPr>
         <w:t>as sex change progresses</w:t>
       </w:r>
-      <w:commentRangeEnd w:id="251"/>
+      <w:commentRangeEnd w:id="252"/>
       <w:r>
         <w:rPr>
           <w:rStyle w:val="CommentReference"/>
@@ -15994,9 +16005,9 @@
           <w:sz w:val="20"/>
           <w:szCs w:val="20"/>
         </w:rPr>
-        <w:commentReference w:id="251"/>
-      </w:r>
-      <w:commentRangeEnd w:id="252"/>
+        <w:commentReference w:id="252"/>
+      </w:r>
+      <w:commentRangeEnd w:id="253"/>
       <w:r>
         <w:rPr>
           <w:rStyle w:val="CommentReference"/>
@@ -16004,7 +16015,7 @@
           <w:sz w:val="20"/>
           <w:szCs w:val="20"/>
         </w:rPr>
-        <w:commentReference w:id="252"/>
+        <w:commentReference w:id="253"/>
       </w:r>
       <w:r>
         <w:rPr>
@@ -16110,7 +16121,7 @@
         </w:rPr>
         <w:t>. This provides a plausible connection by which changes in neural activity</w:t>
       </w:r>
-      <w:ins w:id="254" w:author="Rhodes, Justin S" w:date="2026-09-03T08:18:00Z" w16du:dateUtc="2026-09-03T13:18:00Z">
+      <w:ins w:id="255" w:author="Rhodes, Justin S" w:date="2026-09-03T08:18:00Z" w16du:dateUtc="2026-09-03T13:18:00Z">
         <w:r>
           <w:rPr>
             <w:rFonts w:ascii="Arial" w:hAnsi="Arial" w:cs="Arial"/>
@@ -16120,7 +16131,7 @@
           <w:t xml:space="preserve"> during social</w:t>
         </w:r>
       </w:ins>
-      <w:ins w:id="255" w:author="Rhodes, Justin S" w:date="2026-09-03T08:19:00Z" w16du:dateUtc="2026-09-03T13:19:00Z">
+      <w:ins w:id="256" w:author="Rhodes, Justin S" w:date="2026-09-03T08:19:00Z" w16du:dateUtc="2026-09-03T13:19:00Z">
         <w:r>
           <w:rPr>
             <w:rFonts w:ascii="Arial" w:hAnsi="Arial" w:cs="Arial"/>
@@ -16148,7 +16159,7 @@
           <w:szCs w:val="20"/>
         </w:rPr>
       </w:pPr>
-      <w:commentRangeStart w:id="256"/>
+      <w:commentRangeStart w:id="257"/>
       <w:r>
         <w:rPr>
           <w:rFonts w:ascii="Arial" w:hAnsi="Arial" w:cs="Arial"/>
@@ -16157,7 +16168,7 @@
         </w:rPr>
         <w:t>Given the data</w:t>
       </w:r>
-      <w:ins w:id="257" w:author="Rhodes, Justin S" w:date="2026-09-11T10:42:00Z" w16du:dateUtc="2026-09-11T15:42:00Z">
+      <w:ins w:id="258" w:author="Rhodes, Justin S" w:date="2026-09-11T10:42:00Z" w16du:dateUtc="2026-09-11T15:42:00Z">
         <w:r>
           <w:rPr>
             <w:rFonts w:ascii="Arial" w:hAnsi="Arial" w:cs="Arial"/>
@@ -16175,7 +16186,7 @@
         </w:rPr>
         <w:t xml:space="preserve">, we </w:t>
       </w:r>
-      <w:del w:id="258" w:author="Rhodes, Justin S" w:date="2026-09-03T08:19:00Z" w16du:dateUtc="2026-09-03T13:19:00Z">
+      <w:del w:id="259" w:author="Rhodes, Justin S" w:date="2026-09-03T08:19:00Z" w16du:dateUtc="2026-09-03T13:19:00Z">
         <w:r>
           <w:rPr>
             <w:rFonts w:ascii="Arial" w:hAnsi="Arial" w:cs="Arial"/>
@@ -16185,7 +16196,7 @@
           <w:delText xml:space="preserve">propose </w:delText>
         </w:r>
       </w:del>
-      <w:ins w:id="259" w:author="Rhodes, Justin S" w:date="2026-09-03T08:19:00Z" w16du:dateUtc="2026-09-03T13:19:00Z">
+      <w:ins w:id="260" w:author="Rhodes, Justin S" w:date="2026-09-03T08:19:00Z" w16du:dateUtc="2026-09-03T13:19:00Z">
         <w:r>
           <w:rPr>
             <w:rFonts w:ascii="Arial" w:hAnsi="Arial" w:cs="Arial"/>
@@ -16227,7 +16238,7 @@
         </w:rPr>
         <w:t xml:space="preserve">dominance hierarchy. Sensory cues indicating this ascension are integrated by higher brain regions like the dorsomedial telencephalon (Dm) and result in </w:t>
       </w:r>
-      <w:del w:id="260" w:author="Rhodes, Justin S" w:date="2026-09-03T08:19:00Z" w16du:dateUtc="2026-09-03T13:19:00Z">
+      <w:del w:id="261" w:author="Rhodes, Justin S" w:date="2026-09-03T08:19:00Z" w16du:dateUtc="2026-09-03T13:19:00Z">
         <w:r>
           <w:rPr>
             <w:rFonts w:ascii="Arial" w:hAnsi="Arial" w:cs="Arial"/>
@@ -16245,7 +16256,7 @@
         </w:rPr>
         <w:t>change</w:t>
       </w:r>
-      <w:ins w:id="261" w:author="Rhodes, Justin S" w:date="2026-09-03T08:19:00Z" w16du:dateUtc="2026-09-03T13:19:00Z">
+      <w:ins w:id="262" w:author="Rhodes, Justin S" w:date="2026-09-03T08:19:00Z" w16du:dateUtc="2026-09-03T13:19:00Z">
         <w:r>
           <w:rPr>
             <w:rFonts w:ascii="Arial" w:hAnsi="Arial" w:cs="Arial"/>
@@ -16361,7 +16372,7 @@
         </w:rPr>
         <w:t xml:space="preserve">, </w:t>
       </w:r>
-      <w:ins w:id="262" w:author="Rhodes, Justin S" w:date="2026-09-11T10:38:00Z" w16du:dateUtc="2026-09-11T15:38:00Z">
+      <w:ins w:id="263" w:author="Rhodes, Justin S" w:date="2026-09-11T10:38:00Z" w16du:dateUtc="2026-09-11T15:38:00Z">
         <w:r>
           <w:rPr>
             <w:rFonts w:ascii="Arial" w:hAnsi="Arial" w:cs="Arial"/>
@@ -16371,7 +16382,7 @@
           <w:t>th</w:t>
         </w:r>
       </w:ins>
-      <w:ins w:id="263" w:author="Rhodes, Justin S" w:date="2026-09-11T10:39:00Z" w16du:dateUtc="2026-09-11T15:39:00Z">
+      <w:ins w:id="264" w:author="Rhodes, Justin S" w:date="2026-09-11T10:39:00Z" w16du:dateUtc="2026-09-11T15:39:00Z">
         <w:r>
           <w:rPr>
             <w:rFonts w:ascii="Arial" w:hAnsi="Arial" w:cs="Arial"/>
@@ -16381,7 +16392,7 @@
           <w:t xml:space="preserve">e </w:t>
         </w:r>
       </w:ins>
-      <w:ins w:id="264" w:author="Rhodes, Justin S" w:date="2026-09-11T10:38:00Z" w16du:dateUtc="2026-09-11T15:38:00Z">
+      <w:ins w:id="265" w:author="Rhodes, Justin S" w:date="2026-09-11T10:38:00Z" w16du:dateUtc="2026-09-11T15:38:00Z">
         <w:r>
           <w:rPr>
             <w:rFonts w:ascii="Arial" w:hAnsi="Arial" w:cs="Arial"/>
@@ -16417,7 +16428,7 @@
         </w:rPr>
         <w:t xml:space="preserve"> </w:t>
       </w:r>
-      <w:del w:id="265" w:author="Rhodes, Justin S" w:date="2026-09-11T10:38:00Z" w16du:dateUtc="2026-09-11T15:38:00Z">
+      <w:del w:id="266" w:author="Rhodes, Justin S" w:date="2026-09-11T10:38:00Z" w16du:dateUtc="2026-09-11T15:38:00Z">
         <w:r>
           <w:rPr>
             <w:rFonts w:ascii="Arial" w:hAnsi="Arial" w:cs="Arial"/>
@@ -16427,7 +16438,7 @@
           <w:delText>becomes differentially active</w:delText>
         </w:r>
       </w:del>
-      <w:ins w:id="266" w:author="Rhodes, Justin S" w:date="2026-09-11T10:38:00Z" w16du:dateUtc="2026-09-11T15:38:00Z">
+      <w:ins w:id="267" w:author="Rhodes, Justin S" w:date="2026-09-11T10:38:00Z" w16du:dateUtc="2026-09-11T15:38:00Z">
         <w:r>
           <w:rPr>
             <w:rFonts w:ascii="Arial" w:hAnsi="Arial" w:cs="Arial"/>
@@ -16445,7 +16456,7 @@
         </w:rPr>
         <w:t xml:space="preserve"> leading to reduced </w:t>
       </w:r>
-      <w:del w:id="267" w:author="Rhodes, Justin S" w:date="2026-09-11T10:38:00Z" w16du:dateUtc="2026-09-11T15:38:00Z">
+      <w:del w:id="268" w:author="Rhodes, Justin S" w:date="2026-09-11T10:38:00Z" w16du:dateUtc="2026-09-11T15:38:00Z">
         <w:r>
           <w:rPr>
             <w:rFonts w:ascii="Arial" w:hAnsi="Arial" w:cs="Arial"/>
@@ -16455,7 +16466,7 @@
           <w:delText xml:space="preserve">production </w:delText>
         </w:r>
       </w:del>
-      <w:ins w:id="268" w:author="Rhodes, Justin S" w:date="2026-09-11T10:38:00Z" w16du:dateUtc="2026-09-11T15:38:00Z">
+      <w:ins w:id="269" w:author="Rhodes, Justin S" w:date="2026-09-11T10:38:00Z" w16du:dateUtc="2026-09-11T15:38:00Z">
         <w:r>
           <w:rPr>
             <w:rFonts w:ascii="Arial" w:hAnsi="Arial" w:cs="Arial"/>
@@ -16541,7 +16552,7 @@
         </w:rPr>
         <w:t>reduction</w:t>
       </w:r>
-      <w:commentRangeStart w:id="269"/>
+      <w:commentRangeStart w:id="270"/>
       <w:r>
         <w:rPr>
           <w:rFonts w:ascii="Arial" w:hAnsi="Arial" w:cs="Arial"/>
@@ -16550,7 +16561,7 @@
         </w:rPr>
         <w:t xml:space="preserve"> of LH production from the pituitary</w:t>
       </w:r>
-      <w:commentRangeEnd w:id="269"/>
+      <w:commentRangeEnd w:id="270"/>
       <w:r>
         <w:rPr>
           <w:rStyle w:val="CommentReference"/>
@@ -16558,7 +16569,7 @@
           <w:sz w:val="20"/>
           <w:szCs w:val="20"/>
         </w:rPr>
-        <w:commentReference w:id="269"/>
+        <w:commentReference w:id="270"/>
       </w:r>
       <w:r>
         <w:rPr>
@@ -16635,7 +16646,7 @@
         </w:rPr>
         <w:t xml:space="preserve"> activity increases in RGCs leading </w:t>
       </w:r>
-      <w:commentRangeEnd w:id="256"/>
+      <w:commentRangeEnd w:id="257"/>
       <w:r>
         <w:rPr>
           <w:rStyle w:val="CommentReference"/>
@@ -16643,7 +16654,7 @@
           <w:sz w:val="20"/>
           <w:szCs w:val="20"/>
         </w:rPr>
-        <w:commentReference w:id="256"/>
+        <w:commentReference w:id="257"/>
       </w:r>
       <w:r>
         <w:rPr>
@@ -16653,7 +16664,7 @@
         </w:rPr>
         <w:t>to increased production of</w:t>
       </w:r>
-      <w:commentRangeStart w:id="270"/>
+      <w:commentRangeStart w:id="271"/>
       <w:r>
         <w:rPr>
           <w:rFonts w:ascii="Arial" w:hAnsi="Arial" w:cs="Arial"/>
@@ -16680,7 +16691,7 @@
         </w:rPr>
         <w:t xml:space="preserve"> </w:t>
       </w:r>
-      <w:commentRangeEnd w:id="270"/>
+      <w:commentRangeEnd w:id="271"/>
       <w:r>
         <w:rPr>
           <w:rStyle w:val="CommentReference"/>
@@ -16688,7 +16699,7 @@
           <w:sz w:val="20"/>
           <w:szCs w:val="20"/>
         </w:rPr>
-        <w:commentReference w:id="270"/>
+        <w:commentReference w:id="271"/>
       </w:r>
       <w:r>
         <w:rPr>
@@ -16732,7 +16743,7 @@
         </w:rPr>
         <w:t>increas</w:t>
       </w:r>
-      <w:commentRangeStart w:id="271"/>
+      <w:commentRangeStart w:id="272"/>
       <w:r>
         <w:rPr>
           <w:rFonts w:ascii="Arial" w:hAnsi="Arial" w:cs="Arial"/>
@@ -16741,7 +16752,7 @@
         </w:rPr>
         <w:t xml:space="preserve">es </w:t>
       </w:r>
-      <w:ins w:id="272" w:author="Rhodes, Justin S" w:date="2026-09-11T10:41:00Z" w16du:dateUtc="2026-09-11T15:41:00Z">
+      <w:ins w:id="273" w:author="Rhodes, Justin S" w:date="2026-09-11T10:41:00Z" w16du:dateUtc="2026-09-11T15:41:00Z">
         <w:r>
           <w:rPr>
             <w:rFonts w:ascii="Arial" w:hAnsi="Arial" w:cs="Arial"/>
@@ -16759,7 +16770,7 @@
         </w:rPr>
         <w:t>neuroplasticity in t</w:t>
       </w:r>
-      <w:commentRangeEnd w:id="271"/>
+      <w:commentRangeEnd w:id="272"/>
       <w:r>
         <w:rPr>
           <w:rStyle w:val="CommentReference"/>
@@ -16767,7 +16778,7 @@
           <w:sz w:val="20"/>
           <w:szCs w:val="20"/>
         </w:rPr>
-        <w:commentReference w:id="271"/>
+        <w:commentReference w:id="272"/>
       </w:r>
       <w:r>
         <w:rPr>
@@ -16846,7 +16857,7 @@
         </w:rPr>
         <w:t>production which f</w:t>
       </w:r>
-      <w:ins w:id="273" w:author="Rhodes, Justin S" w:date="2026-09-03T08:21:00Z" w16du:dateUtc="2026-09-03T13:21:00Z">
+      <w:ins w:id="274" w:author="Rhodes, Justin S" w:date="2026-09-03T08:21:00Z" w16du:dateUtc="2026-09-03T13:21:00Z">
         <w:r>
           <w:rPr>
             <w:rFonts w:ascii="Arial" w:hAnsi="Arial" w:cs="Arial"/>
@@ -16856,7 +16867,7 @@
           <w:t>u</w:t>
         </w:r>
       </w:ins>
-      <w:del w:id="274" w:author="Rhodes, Justin S" w:date="2026-09-03T08:21:00Z" w16du:dateUtc="2026-09-03T13:21:00Z">
+      <w:del w:id="275" w:author="Rhodes, Justin S" w:date="2026-09-03T08:21:00Z" w16du:dateUtc="2026-09-03T13:21:00Z">
         <w:r>
           <w:rPr>
             <w:rFonts w:ascii="Arial" w:hAnsi="Arial" w:cs="Arial"/>
@@ -16890,7 +16901,7 @@
         </w:rPr>
         <w:t xml:space="preserve"> of LH signaling and </w:t>
       </w:r>
-      <w:ins w:id="275" w:author="Rhodes, Justin S" w:date="2026-09-11T10:41:00Z" w16du:dateUtc="2026-09-11T15:41:00Z">
+      <w:ins w:id="276" w:author="Rhodes, Justin S" w:date="2026-09-11T10:41:00Z" w16du:dateUtc="2026-09-11T15:41:00Z">
         <w:r>
           <w:rPr>
             <w:rFonts w:ascii="Arial" w:hAnsi="Arial" w:cs="Arial"/>
@@ -16908,7 +16919,7 @@
         </w:rPr>
         <w:t xml:space="preserve">testicular tissue. In RGCs, the </w:t>
       </w:r>
-      <w:commentRangeStart w:id="276"/>
+      <w:commentRangeStart w:id="277"/>
       <w:r>
         <w:rPr>
           <w:rFonts w:ascii="Arial" w:hAnsi="Arial" w:cs="Arial"/>
@@ -16935,7 +16946,7 @@
         </w:rPr>
         <w:t xml:space="preserve"> </w:t>
       </w:r>
-      <w:commentRangeEnd w:id="276"/>
+      <w:commentRangeEnd w:id="277"/>
       <w:r>
         <w:rPr>
           <w:rStyle w:val="CommentReference"/>
@@ -16943,7 +16954,7 @@
           <w:sz w:val="20"/>
           <w:szCs w:val="20"/>
         </w:rPr>
-        <w:commentReference w:id="276"/>
+        <w:commentReference w:id="277"/>
       </w:r>
       <w:r>
         <w:rPr>
@@ -17020,15 +17031,15 @@
       <w:pPr>
         <w:ind w:firstLine="720"/>
         <w:rPr>
-          <w:del w:id="277" w:author="Graham, Gabriel J." w:date="2026-09-08T15:44:00Z" w16du:dateUtc="2026-09-08T19:44:00Z"/>
-          <w:rFonts w:ascii="Arial" w:hAnsi="Arial" w:cs="Arial"/>
-          <w:sz w:val="20"/>
-          <w:szCs w:val="20"/>
-        </w:rPr>
-      </w:pPr>
-      <w:commentRangeStart w:id="278"/>
+          <w:del w:id="278" w:author="Graham, Gabriel J." w:date="2026-09-08T15:44:00Z" w16du:dateUtc="2026-09-08T19:44:00Z"/>
+          <w:rFonts w:ascii="Arial" w:hAnsi="Arial" w:cs="Arial"/>
+          <w:sz w:val="20"/>
+          <w:szCs w:val="20"/>
+        </w:rPr>
+      </w:pPr>
       <w:commentRangeStart w:id="279"/>
-      <w:del w:id="280" w:author="Graham, Gabriel J." w:date="2026-09-08T15:44:00Z" w16du:dateUtc="2026-09-08T19:44:00Z">
+      <w:commentRangeStart w:id="280"/>
+      <w:del w:id="281" w:author="Graham, Gabriel J." w:date="2026-09-08T15:44:00Z" w16du:dateUtc="2026-09-08T19:44:00Z">
         <w:r>
           <w:rPr>
             <w:rFonts w:ascii="Arial" w:hAnsi="Arial" w:cs="Arial"/>
@@ -17036,16 +17047,6 @@
             <w:szCs w:val="20"/>
           </w:rPr>
           <w:delText xml:space="preserve">Several important questions remain. Our hypothesis for the neural orchestration of sex change revolves around changes in LH and FSH release from the pituitary and the effects those factors would have on the gonads. However, LH and FSH have not been measured during protandrous sex change… </w:delText>
-        </w:r>
-        <w:commentRangeEnd w:id="278"/>
-        <w:r>
-          <w:rPr>
-            <w:rStyle w:val="CommentReference"/>
-            <w:rFonts w:ascii="Arial" w:hAnsi="Arial" w:cs="Arial"/>
-            <w:sz w:val="20"/>
-            <w:szCs w:val="20"/>
-          </w:rPr>
-          <w:commentReference w:id="278"/>
         </w:r>
         <w:commentRangeEnd w:id="279"/>
         <w:r>
@@ -17057,6 +17058,16 @@
           </w:rPr>
           <w:commentReference w:id="279"/>
         </w:r>
+        <w:commentRangeEnd w:id="280"/>
+        <w:r>
+          <w:rPr>
+            <w:rStyle w:val="CommentReference"/>
+            <w:rFonts w:ascii="Arial" w:hAnsi="Arial" w:cs="Arial"/>
+            <w:sz w:val="20"/>
+            <w:szCs w:val="20"/>
+          </w:rPr>
+          <w:commentReference w:id="280"/>
+        </w:r>
       </w:del>
     </w:p>
     <w:p>
@@ -19603,7 +19614,7 @@
           <w:u w:val="single"/>
         </w:rPr>
       </w:pPr>
-      <w:commentRangeStart w:id="281"/>
+      <w:commentRangeStart w:id="282"/>
       <w:r>
         <w:rPr>
           <w:rFonts w:ascii="Arial" w:hAnsi="Arial" w:cs="Arial"/>
@@ -19700,7 +19711,7 @@
         </w:rPr>
         <w:t>.</w:t>
       </w:r>
-      <w:commentRangeEnd w:id="281"/>
+      <w:commentRangeEnd w:id="282"/>
       <w:r>
         <w:rPr>
           <w:rStyle w:val="CommentReference"/>
@@ -19708,7 +19719,7 @@
           <w:sz w:val="20"/>
           <w:szCs w:val="20"/>
         </w:rPr>
-        <w:commentReference w:id="281"/>
+        <w:commentReference w:id="282"/>
       </w:r>
       <w:r>
         <w:rPr>
@@ -19783,7 +19794,7 @@
           <w:szCs w:val="20"/>
         </w:rPr>
       </w:pPr>
-      <w:commentRangeStart w:id="282"/>
+      <w:commentRangeStart w:id="283"/>
       <w:r>
         <w:rPr>
           <w:rFonts w:ascii="Arial" w:hAnsi="Arial" w:cs="Arial"/>
@@ -19794,7 +19805,7 @@
         </w:rPr>
         <w:t>Spatial Transcriptomics</w:t>
       </w:r>
-      <w:commentRangeEnd w:id="282"/>
+      <w:commentRangeEnd w:id="283"/>
       <w:r>
         <w:rPr>
           <w:rStyle w:val="CommentReference"/>
@@ -19804,7 +19815,7 @@
           <w:sz w:val="20"/>
           <w:szCs w:val="20"/>
         </w:rPr>
-        <w:commentReference w:id="282"/>
+        <w:commentReference w:id="283"/>
       </w:r>
       <w:r>
         <w:rPr>
@@ -19837,7 +19848,7 @@
           <w:u w:val="single"/>
         </w:rPr>
       </w:pPr>
-      <w:commentRangeStart w:id="283"/>
+      <w:commentRangeStart w:id="284"/>
       <w:r>
         <w:rPr>
           <w:rFonts w:ascii="Arial" w:hAnsi="Arial" w:cs="Arial"/>
@@ -19847,7 +19858,7 @@
         </w:rPr>
         <w:t>Tissue Collection and Sectioning</w:t>
       </w:r>
-      <w:commentRangeEnd w:id="283"/>
+      <w:commentRangeEnd w:id="284"/>
       <w:r>
         <w:rPr>
           <w:rStyle w:val="CommentReference"/>
@@ -19856,7 +19867,7 @@
           <w:szCs w:val="20"/>
           <w:u w:val="single"/>
         </w:rPr>
-        <w:commentReference w:id="283"/>
+        <w:commentReference w:id="284"/>
       </w:r>
     </w:p>
     <w:p>
@@ -19886,7 +19897,7 @@
           <w:u w:val="single"/>
         </w:rPr>
       </w:pPr>
-      <w:commentRangeStart w:id="284"/>
+      <w:commentRangeStart w:id="285"/>
       <w:r>
         <w:rPr>
           <w:rFonts w:ascii="Arial" w:hAnsi="Arial" w:cs="Arial"/>
@@ -19943,7 +19954,7 @@
         </w:rPr>
         <w:t>Library Prep and Sequencing</w:t>
       </w:r>
-      <w:commentRangeEnd w:id="284"/>
+      <w:commentRangeEnd w:id="285"/>
       <w:r>
         <w:rPr>
           <w:rStyle w:val="CommentReference"/>
@@ -19952,7 +19963,7 @@
           <w:szCs w:val="20"/>
           <w:u w:val="single"/>
         </w:rPr>
-        <w:commentReference w:id="284"/>
+        <w:commentReference w:id="285"/>
       </w:r>
     </w:p>
     <w:p>
@@ -20000,7 +20011,7 @@
         </w:rPr>
         <w:tab/>
       </w:r>
-      <w:commentRangeStart w:id="285"/>
+      <w:commentRangeStart w:id="286"/>
       <w:r>
         <w:rPr>
           <w:rFonts w:ascii="Arial" w:hAnsi="Arial" w:cs="Arial"/>
@@ -20018,7 +20029,7 @@
         </w:rPr>
         <w:t>xx</w:t>
       </w:r>
-      <w:commentRangeEnd w:id="285"/>
+      <w:commentRangeEnd w:id="286"/>
       <w:r>
         <w:rPr>
           <w:rStyle w:val="CommentReference"/>
@@ -20026,7 +20037,7 @@
           <w:sz w:val="20"/>
           <w:szCs w:val="20"/>
         </w:rPr>
-        <w:commentReference w:id="285"/>
+        <w:commentReference w:id="286"/>
       </w:r>
     </w:p>
     <w:p>
@@ -21398,7 +21409,7 @@
           <w:u w:val="single"/>
         </w:rPr>
       </w:pPr>
-      <w:commentRangeStart w:id="286"/>
+      <w:commentRangeStart w:id="287"/>
       <w:r>
         <w:rPr>
           <w:rFonts w:ascii="Arial" w:hAnsi="Arial" w:cs="Arial"/>
@@ -21518,7 +21529,7 @@
         </w:rPr>
         <w:t xml:space="preserve"> RefSeq genome assembly (GCF_022539595.1). </w:t>
       </w:r>
-      <w:commentRangeEnd w:id="286"/>
+      <w:commentRangeEnd w:id="287"/>
       <w:r>
         <w:rPr>
           <w:rStyle w:val="CommentReference"/>
@@ -21526,7 +21537,7 @@
           <w:sz w:val="20"/>
           <w:szCs w:val="20"/>
         </w:rPr>
-        <w:commentReference w:id="286"/>
+        <w:commentReference w:id="287"/>
       </w:r>
       <w:r>
         <w:rPr>
@@ -23867,7 +23878,7 @@
         </w:rPr>
         <w:t>To identify candidate transcriptional regulators of gene-expression changes in clusters 1_RGC and 6_POA_Mixed during sex change, we integrated differential gene expression, chromatin accessibility, peak-to-gene correlations, and transcription factor (TF) motif information within each cell cluster. We first identified a restricted set of target genes for which gene expression was associated with local chromatin accessibility and either expression or accessibility differed across sex-change groups. Thus, target genes were identified through two complementary routes. First, DEGs were retained when expression of the gene was significantly correlated with accessibility of at least one locally associated ATAC peak across individuals (</w:t>
       </w:r>
-      <w:commentRangeStart w:id="287"/>
+      <w:commentRangeStart w:id="288"/>
       <w:r>
         <w:rPr>
           <w:rFonts w:ascii="Arial" w:hAnsi="Arial" w:cs="Arial"/>
@@ -23876,7 +23887,7 @@
         </w:rPr>
         <w:t>Pearson’s correlation</w:t>
       </w:r>
-      <w:commentRangeEnd w:id="287"/>
+      <w:commentRangeEnd w:id="288"/>
       <w:r>
         <w:rPr>
           <w:rStyle w:val="CommentReference"/>
@@ -23884,7 +23895,7 @@
           <w:sz w:val="20"/>
           <w:szCs w:val="20"/>
         </w:rPr>
-        <w:commentReference w:id="287"/>
+        <w:commentReference w:id="288"/>
       </w:r>
       <w:r>
         <w:rPr>
@@ -27886,7 +27897,7 @@
 
 <file path=word/comments.xml><?xml version="1.0" encoding="utf-8"?>
 <w:comments xmlns:wpc="http://schemas.microsoft.com/office/word/2010/wordprocessingCanvas" xmlns:cx="http://schemas.microsoft.com/office/drawing/2014/chartex" xmlns:cx1="http://schemas.microsoft.com/office/drawing/2015/9/8/chartex" xmlns:cx2="http://schemas.microsoft.com/office/drawing/2015/10/21/chartex" xmlns:cx3="http://schemas.microsoft.com/office/drawing/2016/5/9/chartex" xmlns:cx4="http://schemas.microsoft.com/office/drawing/2016/5/10/chartex" xmlns:cx5="http://schemas.microsoft.com/office/drawing/2016/5/11/chartex" xmlns:cx6="http://schemas.microsoft.com/office/drawing/2016/5/12/chartex" xmlns:cx7="http://schemas.microsoft.com/office/drawing/2016/5/13/chartex" xmlns:cx8="http://schemas.microsoft.com/office/drawing/2016/5/14/chartex" xmlns:mc="http://schemas.openxmlformats.org/markup-compatibility/2006" xmlns:m="http://schemas.openxmlformats.org/officeDocument/2006/math" xmlns:aink="http://schemas.microsoft.com/office/drawing/2016/ink" xmlns:am3d="http://schemas.microsoft.com/office/drawing/2017/model3d" xmlns:oel="http://schemas.microsoft.com/office/2019/extlst" xmlns:r="http://schemas.openxmlformats.org/officeDocument/2006/relationships" xmlns:wp14="http://schemas.microsoft.com/office/word/2010/wordprocessingDrawing" xmlns:wp="http://schemas.openxmlformats.org/drawingml/2006/wordprocessingDrawing" xmlns:wpg="http://schemas.microsoft.com/office/word/2010/wordprocessingGroup" xmlns:wpi="http://schemas.microsoft.com/office/word/2010/wordprocessingInk" xmlns:wps="http://schemas.microsoft.com/office/word/2010/wordprocessingShape" xmlns:o="urn:schemas-microsoft-com:office:office" xmlns:v="urn:schemas-microsoft-com:vml" xmlns:w10="urn:schemas-microsoft-com:office:word" xmlns:w="http://schemas.openxmlformats.org/wordprocessingml/2006/main" xmlns:w14="http://schemas.microsoft.com/office/word/2010/wordml" xmlns:w15="http://schemas.microsoft.com/office/word/2012/wordml" xmlns:w16cei="http://schemas.microsoft.com/office/word/2026/wordml/cei" xmlns:w16cex="http://schemas.microsoft.com/office/word/2018/wordml/cex" xmlns:w16cid="http://schemas.microsoft.com/office/word/2016/wordml/cid" xmlns:w16="http://schemas.microsoft.com/office/word/2018/wordml" xmlns:w16sdtdh="http://schemas.microsoft.com/office/word/2020/wordml/sdtdatahash" xmlns:w16sdtfl="http://schemas.microsoft.com/office/word/2024/wordml/sdtformatlock" xmlns:w16se="http://schemas.microsoft.com/office/word/2015/wordml/symex" xmlns:w16du="http://schemas.microsoft.com/office/word/2023/wordml/word16du" xmlns:wne="http://schemas.microsoft.com/office/word/2006/wordml" mc:Ignorable="w14 w15 w16se w16cid w16 w16cex w16sdtdh w16sdtfl w16du wp14">
-  <w:comment w:id="0" w:author="Graham, Gabriel J." w:date="2026-09-11T16:50:00Z" w:initials="GGJ">
+  <w:comment w:id="0" w:author="Graham, Gabriel J." w:date="2026-09-11T17:36:00Z" w:initials="GGJ">
     <w:p>
       <w:r>
         <w:rPr>
@@ -27899,11 +27910,28 @@
           <w:sz w:val="20"/>
           <w:szCs w:val="20"/>
         </w:rPr>
+        <w:t>Add rgc - poa axis</w:t>
+      </w:r>
+    </w:p>
+  </w:comment>
+  <w:comment w:id="1" w:author="Graham, Gabriel J." w:date="2026-09-11T16:50:00Z" w:initials="GGJ">
+    <w:p>
+      <w:r>
+        <w:rPr>
+          <w:rStyle w:val="CommentReference"/>
+        </w:rPr>
+        <w:annotationRef/>
+      </w:r>
+      <w:r>
+        <w:rPr>
+          <w:sz w:val="20"/>
+          <w:szCs w:val="20"/>
+        </w:rPr>
         <w:t>Make statistic table</w:t>
       </w:r>
     </w:p>
   </w:comment>
-  <w:comment w:id="6" w:author="Rhodes, Justin S" w:date="2026-09-11T09:10:00Z" w:initials="JR">
+  <w:comment w:id="7" w:author="Rhodes, Justin S" w:date="2026-09-11T09:10:00Z" w:initials="JR">
     <w:p>
       <w:pPr>
         <w:pStyle w:val="CommentText"/>
@@ -27919,7 +27947,7 @@
       </w:r>
     </w:p>
   </w:comment>
-  <w:comment w:id="19" w:author="Graham, Gabriel J." w:date="2026-08-24T12:14:00Z" w:initials="GGJ">
+  <w:comment w:id="20" w:author="Graham, Gabriel J." w:date="2026-08-24T12:14:00Z" w:initials="GGJ">
     <w:p>
       <w:r>
         <w:rPr>
@@ -27936,7 +27964,7 @@
       </w:r>
     </w:p>
   </w:comment>
-  <w:comment w:id="20" w:author="Graham, Gabriel J." w:date="2026-07-17T17:08:00Z" w:initials="GG">
+  <w:comment w:id="21" w:author="Graham, Gabriel J." w:date="2026-07-17T17:08:00Z" w:initials="GG">
     <w:p>
       <w:pPr>
         <w:pStyle w:val="CommentText"/>
@@ -27952,7 +27980,7 @@
       </w:r>
     </w:p>
   </w:comment>
-  <w:comment w:id="21" w:author="Graham, Gabriel J." w:date="2026-08-31T11:50:00Z" w:initials="GGJ">
+  <w:comment w:id="22" w:author="Graham, Gabriel J." w:date="2026-08-31T11:50:00Z" w:initials="GGJ">
     <w:p>
       <w:r>
         <w:rPr>
@@ -27969,7 +27997,7 @@
       </w:r>
     </w:p>
   </w:comment>
-  <w:comment w:id="23" w:author="Graham, Gabriel J." w:date="2026-08-31T11:54:00Z" w:initials="GGJ">
+  <w:comment w:id="24" w:author="Graham, Gabriel J." w:date="2026-08-31T11:54:00Z" w:initials="GGJ">
     <w:p>
       <w:r>
         <w:rPr>
@@ -27986,7 +28014,7 @@
       </w:r>
     </w:p>
   </w:comment>
-  <w:comment w:id="24" w:author="Graham, Gabriel J." w:date="2026-08-31T11:57:00Z" w:initials="GGJ">
+  <w:comment w:id="25" w:author="Graham, Gabriel J." w:date="2026-08-31T11:57:00Z" w:initials="GGJ">
     <w:p>
       <w:r>
         <w:rPr>
@@ -28003,7 +28031,7 @@
       </w:r>
     </w:p>
   </w:comment>
-  <w:comment w:id="27" w:author="Rhodes, Justin S" w:date="2026-09-03T13:33:00Z" w:initials="JR">
+  <w:comment w:id="28" w:author="Rhodes, Justin S" w:date="2026-09-03T13:33:00Z" w:initials="JR">
     <w:p>
       <w:pPr>
         <w:pStyle w:val="CommentText"/>
@@ -28019,7 +28047,7 @@
       </w:r>
     </w:p>
   </w:comment>
-  <w:comment w:id="28" w:author="Graham, Gabriel J." w:date="2026-09-08T15:33:00Z" w:initials="GGJ">
+  <w:comment w:id="29" w:author="Graham, Gabriel J." w:date="2026-09-08T15:33:00Z" w:initials="GGJ">
     <w:p>
       <w:r>
         <w:rPr>
@@ -28036,7 +28064,7 @@
       </w:r>
     </w:p>
   </w:comment>
-  <w:comment w:id="29" w:author="Graham, Gabriel J." w:date="2026-09-11T16:52:00Z" w:initials="GGJ">
+  <w:comment w:id="30" w:author="Graham, Gabriel J." w:date="2026-09-11T16:52:00Z" w:initials="GGJ">
     <w:p>
       <w:r>
         <w:rPr>
@@ -28053,7 +28081,7 @@
       </w:r>
     </w:p>
   </w:comment>
-  <w:comment w:id="30" w:author="Rhodes, Justin S" w:date="2026-09-03T13:39:00Z" w:initials="JR">
+  <w:comment w:id="31" w:author="Rhodes, Justin S" w:date="2026-09-03T13:39:00Z" w:initials="JR">
     <w:p>
       <w:pPr>
         <w:pStyle w:val="CommentText"/>
@@ -28069,7 +28097,7 @@
       </w:r>
     </w:p>
   </w:comment>
-  <w:comment w:id="33" w:author="Graham, Gabriel J." w:date="2026-08-07T16:52:00Z" w:initials="GGJ">
+  <w:comment w:id="34" w:author="Graham, Gabriel J." w:date="2026-08-07T16:52:00Z" w:initials="GGJ">
     <w:p>
       <w:r>
         <w:rPr>
@@ -28086,7 +28114,7 @@
       </w:r>
     </w:p>
   </w:comment>
-  <w:comment w:id="34" w:author="Rhodes, Justin S" w:date="2026-09-07T16:48:00Z" w:initials="JR">
+  <w:comment w:id="35" w:author="Rhodes, Justin S" w:date="2026-09-07T16:48:00Z" w:initials="JR">
     <w:p>
       <w:pPr>
         <w:pStyle w:val="CommentText"/>
@@ -28102,7 +28130,7 @@
       </w:r>
     </w:p>
   </w:comment>
-  <w:comment w:id="49" w:author="Rhodes, Justin S" w:date="2026-09-07T16:55:00Z" w:initials="JR">
+  <w:comment w:id="50" w:author="Rhodes, Justin S" w:date="2026-09-07T16:55:00Z" w:initials="JR">
     <w:p>
       <w:pPr>
         <w:pStyle w:val="CommentText"/>
@@ -28118,7 +28146,7 @@
       </w:r>
     </w:p>
   </w:comment>
-  <w:comment w:id="50" w:author="Graham, Gabriel J." w:date="2026-09-09T13:17:00Z" w:initials="GGJ">
+  <w:comment w:id="51" w:author="Graham, Gabriel J." w:date="2026-09-09T13:17:00Z" w:initials="GGJ">
     <w:p>
       <w:r>
         <w:rPr>
@@ -28135,7 +28163,7 @@
       </w:r>
     </w:p>
   </w:comment>
-  <w:comment w:id="51" w:author="Rhodes, Justin S" w:date="2026-09-11T09:24:00Z" w:initials="JR">
+  <w:comment w:id="52" w:author="Rhodes, Justin S" w:date="2026-09-11T09:24:00Z" w:initials="JR">
     <w:p>
       <w:pPr>
         <w:pStyle w:val="CommentText"/>
@@ -28151,7 +28179,7 @@
       </w:r>
     </w:p>
   </w:comment>
-  <w:comment w:id="78" w:author="Graham, Gabriel J." w:date="2026-09-10T18:56:00Z" w:initials="GGJ">
+  <w:comment w:id="79" w:author="Graham, Gabriel J." w:date="2026-09-10T18:56:00Z" w:initials="GGJ">
     <w:p>
       <w:r>
         <w:rPr>
@@ -28168,7 +28196,7 @@
       </w:r>
     </w:p>
   </w:comment>
-  <w:comment w:id="79" w:author="Rhodes, Justin S" w:date="2026-09-11T09:47:00Z" w:initials="JR">
+  <w:comment w:id="80" w:author="Rhodes, Justin S" w:date="2026-09-11T09:47:00Z" w:initials="JR">
     <w:p>
       <w:pPr>
         <w:pStyle w:val="CommentText"/>
@@ -28184,7 +28212,7 @@
       </w:r>
     </w:p>
   </w:comment>
-  <w:comment w:id="75" w:author="Graham, Gabriel J." w:date="2026-09-10T19:01:00Z" w:initials="GGJ">
+  <w:comment w:id="76" w:author="Graham, Gabriel J." w:date="2026-09-10T19:01:00Z" w:initials="GGJ">
     <w:p>
       <w:r>
         <w:rPr>
@@ -28201,7 +28229,7 @@
       </w:r>
     </w:p>
   </w:comment>
-  <w:comment w:id="76" w:author="Rhodes, Justin S" w:date="2026-09-11T09:43:00Z" w:initials="JR">
+  <w:comment w:id="77" w:author="Rhodes, Justin S" w:date="2026-09-11T09:43:00Z" w:initials="JR">
     <w:p>
       <w:pPr>
         <w:pStyle w:val="CommentText"/>
@@ -28217,7 +28245,7 @@
       </w:r>
     </w:p>
   </w:comment>
-  <w:comment w:id="81" w:author="Graham, Gabriel J." w:date="2026-09-10T19:01:00Z" w:initials="GGJ">
+  <w:comment w:id="82" w:author="Graham, Gabriel J." w:date="2026-09-10T19:01:00Z" w:initials="GGJ">
     <w:p>
       <w:r>
         <w:rPr>
@@ -28234,7 +28262,7 @@
       </w:r>
     </w:p>
   </w:comment>
-  <w:comment w:id="74" w:author="Rhodes, Justin S" w:date="2026-09-11T09:39:00Z" w:initials="JR">
+  <w:comment w:id="75" w:author="Rhodes, Justin S" w:date="2026-09-11T09:39:00Z" w:initials="JR">
     <w:p>
       <w:pPr>
         <w:pStyle w:val="CommentText"/>
@@ -28253,7 +28281,7 @@
       </w:r>
     </w:p>
   </w:comment>
-  <w:comment w:id="82" w:author="Graham, Gabriel J." w:date="2026-09-11T16:59:00Z" w:initials="GGJ">
+  <w:comment w:id="83" w:author="Graham, Gabriel J." w:date="2026-09-11T16:59:00Z" w:initials="GGJ">
     <w:p>
       <w:r>
         <w:rPr>
@@ -28270,7 +28298,7 @@
       </w:r>
     </w:p>
   </w:comment>
-  <w:comment w:id="87" w:author="Graham, Gabriel J." w:date="2026-08-31T13:00:00Z" w:initials="GGJ">
+  <w:comment w:id="88" w:author="Graham, Gabriel J." w:date="2026-08-31T13:00:00Z" w:initials="GGJ">
     <w:p>
       <w:r>
         <w:rPr>
@@ -28287,7 +28315,7 @@
       </w:r>
     </w:p>
   </w:comment>
-  <w:comment w:id="88" w:author="Graham, Gabriel J." w:date="2026-08-31T12:58:00Z" w:initials="GGJ">
+  <w:comment w:id="89" w:author="Graham, Gabriel J." w:date="2026-08-31T12:58:00Z" w:initials="GGJ">
     <w:p>
       <w:r>
         <w:rPr>
@@ -28304,7 +28332,7 @@
       </w:r>
     </w:p>
   </w:comment>
-  <w:comment w:id="89" w:author="Rhodes, Justin S" w:date="2026-09-04T13:52:00Z" w:initials="JR">
+  <w:comment w:id="90" w:author="Rhodes, Justin S" w:date="2026-09-04T13:52:00Z" w:initials="JR">
     <w:p>
       <w:pPr>
         <w:pStyle w:val="CommentText"/>
@@ -28320,7 +28348,7 @@
       </w:r>
     </w:p>
   </w:comment>
-  <w:comment w:id="90" w:author="Graham, Gabriel J." w:date="2026-09-10T16:19:00Z" w:initials="GGJ">
+  <w:comment w:id="91" w:author="Graham, Gabriel J." w:date="2026-09-10T16:19:00Z" w:initials="GGJ">
     <w:p>
       <w:r>
         <w:rPr>
@@ -28337,7 +28365,7 @@
       </w:r>
     </w:p>
   </w:comment>
-  <w:comment w:id="91" w:author="Rhodes, Justin S" w:date="2026-09-11T09:48:00Z" w:initials="JR">
+  <w:comment w:id="92" w:author="Rhodes, Justin S" w:date="2026-09-11T09:48:00Z" w:initials="JR">
     <w:p>
       <w:pPr>
         <w:pStyle w:val="CommentText"/>
@@ -28353,7 +28381,7 @@
       </w:r>
     </w:p>
   </w:comment>
-  <w:comment w:id="92" w:author="Graham, Gabriel J." w:date="2026-08-31T13:07:00Z" w:initials="GGJ">
+  <w:comment w:id="93" w:author="Graham, Gabriel J." w:date="2026-08-31T13:07:00Z" w:initials="GGJ">
     <w:p>
       <w:r>
         <w:rPr>
@@ -28370,7 +28398,7 @@
       </w:r>
     </w:p>
   </w:comment>
-  <w:comment w:id="93" w:author="Graham, Gabriel J." w:date="2026-08-31T13:51:00Z" w:initials="GGJ">
+  <w:comment w:id="94" w:author="Graham, Gabriel J." w:date="2026-08-31T13:51:00Z" w:initials="GGJ">
     <w:p>
       <w:r>
         <w:rPr>
@@ -28387,7 +28415,7 @@
       </w:r>
     </w:p>
   </w:comment>
-  <w:comment w:id="94" w:author="Graham, Gabriel J." w:date="2026-08-31T13:55:00Z" w:initials="GGJ">
+  <w:comment w:id="95" w:author="Graham, Gabriel J." w:date="2026-08-31T13:55:00Z" w:initials="GGJ">
     <w:p>
       <w:r>
         <w:rPr>
@@ -28436,7 +28464,7 @@
       </w:r>
     </w:p>
   </w:comment>
-  <w:comment w:id="95" w:author="Rhodes, Justin S" w:date="2026-09-08T11:04:00Z" w:initials="JR">
+  <w:comment w:id="96" w:author="Rhodes, Justin S" w:date="2026-09-08T11:04:00Z" w:initials="JR">
     <w:p>
       <w:pPr>
         <w:pStyle w:val="CommentText"/>
@@ -28452,7 +28480,7 @@
       </w:r>
     </w:p>
   </w:comment>
-  <w:comment w:id="96" w:author="Graham, Gabriel J." w:date="2026-09-10T16:15:00Z" w:initials="GGJ">
+  <w:comment w:id="97" w:author="Graham, Gabriel J." w:date="2026-09-10T16:15:00Z" w:initials="GGJ">
     <w:p>
       <w:r>
         <w:rPr>
@@ -28469,7 +28497,7 @@
       </w:r>
     </w:p>
   </w:comment>
-  <w:comment w:id="97" w:author="Rhodes, Justin S" w:date="2026-09-11T09:49:00Z" w:initials="JR">
+  <w:comment w:id="98" w:author="Rhodes, Justin S" w:date="2026-09-11T09:49:00Z" w:initials="JR">
     <w:p>
       <w:pPr>
         <w:pStyle w:val="CommentText"/>
@@ -28485,7 +28513,7 @@
       </w:r>
     </w:p>
   </w:comment>
-  <w:comment w:id="98" w:author="Graham, Gabriel J." w:date="2026-08-31T14:20:00Z" w:initials="GGJ">
+  <w:comment w:id="99" w:author="Graham, Gabriel J." w:date="2026-08-31T14:20:00Z" w:initials="GGJ">
     <w:p>
       <w:r>
         <w:rPr>
@@ -28502,7 +28530,7 @@
       </w:r>
     </w:p>
   </w:comment>
-  <w:comment w:id="99" w:author="Rhodes, Justin S" w:date="2026-09-08T11:05:00Z" w:initials="JR">
+  <w:comment w:id="100" w:author="Rhodes, Justin S" w:date="2026-09-08T11:05:00Z" w:initials="JR">
     <w:p>
       <w:pPr>
         <w:pStyle w:val="CommentText"/>
@@ -28518,7 +28546,7 @@
       </w:r>
     </w:p>
   </w:comment>
-  <w:comment w:id="100" w:author="Graham, Gabriel J." w:date="2026-08-31T15:32:00Z" w:initials="GGJ">
+  <w:comment w:id="101" w:author="Graham, Gabriel J." w:date="2026-08-31T15:32:00Z" w:initials="GGJ">
     <w:p>
       <w:r>
         <w:rPr>
@@ -28535,7 +28563,7 @@
       </w:r>
     </w:p>
   </w:comment>
-  <w:comment w:id="101" w:author="Graham, Gabriel J." w:date="2026-08-31T15:50:00Z" w:initials="GGJ">
+  <w:comment w:id="102" w:author="Graham, Gabriel J." w:date="2026-08-31T15:50:00Z" w:initials="GGJ">
     <w:p>
       <w:r>
         <w:rPr>
@@ -28552,7 +28580,7 @@
       </w:r>
     </w:p>
   </w:comment>
-  <w:comment w:id="102" w:author="Graham, Gabriel J." w:date="2026-08-31T14:27:00Z" w:initials="GGJ">
+  <w:comment w:id="103" w:author="Graham, Gabriel J." w:date="2026-08-31T14:27:00Z" w:initials="GGJ">
     <w:p>
       <w:r>
         <w:rPr>
@@ -28569,7 +28597,7 @@
       </w:r>
     </w:p>
   </w:comment>
-  <w:comment w:id="103" w:author="Rhodes, Justin S" w:date="2026-09-08T11:07:00Z" w:initials="JR">
+  <w:comment w:id="104" w:author="Rhodes, Justin S" w:date="2026-09-08T11:07:00Z" w:initials="JR">
     <w:p>
       <w:pPr>
         <w:pStyle w:val="CommentText"/>
@@ -28585,7 +28613,7 @@
       </w:r>
     </w:p>
   </w:comment>
-  <w:comment w:id="104" w:author="Graham, Gabriel J." w:date="2026-09-08T15:47:00Z" w:initials="GGJ">
+  <w:comment w:id="105" w:author="Graham, Gabriel J." w:date="2026-09-08T15:47:00Z" w:initials="GGJ">
     <w:p>
       <w:r>
         <w:rPr>
@@ -28602,7 +28630,7 @@
       </w:r>
     </w:p>
   </w:comment>
-  <w:comment w:id="105" w:author="Graham, Gabriel J." w:date="2026-08-31T16:03:00Z" w:initials="GGJ">
+  <w:comment w:id="106" w:author="Graham, Gabriel J." w:date="2026-08-31T16:03:00Z" w:initials="GGJ">
     <w:p>
       <w:r>
         <w:rPr>
@@ -28619,7 +28647,7 @@
       </w:r>
     </w:p>
   </w:comment>
-  <w:comment w:id="106" w:author="Rhodes, Justin S" w:date="2026-09-08T13:20:00Z" w:initials="JR">
+  <w:comment w:id="107" w:author="Rhodes, Justin S" w:date="2026-09-08T13:20:00Z" w:initials="JR">
     <w:p>
       <w:pPr>
         <w:pStyle w:val="CommentText"/>
@@ -28635,7 +28663,7 @@
       </w:r>
     </w:p>
   </w:comment>
-  <w:comment w:id="107" w:author="Graham, Gabriel J." w:date="2026-08-31T14:34:00Z" w:initials="GGJ">
+  <w:comment w:id="108" w:author="Graham, Gabriel J." w:date="2026-08-31T14:34:00Z" w:initials="GGJ">
     <w:p>
       <w:r>
         <w:rPr>
@@ -28652,7 +28680,7 @@
       </w:r>
     </w:p>
   </w:comment>
-  <w:comment w:id="108" w:author="Rhodes, Justin S" w:date="2026-09-08T12:46:00Z" w:initials="JR">
+  <w:comment w:id="109" w:author="Rhodes, Justin S" w:date="2026-09-08T12:46:00Z" w:initials="JR">
     <w:p>
       <w:pPr>
         <w:pStyle w:val="CommentText"/>
@@ -28668,7 +28696,7 @@
       </w:r>
     </w:p>
   </w:comment>
-  <w:comment w:id="110" w:author="Graham, Gabriel J." w:date="2026-09-10T19:24:00Z" w:initials="GGJ">
+  <w:comment w:id="111" w:author="Graham, Gabriel J." w:date="2026-09-10T19:24:00Z" w:initials="GGJ">
     <w:p>
       <w:r>
         <w:rPr>
@@ -28685,7 +28713,7 @@
       </w:r>
     </w:p>
   </w:comment>
-  <w:comment w:id="111" w:author="Rhodes, Justin S" w:date="2026-09-11T10:20:00Z" w:initials="JR">
+  <w:comment w:id="112" w:author="Rhodes, Justin S" w:date="2026-09-11T10:20:00Z" w:initials="JR">
     <w:p>
       <w:pPr>
         <w:pStyle w:val="CommentText"/>
@@ -28701,7 +28729,7 @@
       </w:r>
     </w:p>
   </w:comment>
-  <w:comment w:id="169" w:author="Graham, Gabriel J." w:date="2026-09-11T16:55:00Z" w:initials="GGJ">
+  <w:comment w:id="170" w:author="Graham, Gabriel J." w:date="2026-09-11T16:55:00Z" w:initials="GGJ">
     <w:p>
       <w:r>
         <w:rPr>
@@ -28718,7 +28746,7 @@
       </w:r>
     </w:p>
   </w:comment>
-  <w:comment w:id="167" w:author="Graham, Gabriel J." w:date="2026-09-11T17:21:00Z" w:initials="GGJ">
+  <w:comment w:id="168" w:author="Graham, Gabriel J." w:date="2026-09-11T17:21:00Z" w:initials="GGJ">
     <w:p>
       <w:r>
         <w:rPr>
@@ -28736,7 +28764,7 @@
     </w:p>
     <w:p/>
   </w:comment>
-  <w:comment w:id="168" w:author="Graham, Gabriel J." w:date="2026-09-11T17:21:00Z" w:initials="GGJ">
+  <w:comment w:id="169" w:author="Graham, Gabriel J." w:date="2026-09-11T17:21:00Z" w:initials="GGJ">
     <w:p>
       <w:r>
         <w:rPr>
@@ -28753,7 +28781,7 @@
       </w:r>
     </w:p>
   </w:comment>
-  <w:comment w:id="180" w:author="Graham, Gabriel J." w:date="2026-09-09T15:23:00Z" w:initials="GGJ">
+  <w:comment w:id="181" w:author="Graham, Gabriel J." w:date="2026-09-09T15:23:00Z" w:initials="GGJ">
     <w:p>
       <w:r>
         <w:rPr>
@@ -28770,7 +28798,7 @@
       </w:r>
     </w:p>
   </w:comment>
-  <w:comment w:id="181" w:author="Rhodes, Justin S" w:date="2026-09-11T10:25:00Z" w:initials="JR">
+  <w:comment w:id="182" w:author="Rhodes, Justin S" w:date="2026-09-11T10:25:00Z" w:initials="JR">
     <w:p>
       <w:pPr>
         <w:pStyle w:val="CommentText"/>
@@ -28786,7 +28814,7 @@
       </w:r>
     </w:p>
   </w:comment>
-  <w:comment w:id="188" w:author="Graham, Gabriel J." w:date="2026-09-10T19:33:00Z" w:initials="GGJ">
+  <w:comment w:id="189" w:author="Graham, Gabriel J." w:date="2026-09-10T19:33:00Z" w:initials="GGJ">
     <w:p>
       <w:r>
         <w:rPr>
@@ -28803,7 +28831,7 @@
       </w:r>
     </w:p>
   </w:comment>
-  <w:comment w:id="198" w:author="Graham, Gabriel J." w:date="2026-09-02T14:09:00Z" w:initials="GGJ">
+  <w:comment w:id="199" w:author="Graham, Gabriel J." w:date="2026-09-02T14:09:00Z" w:initials="GGJ">
     <w:p>
       <w:r>
         <w:rPr>
@@ -28820,7 +28848,7 @@
       </w:r>
     </w:p>
   </w:comment>
-  <w:comment w:id="199" w:author="Rhodes, Justin S" w:date="2026-09-08T13:20:00Z" w:initials="JR">
+  <w:comment w:id="200" w:author="Rhodes, Justin S" w:date="2026-09-08T13:20:00Z" w:initials="JR">
     <w:p>
       <w:pPr>
         <w:pStyle w:val="CommentText"/>
@@ -28836,7 +28864,7 @@
       </w:r>
     </w:p>
   </w:comment>
-  <w:comment w:id="200" w:author="Graham, Gabriel J." w:date="2026-09-08T15:38:00Z" w:initials="GGJ">
+  <w:comment w:id="201" w:author="Graham, Gabriel J." w:date="2026-09-08T15:38:00Z" w:initials="GGJ">
     <w:p>
       <w:r>
         <w:rPr>
@@ -28853,7 +28881,7 @@
       </w:r>
     </w:p>
   </w:comment>
-  <w:comment w:id="206" w:author="Graham, Gabriel J." w:date="2026-09-02T15:03:00Z" w:initials="GGJ">
+  <w:comment w:id="207" w:author="Graham, Gabriel J." w:date="2026-09-02T15:03:00Z" w:initials="GGJ">
     <w:p>
       <w:r>
         <w:rPr>
@@ -28870,7 +28898,7 @@
       </w:r>
     </w:p>
   </w:comment>
-  <w:comment w:id="207" w:author="Rhodes, Justin S" w:date="2026-09-08T12:46:00Z" w:initials="JR">
+  <w:comment w:id="208" w:author="Rhodes, Justin S" w:date="2026-09-08T12:46:00Z" w:initials="JR">
     <w:p>
       <w:pPr>
         <w:pStyle w:val="CommentText"/>
@@ -28889,7 +28917,7 @@
       </w:r>
     </w:p>
   </w:comment>
-  <w:comment w:id="212" w:author="Graham, Gabriel J." w:date="2026-09-02T11:42:00Z" w:initials="GGJ">
+  <w:comment w:id="213" w:author="Graham, Gabriel J." w:date="2026-09-02T11:42:00Z" w:initials="GGJ">
     <w:p>
       <w:r>
         <w:rPr>
@@ -28906,7 +28934,7 @@
       </w:r>
     </w:p>
   </w:comment>
-  <w:comment w:id="213" w:author="Rhodes, Justin S" w:date="2026-09-08T10:11:00Z" w:initials="JR">
+  <w:comment w:id="214" w:author="Rhodes, Justin S" w:date="2026-09-08T10:11:00Z" w:initials="JR">
     <w:p>
       <w:pPr>
         <w:pStyle w:val="CommentText"/>
@@ -28925,7 +28953,7 @@
       </w:r>
     </w:p>
   </w:comment>
-  <w:comment w:id="232" w:author="Rhodes, Justin S" w:date="2026-09-08T10:30:00Z" w:initials="JR">
+  <w:comment w:id="233" w:author="Rhodes, Justin S" w:date="2026-09-08T10:30:00Z" w:initials="JR">
     <w:p>
       <w:pPr>
         <w:pStyle w:val="CommentText"/>
@@ -28941,7 +28969,7 @@
       </w:r>
     </w:p>
   </w:comment>
-  <w:comment w:id="238" w:author="Rhodes, Justin S" w:date="2026-09-11T10:33:00Z" w:initials="JR">
+  <w:comment w:id="239" w:author="Rhodes, Justin S" w:date="2026-09-11T10:33:00Z" w:initials="JR">
     <w:p>
       <w:pPr>
         <w:pStyle w:val="CommentText"/>
@@ -28957,7 +28985,7 @@
       </w:r>
     </w:p>
   </w:comment>
-  <w:comment w:id="240" w:author="Rhodes, Justin S" w:date="2026-09-08T10:25:00Z" w:initials="JR">
+  <w:comment w:id="241" w:author="Rhodes, Justin S" w:date="2026-09-08T10:25:00Z" w:initials="JR">
     <w:p>
       <w:pPr>
         <w:pStyle w:val="CommentText"/>
@@ -28973,7 +29001,7 @@
       </w:r>
     </w:p>
   </w:comment>
-  <w:comment w:id="251" w:author="Rhodes, Justin S" w:date="2026-09-03T08:17:00Z" w:initials="JR">
+  <w:comment w:id="252" w:author="Rhodes, Justin S" w:date="2026-09-03T08:17:00Z" w:initials="JR">
     <w:p>
       <w:pPr>
         <w:pStyle w:val="CommentText"/>
@@ -28992,7 +29020,7 @@
       </w:r>
     </w:p>
   </w:comment>
-  <w:comment w:id="252" w:author="Graham, Gabriel J." w:date="2026-09-09T15:28:00Z" w:initials="GGJ">
+  <w:comment w:id="253" w:author="Graham, Gabriel J." w:date="2026-09-09T15:28:00Z" w:initials="GGJ">
     <w:p>
       <w:r>
         <w:rPr>
@@ -29009,7 +29037,7 @@
       </w:r>
     </w:p>
   </w:comment>
-  <w:comment w:id="269" w:author="Rhodes, Justin S" w:date="2026-09-03T08:20:00Z" w:initials="JR">
+  <w:comment w:id="270" w:author="Rhodes, Justin S" w:date="2026-09-03T08:20:00Z" w:initials="JR">
     <w:p>
       <w:pPr>
         <w:pStyle w:val="CommentText"/>
@@ -29025,7 +29053,7 @@
       </w:r>
     </w:p>
   </w:comment>
-  <w:comment w:id="256" w:author="Rhodes, Justin S" w:date="2026-09-11T10:45:00Z" w:initials="JR">
+  <w:comment w:id="257" w:author="Rhodes, Justin S" w:date="2026-09-11T10:45:00Z" w:initials="JR">
     <w:p>
       <w:pPr>
         <w:pStyle w:val="CommentText"/>
@@ -29044,7 +29072,7 @@
       </w:r>
     </w:p>
   </w:comment>
-  <w:comment w:id="270" w:author="Rhodes, Justin S" w:date="2026-09-11T10:41:00Z" w:initials="JR">
+  <w:comment w:id="271" w:author="Rhodes, Justin S" w:date="2026-09-11T10:41:00Z" w:initials="JR">
     <w:p>
       <w:pPr>
         <w:pStyle w:val="CommentText"/>
@@ -29060,7 +29088,7 @@
       </w:r>
     </w:p>
   </w:comment>
-  <w:comment w:id="271" w:author="Rhodes, Justin S" w:date="2026-09-11T10:43:00Z" w:initials="JR">
+  <w:comment w:id="272" w:author="Rhodes, Justin S" w:date="2026-09-11T10:43:00Z" w:initials="JR">
     <w:p>
       <w:pPr>
         <w:pStyle w:val="CommentText"/>
@@ -29076,7 +29104,7 @@
       </w:r>
     </w:p>
   </w:comment>
-  <w:comment w:id="276" w:author="Rhodes, Justin S" w:date="2026-09-11T10:44:00Z" w:initials="JR">
+  <w:comment w:id="277" w:author="Rhodes, Justin S" w:date="2026-09-11T10:44:00Z" w:initials="JR">
     <w:p>
       <w:pPr>
         <w:pStyle w:val="CommentText"/>
@@ -29092,7 +29120,7 @@
       </w:r>
     </w:p>
   </w:comment>
-  <w:comment w:id="278" w:author="Graham, Gabriel J." w:date="2026-09-02T13:54:00Z" w:initials="GGJ">
+  <w:comment w:id="279" w:author="Graham, Gabriel J." w:date="2026-09-02T13:54:00Z" w:initials="GGJ">
     <w:p>
       <w:r>
         <w:rPr>
@@ -29109,7 +29137,7 @@
       </w:r>
     </w:p>
   </w:comment>
-  <w:comment w:id="279" w:author="Rhodes, Justin S" w:date="2026-09-03T08:23:00Z" w:initials="JR">
+  <w:comment w:id="280" w:author="Rhodes, Justin S" w:date="2026-09-03T08:23:00Z" w:initials="JR">
     <w:p>
       <w:pPr>
         <w:pStyle w:val="CommentText"/>
@@ -29125,7 +29153,7 @@
       </w:r>
     </w:p>
   </w:comment>
-  <w:comment w:id="281" w:author="Graham, Gabriel J." w:date="2026-08-10T12:31:00Z" w:initials="GGJ">
+  <w:comment w:id="282" w:author="Graham, Gabriel J." w:date="2026-08-10T12:31:00Z" w:initials="GGJ">
     <w:p>
       <w:r>
         <w:rPr>
@@ -29142,7 +29170,7 @@
       </w:r>
     </w:p>
   </w:comment>
-  <w:comment w:id="282" w:author="Graham, Gabriel J." w:date="2026-07-19T17:57:00Z" w:initials="GG">
+  <w:comment w:id="283" w:author="Graham, Gabriel J." w:date="2026-07-19T17:57:00Z" w:initials="GG">
     <w:p>
       <w:pPr>
         <w:pStyle w:val="CommentText"/>
@@ -29158,7 +29186,7 @@
       </w:r>
     </w:p>
   </w:comment>
-  <w:comment w:id="283" w:author="Graham, Gabriel J." w:date="2026-08-10T13:04:00Z" w:initials="GGJ">
+  <w:comment w:id="284" w:author="Graham, Gabriel J." w:date="2026-08-10T13:04:00Z" w:initials="GGJ">
     <w:p>
       <w:r>
         <w:rPr>
@@ -29175,7 +29203,7 @@
       </w:r>
     </w:p>
   </w:comment>
-  <w:comment w:id="284" w:author="Graham, Gabriel J." w:date="2026-08-10T13:05:00Z" w:initials="GGJ">
+  <w:comment w:id="285" w:author="Graham, Gabriel J." w:date="2026-08-10T13:05:00Z" w:initials="GGJ">
     <w:p>
       <w:r>
         <w:rPr>
@@ -29192,7 +29220,7 @@
       </w:r>
     </w:p>
   </w:comment>
-  <w:comment w:id="285" w:author="Graham, Gabriel J." w:date="2026-08-10T13:14:00Z" w:initials="GGJ">
+  <w:comment w:id="286" w:author="Graham, Gabriel J." w:date="2026-08-10T13:14:00Z" w:initials="GGJ">
     <w:p>
       <w:r>
         <w:rPr>
@@ -29209,7 +29237,7 @@
       </w:r>
     </w:p>
   </w:comment>
-  <w:comment w:id="286" w:author="Graham, Gabriel J." w:date="2026-09-02T16:12:00Z" w:initials="GGJ">
+  <w:comment w:id="287" w:author="Graham, Gabriel J." w:date="2026-09-02T16:12:00Z" w:initials="GGJ">
     <w:p>
       <w:r>
         <w:rPr>
@@ -29226,7 +29254,7 @@
       </w:r>
     </w:p>
   </w:comment>
-  <w:comment w:id="287" w:author="Graham, Gabriel J." w:date="2026-08-24T11:28:00Z" w:initials="GGJ">
+  <w:comment w:id="288" w:author="Graham, Gabriel J." w:date="2026-08-24T11:28:00Z" w:initials="GGJ">
     <w:p>
       <w:r>
         <w:rPr>
@@ -29248,6 +29276,7 @@
 
 <file path=word/commentsExtended.xml><?xml version="1.0" encoding="utf-8"?>
 <w15:commentsEx xmlns:wpc="http://schemas.microsoft.com/office/word/2010/wordprocessingCanvas" xmlns:cx="http://schemas.microsoft.com/office/drawing/2014/chartex" xmlns:cx1="http://schemas.microsoft.com/office/drawing/2015/9/8/chartex" xmlns:cx2="http://schemas.microsoft.com/office/drawing/2015/10/21/chartex" xmlns:cx3="http://schemas.microsoft.com/office/drawing/2016/5/9/chartex" xmlns:cx4="http://schemas.microsoft.com/office/drawing/2016/5/10/chartex" xmlns:cx5="http://schemas.microsoft.com/office/drawing/2016/5/11/chartex" xmlns:cx6="http://schemas.microsoft.com/office/drawing/2016/5/12/chartex" xmlns:cx7="http://schemas.microsoft.com/office/drawing/2016/5/13/chartex" xmlns:cx8="http://schemas.microsoft.com/office/drawing/2016/5/14/chartex" xmlns:mc="http://schemas.openxmlformats.org/markup-compatibility/2006" xmlns:m="http://schemas.openxmlformats.org/officeDocument/2006/math" xmlns:aink="http://schemas.microsoft.com/office/drawing/2016/ink" xmlns:am3d="http://schemas.microsoft.com/office/drawing/2017/model3d" xmlns:oel="http://schemas.microsoft.com/office/2019/extlst" xmlns:r="http://schemas.openxmlformats.org/officeDocument/2006/relationships" xmlns:wp14="http://schemas.microsoft.com/office/word/2010/wordprocessingDrawing" xmlns:wp="http://schemas.openxmlformats.org/drawingml/2006/wordprocessingDrawing" xmlns:wpg="http://schemas.microsoft.com/office/word/2010/wordprocessingGroup" xmlns:wpi="http://schemas.microsoft.com/office/word/2010/wordprocessingInk" xmlns:wps="http://schemas.microsoft.com/office/word/2010/wordprocessingShape" xmlns:o="urn:schemas-microsoft-com:office:office" xmlns:v="urn:schemas-microsoft-com:vml" xmlns:w10="urn:schemas-microsoft-com:office:word" xmlns:w="http://schemas.openxmlformats.org/wordprocessingml/2006/main" xmlns:w14="http://schemas.microsoft.com/office/word/2010/wordml" xmlns:w15="http://schemas.microsoft.com/office/word/2012/wordml" xmlns:w16cei="http://schemas.microsoft.com/office/word/2026/wordml/cei" xmlns:w16cex="http://schemas.microsoft.com/office/word/2018/wordml/cex" xmlns:w16cid="http://schemas.microsoft.com/office/word/2016/wordml/cid" xmlns:w16="http://schemas.microsoft.com/office/word/2018/wordml" xmlns:w16sdtdh="http://schemas.microsoft.com/office/word/2020/wordml/sdtdatahash" xmlns:w16sdtfl="http://schemas.microsoft.com/office/word/2024/wordml/sdtformatlock" xmlns:w16se="http://schemas.microsoft.com/office/word/2015/wordml/symex" xmlns:w16du="http://schemas.microsoft.com/office/word/2023/wordml/word16du" xmlns:wne="http://schemas.microsoft.com/office/word/2006/wordml" mc:Ignorable="w14 w15 w16se w16cid w16 w16cex w16sdtdh w16sdtfl w16du wp14">
+  <w15:commentEx w15:paraId="68FB9412" w15:done="0"/>
   <w15:commentEx w15:paraId="4E5A4D0D" w15:done="0"/>
   <w15:commentEx w15:paraId="2E8A7E56" w15:done="0"/>
   <w15:commentEx w15:paraId="3C4ECC42" w15:done="1"/>
@@ -29332,6 +29361,7 @@
 
 <file path=word/commentsExtensible.xml><?xml version="1.0" encoding="utf-8"?>
 <w16cex:commentsExtensible xmlns:wpc="http://schemas.microsoft.com/office/word/2010/wordprocessingCanvas" xmlns:cx="http://schemas.microsoft.com/office/drawing/2014/chartex" xmlns:cx1="http://schemas.microsoft.com/office/drawing/2015/9/8/chartex" xmlns:cx2="http://schemas.microsoft.com/office/drawing/2015/10/21/chartex" xmlns:cx3="http://schemas.microsoft.com/office/drawing/2016/5/9/chartex" xmlns:cx4="http://schemas.microsoft.com/office/drawing/2016/5/10/chartex" xmlns:cx5="http://schemas.microsoft.com/office/drawing/2016/5/11/chartex" xmlns:cx6="http://schemas.microsoft.com/office/drawing/2016/5/12/chartex" xmlns:cx7="http://schemas.microsoft.com/office/drawing/2016/5/13/chartex" xmlns:cx8="http://schemas.microsoft.com/office/drawing/2016/5/14/chartex" xmlns:cr="http://schemas.microsoft.com/office/comments/2020/reactions" xmlns:mc="http://schemas.openxmlformats.org/markup-compatibility/2006" xmlns:m="http://schemas.openxmlformats.org/officeDocument/2006/math" xmlns:aink="http://schemas.microsoft.com/office/drawing/2016/ink" xmlns:am3d="http://schemas.microsoft.com/office/drawing/2017/model3d" xmlns:oel="http://schemas.microsoft.com/office/2019/extlst" xmlns:r="http://schemas.openxmlformats.org/officeDocument/2006/relationships" xmlns:wp14="http://schemas.microsoft.com/office/word/2010/wordprocessingDrawing" xmlns:wp="http://schemas.openxmlformats.org/drawingml/2006/wordprocessingDrawing" xmlns:wpg="http://schemas.microsoft.com/office/word/2010/wordprocessingGroup" xmlns:wpi="http://schemas.microsoft.com/office/word/2010/wordprocessingInk" xmlns:wps="http://schemas.microsoft.com/office/word/2010/wordprocessingShape" xmlns:o="urn:schemas-microsoft-com:office:office" xmlns:v="urn:schemas-microsoft-com:vml" xmlns:w10="urn:schemas-microsoft-com:office:word" xmlns:w="http://schemas.openxmlformats.org/wordprocessingml/2006/main" xmlns:w14="http://schemas.microsoft.com/office/word/2010/wordml" xmlns:w15="http://schemas.microsoft.com/office/word/2012/wordml" xmlns:w16cei="http://schemas.microsoft.com/office/word/2026/wordml/cei" xmlns:w16cex="http://schemas.microsoft.com/office/word/2018/wordml/cex" xmlns:w16cid="http://schemas.microsoft.com/office/word/2016/wordml/cid" xmlns:w16="http://schemas.microsoft.com/office/word/2018/wordml" xmlns:w16sdtdh="http://schemas.microsoft.com/office/word/2020/wordml/sdtdatahash" xmlns:w16sdtfl="http://schemas.microsoft.com/office/word/2024/wordml/sdtformatlock" xmlns:w16se="http://schemas.microsoft.com/office/word/2015/wordml/symex" xmlns:w16du="http://schemas.microsoft.com/office/word/2023/wordml/word16du" xmlns:wne="http://schemas.microsoft.com/office/word/2006/wordml" mc:Ignorable="w14 w15 w16se w16cid w16 w16cex w16sdtdh w16sdtfl cr w16du wp14">
+  <w16cex:commentExtensible w16cex:durableId="090D874C" w16cex:dateUtc="2026-09-11T21:36:00Z"/>
   <w16cex:commentExtensible w16cex:durableId="2FB7954E" w16cex:dateUtc="2026-09-11T20:50:00Z"/>
   <w16cex:commentExtensible w16cex:durableId="197370CA" w16cex:dateUtc="2026-09-11T14:10:00Z"/>
   <w16cex:commentExtensible w16cex:durableId="433C772E" w16cex:dateUtc="2026-08-24T16:14:00Z"/>
@@ -29416,6 +29446,7 @@
 
 <file path=word/commentsIds.xml><?xml version="1.0" encoding="utf-8"?>
 <w16cid:commentsIds xmlns:wpc="http://schemas.microsoft.com/office/word/2010/wordprocessingCanvas" xmlns:cx="http://schemas.microsoft.com/office/drawing/2014/chartex" xmlns:cx1="http://schemas.microsoft.com/office/drawing/2015/9/8/chartex" xmlns:cx2="http://schemas.microsoft.com/office/drawing/2015/10/21/chartex" xmlns:cx3="http://schemas.microsoft.com/office/drawing/2016/5/9/chartex" xmlns:cx4="http://schemas.microsoft.com/office/drawing/2016/5/10/chartex" xmlns:cx5="http://schemas.microsoft.com/office/drawing/2016/5/11/chartex" xmlns:cx6="http://schemas.microsoft.com/office/drawing/2016/5/12/chartex" xmlns:cx7="http://schemas.microsoft.com/office/drawing/2016/5/13/chartex" xmlns:cx8="http://schemas.microsoft.com/office/drawing/2016/5/14/chartex" xmlns:mc="http://schemas.openxmlformats.org/markup-compatibility/2006" xmlns:m="http://schemas.openxmlformats.org/officeDocument/2006/math" xmlns:aink="http://schemas.microsoft.com/office/drawing/2016/ink" xmlns:am3d="http://schemas.microsoft.com/office/drawing/2017/model3d" xmlns:oel="http://schemas.microsoft.com/office/2019/extlst" xmlns:r="http://schemas.openxmlformats.org/officeDocument/2006/relationships" xmlns:wp14="http://schemas.microsoft.com/office/word/2010/wordprocessingDrawing" xmlns:wp="http://schemas.openxmlformats.org/drawingml/2006/wordprocessingDrawing" xmlns:wpg="http://schemas.microsoft.com/office/word/2010/wordprocessingGroup" xmlns:wpi="http://schemas.microsoft.com/office/word/2010/wordprocessingInk" xmlns:wps="http://schemas.microsoft.com/office/word/2010/wordprocessingShape" xmlns:o="urn:schemas-microsoft-com:office:office" xmlns:v="urn:schemas-microsoft-com:vml" xmlns:w10="urn:schemas-microsoft-com:office:word" xmlns:w="http://schemas.openxmlformats.org/wordprocessingml/2006/main" xmlns:w14="http://schemas.microsoft.com/office/word/2010/wordml" xmlns:w15="http://schemas.microsoft.com/office/word/2012/wordml" xmlns:w16cei="http://schemas.microsoft.com/office/word/2026/wordml/cei" xmlns:w16cex="http://schemas.microsoft.com/office/word/2018/wordml/cex" xmlns:w16cid="http://schemas.microsoft.com/office/word/2016/wordml/cid" xmlns:w16="http://schemas.microsoft.com/office/word/2018/wordml" xmlns:w16sdtdh="http://schemas.microsoft.com/office/word/2020/wordml/sdtdatahash" xmlns:w16sdtfl="http://schemas.microsoft.com/office/word/2024/wordml/sdtformatlock" xmlns:w16se="http://schemas.microsoft.com/office/word/2015/wordml/symex" xmlns:w16du="http://schemas.microsoft.com/office/word/2023/wordml/word16du" xmlns:wne="http://schemas.microsoft.com/office/word/2006/wordml" mc:Ignorable="w14 w15 w16se w16cid w16 w16cex w16sdtdh w16sdtfl w16du wp14">
+  <w16cid:commentId w16cid:paraId="68FB9412" w16cid:durableId="090D874C"/>
   <w16cid:commentId w16cid:paraId="4E5A4D0D" w16cid:durableId="2FB7954E"/>
   <w16cid:commentId w16cid:paraId="2E8A7E56" w16cid:durableId="197370CA"/>
   <w16cid:commentId w16cid:paraId="3C4ECC42" w16cid:durableId="433C772E"/>

</xml_diff>